<commit_message>
feat: enhance incident report template layout and improve parser regex for case insensitivity
</commit_message>
<xml_diff>
--- a/templates/fiche_template.docx
+++ b/templates/fiche_template.docx
@@ -85,6 +85,17 @@
                               </w:rPr>
                               <w:t xml:space="preserve">Fiche de RELEVE DES INCIDENTS SUR LE MOBILE</w:t>
                             </w:r>
+                            <w:r>
+                              <w:rPr>
+                                <w:rFonts w:ascii="Agency FB" w:hAnsi="Agency FB" w:eastAsia="Times New Roman"/>
+                                <w:b/>
+                                <w:bCs/>
+                                <w:caps/>
+                                <w:sz w:val="32"/>
+                                <w:szCs w:val="32"/>
+                                <w:lang w:eastAsia="fr-FR"/>
+                              </w:rPr>
+                            </w:r>
                           </w:p>
                         </w:txbxContent>
                       </wps:txbx>
@@ -130,6 +141,17 @@
                         </w:rPr>
                         <w:t xml:space="preserve">Fiche de RELEVE DES INCIDENTS SUR LE MOBILE</w:t>
                       </w:r>
+                      <w:r>
+                        <w:rPr>
+                          <w:rFonts w:ascii="Agency FB" w:hAnsi="Agency FB" w:eastAsia="Times New Roman"/>
+                          <w:b/>
+                          <w:bCs/>
+                          <w:caps/>
+                          <w:sz w:val="32"/>
+                          <w:szCs w:val="32"/>
+                          <w:lang w:eastAsia="fr-FR"/>
+                        </w:rPr>
+                      </w:r>
                     </w:p>
                   </w:txbxContent>
                 </v:textbox>
@@ -148,20 +170,22 @@
         <w:rPr/>
       </w:pPr>
       <w:r/>
-    </w:p>
-    <w:p>
-      <w:pPr>
-        <w:pBdr/>
-        <w:spacing w:after="160" w:line="259" w:lineRule="auto"/>
-        <w:ind/>
-        <w:rPr/>
-      </w:pPr>
       <w:r/>
     </w:p>
     <w:p>
       <w:pPr>
         <w:pBdr/>
-        <w:spacing w:after="160" w:line="259" w:lineRule="auto"/>
+        <w:spacing w:after="160" w:line="360" w:lineRule="auto"/>
+        <w:ind/>
+        <w:rPr/>
+      </w:pPr>
+      <w:r/>
+      <w:r/>
+    </w:p>
+    <w:p>
+      <w:pPr>
+        <w:pBdr/>
+        <w:spacing w:after="160" w:line="360" w:lineRule="auto"/>
         <w:ind/>
         <w:rPr>
           <w:rFonts w:ascii="Agency FB" w:hAnsi="Agency FB"/>
@@ -189,7 +213,13 @@
           <w:b/>
           <w:shd w:val="clear" w:color="auto" w:fill="00b0f0"/>
         </w:rPr>
-        <w:t>{{ETABLISSEMENT}}</w:t>
+        <w:t xml:space="preserve">{{ETABLISSEMENT}}</w:t>
+      </w:r>
+      <w:r>
+        <w:rPr>
+          <w:rFonts w:ascii="Agency FB" w:hAnsi="Agency FB"/>
+          <w:b/>
+        </w:rPr>
       </w:r>
       <w:r>
         <w:rPr>
@@ -201,7 +231,7 @@
     <w:p>
       <w:pPr>
         <w:pBdr/>
-        <w:spacing w:after="0" w:line="240" w:lineRule="auto"/>
+        <w:spacing w:after="0" w:line="360" w:lineRule="auto"/>
         <w:ind/>
         <w:rPr>
           <w:rFonts w:ascii="Agency FB" w:hAnsi="Agency FB"/>
@@ -235,9 +265,18 @@
           <w:b/>
           <w:sz w:val="24"/>
           <w:szCs w:val="24"/>
-          <w:shd w:val="clear" w:color="auto" w:fill="00b0f0"/>
+          <w:shd w:val="clear" w:color="00b0f0" w:fill="00b0f0"/>
         </w:rPr>
-        <w:t>{{SITE}}</w:t>
+        <w:t xml:space="preserve">{{LOCALISATION}}</w:t>
+      </w:r>
+      <w:r>
+        <w:rPr>
+          <w:rFonts w:ascii="Agency FB" w:hAnsi="Agency FB"/>
+          <w:b/>
+          <w:sz w:val="24"/>
+          <w:szCs w:val="24"/>
+          <w:shd w:val="clear" w:color="00b0f0" w:fill="00b0f0"/>
+        </w:rPr>
       </w:r>
       <w:r>
         <w:rPr>
@@ -251,7 +290,7 @@
     <w:p>
       <w:pPr>
         <w:pBdr/>
-        <w:spacing w:after="0" w:line="240" w:lineRule="auto"/>
+        <w:spacing w:after="0" w:line="360" w:lineRule="auto"/>
         <w:ind/>
         <w:rPr>
           <w:rFonts w:ascii="Agency FB" w:hAnsi="Agency FB"/>
@@ -286,7 +325,14 @@
           <w:szCs w:val="24"/>
           <w:shd w:val="clear" w:color="auto" w:fill="00b0f0"/>
         </w:rPr>
-        <w:t>{{DATE_INCIDENT}}</w:t>
+        <w:t xml:space="preserve">{{DATE_INCIDENT}}</w:t>
+      </w:r>
+      <w:r>
+        <w:rPr>
+          <w:rFonts w:ascii="Agency FB" w:hAnsi="Agency FB"/>
+          <w:sz w:val="24"/>
+          <w:szCs w:val="24"/>
+        </w:rPr>
       </w:r>
       <w:r>
         <w:rPr>
@@ -299,7 +345,7 @@
     <w:p>
       <w:pPr>
         <w:pBdr/>
-        <w:spacing w:after="0" w:line="240" w:lineRule="auto"/>
+        <w:spacing w:after="0" w:line="360" w:lineRule="auto"/>
         <w:ind/>
         <w:rPr>
           <w:rFonts w:ascii="Agency FB" w:hAnsi="Agency FB"/>
@@ -335,7 +381,15 @@
           <w:szCs w:val="24"/>
           <w:shd w:val="clear" w:color="auto" w:fill="00b0f0"/>
         </w:rPr>
-        <w:t>{{DATE_INFORMATION}}</w:t>
+        <w:t xml:space="preserve">{{DATE_INFORMATION}}</w:t>
+      </w:r>
+      <w:r>
+        <w:rPr>
+          <w:rFonts w:ascii="Agency FB" w:hAnsi="Agency FB"/>
+          <w:b/>
+          <w:sz w:val="24"/>
+          <w:szCs w:val="24"/>
+        </w:rPr>
       </w:r>
       <w:r>
         <w:rPr>
@@ -349,7 +403,7 @@
     <w:p>
       <w:pPr>
         <w:pBdr/>
-        <w:spacing w:after="0" w:line="240" w:lineRule="auto"/>
+        <w:spacing w:after="0" w:line="360" w:lineRule="auto"/>
         <w:ind/>
         <w:rPr>
           <w:rFonts w:ascii="Agency FB" w:hAnsi="Agency FB"/>
@@ -377,19 +431,6 @@
         </w:rPr>
         <w:t xml:space="preserve"> :{{DATE_DEPART_TERRAIN}}</w:t>
       </w:r>
-    </w:p>
-    <w:p>
-      <w:pPr>
-        <w:pBdr/>
-        <w:spacing w:after="0" w:line="240" w:lineRule="auto"/>
-        <w:ind/>
-        <w:rPr>
-          <w:rFonts w:ascii="Agency FB" w:hAnsi="Agency FB"/>
-          <w:b/>
-          <w:sz w:val="24"/>
-          <w:szCs w:val="24"/>
-        </w:rPr>
-      </w:pPr>
       <w:r>
         <w:rPr>
           <w:rFonts w:ascii="Agency FB" w:hAnsi="Agency FB"/>
@@ -397,86 +438,27 @@
           <w:sz w:val="24"/>
           <w:szCs w:val="24"/>
         </w:rPr>
-        <mc:AlternateContent>
-          <mc:Choice Requires="wpg">
-            <w:drawing>
-              <wp:anchor xmlns:wp="http://schemas.openxmlformats.org/drawingml/2006/wordprocessingDrawing" xmlns:wp14="http://schemas.microsoft.com/office/word/2010/wordprocessingDrawing" distT="0" distB="0" distL="114300" distR="114300" simplePos="0" relativeHeight="251663360" behindDoc="1" locked="0" layoutInCell="1" allowOverlap="1">
-                <wp:simplePos x="0" y="0"/>
-                <wp:positionH relativeFrom="column">
-                  <wp:posOffset>2419985</wp:posOffset>
-                </wp:positionH>
-                <wp:positionV relativeFrom="paragraph">
-                  <wp:posOffset>26670</wp:posOffset>
-                </wp:positionV>
-                <wp:extent cx="1074420" cy="165735"/>
-                <wp:effectExtent l="0" t="0" r="11430" b="24765"/>
-                <wp:wrapNone/>
-                <wp:docPr id="4" name="Organigramme : Procédé 3"/>
-                <wp:cNvGraphicFramePr/>
-                <a:graphic xmlns:a="http://schemas.openxmlformats.org/drawingml/2006/main">
-                  <a:graphicData uri="http://schemas.microsoft.com/office/word/2010/wordprocessingShape">
-                    <wps:wsp>
-                      <wps:cNvPr id="0" name=""/>
-                      <wps:cNvSpPr/>
-                      <wps:spPr bwMode="auto">
-                        <a:xfrm>
-                          <a:off x="0" y="0"/>
-                          <a:ext cx="1074420" cy="165735"/>
-                        </a:xfrm>
-                        <a:prstGeom prst="flowChartProcess">
-                          <a:avLst/>
-                        </a:prstGeom>
-                        <a:solidFill>
-                          <a:srgbClr val="00B0F0"/>
-                        </a:solidFill>
-                        <a:ln>
-                          <a:solidFill>
-                            <a:srgbClr val="00B0F0"/>
-                          </a:solidFill>
-                        </a:ln>
-                      </wps:spPr>
-                      <wps:style>
-                        <a:lnRef idx="2">
-                          <a:schemeClr val="accent1">
-                            <a:shade val="15000"/>
-                          </a:schemeClr>
-                        </a:lnRef>
-                        <a:fillRef idx="1">
-                          <a:schemeClr val="accent1"/>
-                        </a:fillRef>
-                        <a:effectRef idx="0">
-                          <a:schemeClr val="accent1"/>
-                        </a:effectRef>
-                        <a:fontRef idx="minor">
-                          <a:schemeClr val="lt1"/>
-                        </a:fontRef>
-                      </wps:style>
-                      <wps:bodyPr rot="0">
-                        <a:prstTxWarp prst="textNoShape">
-                          <a:avLst/>
-                        </a:prstTxWarp>
-                        <a:noAutofit/>
-                      </wps:bodyPr>
-                    </wps:wsp>
-                  </a:graphicData>
-                </a:graphic>
-                <wp14:sizeRelH relativeFrom="margin">
-                  <wp14:pctWidth>0</wp14:pctWidth>
-                </wp14:sizeRelH>
-                <wp14:sizeRelV relativeFrom="margin">
-                  <wp14:pctHeight>0</wp14:pctHeight>
-                </wp14:sizeRelV>
-              </wp:anchor>
-            </w:drawing>
-          </mc:Choice>
-          <mc:Fallback>
-            <w:pict>
-              <v:shape id="shape 3" o:spid="_x0000_s3" o:spt="109" type="#_x0000_t109" style="position:absolute;z-index:-251663360;o:allowoverlap:true;o:allowincell:true;mso-position-horizontal-relative:text;margin-left:190.55pt;mso-position-horizontal:absolute;mso-position-vertical-relative:text;margin-top:2.10pt;mso-position-vertical:absolute;width:84.60pt;height:13.05pt;mso-wrap-distance-left:9.00pt;mso-wrap-distance-top:0.00pt;mso-wrap-distance-right:9.00pt;mso-wrap-distance-bottom:0.00pt;visibility:visible;" fillcolor="#00B0F0" strokecolor="#00B0F0" strokeweight="1.00pt">
-                <v:stroke dashstyle="solid"/>
-              </v:shape>
-            </w:pict>
-          </mc:Fallback>
-        </mc:AlternateContent>
+      </w:r>
+    </w:p>
+    <w:p>
+      <w:pPr>
+        <w:pBdr/>
+        <w:spacing w:after="0" w:line="360" w:lineRule="auto"/>
+        <w:ind/>
+        <w:rPr>
+          <w:rFonts w:ascii="Agency FB" w:hAnsi="Agency FB"/>
+          <w:b/>
+          <w:sz w:val="24"/>
+          <w:szCs w:val="24"/>
+        </w:rPr>
+      </w:pPr>
+      <w:r>
+        <w:rPr>
+          <w:rFonts w:ascii="Agency FB" w:hAnsi="Agency FB"/>
+          <w:b/>
+          <w:sz w:val="24"/>
+          <w:szCs w:val="24"/>
+        </w:rPr>
       </w:r>
       <w:r>
         <w:rPr>
@@ -495,13 +477,21 @@
           <w:sz w:val="24"/>
           <w:szCs w:val="24"/>
         </w:rPr>
-        <w:t xml:space="preserve"> : {{LOCALISATION}}</w:t>
+        <w:t xml:space="preserve"> : </w:t>
+      </w:r>
+      <w:r>
+        <w:rPr>
+          <w:rFonts w:ascii="Agency FB" w:hAnsi="Agency FB"/>
+          <w:b/>
+          <w:sz w:val="24"/>
+          <w:szCs w:val="24"/>
+        </w:rPr>
       </w:r>
     </w:p>
     <w:p>
       <w:pPr>
         <w:pBdr/>
-        <w:spacing w:after="0" w:line="240" w:lineRule="auto"/>
+        <w:spacing w:after="0" w:line="360" w:lineRule="auto"/>
         <w:ind/>
         <w:rPr>
           <w:rFonts w:ascii="Agency FB" w:hAnsi="Agency FB"/>
@@ -536,7 +526,14 @@
           <w:szCs w:val="24"/>
           <w:shd w:val="clear" w:color="auto" w:fill="00b0f0"/>
         </w:rPr>
-        <w:t>{{CAUSE}}</w:t>
+        <w:t xml:space="preserve">{{CAUSE}}</w:t>
+      </w:r>
+      <w:r>
+        <w:rPr>
+          <w:rFonts w:ascii="Agency FB" w:hAnsi="Agency FB"/>
+          <w:sz w:val="24"/>
+          <w:szCs w:val="24"/>
+        </w:rPr>
       </w:r>
       <w:r>
         <w:rPr>
@@ -549,7 +546,7 @@
     <w:p>
       <w:pPr>
         <w:pBdr/>
-        <w:spacing w:after="0" w:line="240" w:lineRule="auto"/>
+        <w:spacing w:after="0" w:line="360" w:lineRule="auto"/>
         <w:ind/>
         <w:rPr>
           <w:rFonts w:ascii="Agency FB" w:hAnsi="Agency FB"/>
@@ -584,7 +581,16 @@
           <w:szCs w:val="24"/>
           <w:shd w:val="clear" w:color="auto" w:fill="00b0f0"/>
         </w:rPr>
-        <w:t>{{CLIENTS_IMPACTES}}</w:t>
+        <w:t xml:space="preserve">{{CLIENTS_IMPACTES}}</w:t>
+      </w:r>
+      <w:r>
+        <w:rPr>
+          <w:rFonts w:ascii="Agency FB" w:hAnsi="Agency FB"/>
+          <w:b/>
+          <w:sz w:val="24"/>
+          <w:szCs w:val="24"/>
+          <w:u w:val="single"/>
+        </w:rPr>
       </w:r>
       <w:r>
         <w:rPr>
@@ -599,7 +605,7 @@
     <w:p>
       <w:pPr>
         <w:pBdr/>
-        <w:spacing w:after="0" w:line="240" w:lineRule="auto"/>
+        <w:spacing w:after="0" w:line="360" w:lineRule="auto"/>
         <w:ind/>
         <w:rPr>
           <w:rFonts w:ascii="Agency FB" w:hAnsi="Agency FB"/>
@@ -635,7 +641,15 @@
           <w:szCs w:val="24"/>
           <w:shd w:val="clear" w:color="auto" w:fill="00b0f0"/>
         </w:rPr>
-        <w:t>{{DESCRIPTION_TRAVAUX}}</w:t>
+        <w:t xml:space="preserve">{{DESCRIPTION_TRAVAUX}}</w:t>
+      </w:r>
+      <w:r>
+        <w:rPr>
+          <w:rFonts w:ascii="Agency FB" w:hAnsi="Agency FB"/>
+          <w:b/>
+          <w:sz w:val="24"/>
+          <w:szCs w:val="24"/>
+        </w:rPr>
       </w:r>
       <w:r>
         <w:rPr>
@@ -649,7 +663,7 @@
     <w:p>
       <w:pPr>
         <w:pBdr/>
-        <w:spacing w:after="0" w:line="240" w:lineRule="auto"/>
+        <w:spacing w:after="0" w:line="360" w:lineRule="auto"/>
         <w:ind/>
         <w:rPr>
           <w:rFonts w:ascii="Agency FB" w:hAnsi="Agency FB"/>
@@ -687,11 +701,20 @@
           <w:u w:val="single"/>
         </w:rPr>
       </w:r>
+      <w:r>
+        <w:rPr>
+          <w:rFonts w:ascii="Agency FB" w:hAnsi="Agency FB"/>
+          <w:b/>
+          <w:sz w:val="24"/>
+          <w:szCs w:val="24"/>
+          <w:u w:val="single"/>
+        </w:rPr>
+      </w:r>
     </w:p>
     <w:p>
       <w:pPr>
         <w:pBdr/>
-        <w:spacing w:after="0" w:line="240" w:lineRule="auto"/>
+        <w:spacing w:after="0" w:line="360" w:lineRule="auto"/>
         <w:ind/>
         <w:rPr>
           <w:rFonts w:ascii="Agency FB" w:hAnsi="Agency FB"/>
@@ -726,7 +749,14 @@
           <w:szCs w:val="24"/>
           <w:shd w:val="clear" w:color="auto" w:fill="00b0f0"/>
         </w:rPr>
-        <w:t>{{DATE_RETABLISSEMENT}}</w:t>
+        <w:t xml:space="preserve">{{DATE_RETABLISSEMENT}}</w:t>
+      </w:r>
+      <w:r>
+        <w:rPr>
+          <w:rFonts w:ascii="Agency FB" w:hAnsi="Agency FB"/>
+          <w:sz w:val="24"/>
+          <w:szCs w:val="24"/>
+        </w:rPr>
       </w:r>
       <w:r>
         <w:rPr>
@@ -739,7 +769,7 @@
     <w:p>
       <w:pPr>
         <w:pBdr/>
-        <w:spacing w:after="0" w:line="240" w:lineRule="auto"/>
+        <w:spacing w:after="0" w:line="360" w:lineRule="auto"/>
         <w:ind/>
         <w:rPr>
           <w:rFonts w:ascii="Agency FB" w:hAnsi="Agency FB"/>
@@ -773,7 +803,14 @@
           <w:szCs w:val="24"/>
           <w:shd w:val="clear" w:color="auto" w:fill="00b0f0"/>
         </w:rPr>
-        <w:t>{{DATE_FIN_INTERVENTION}}</w:t>
+        <w:t xml:space="preserve">{{DATE_FIN_INTERVENTION}}</w:t>
+      </w:r>
+      <w:r>
+        <w:rPr>
+          <w:rFonts w:ascii="Agency FB" w:hAnsi="Agency FB"/>
+          <w:sz w:val="24"/>
+          <w:szCs w:val="24"/>
+        </w:rPr>
       </w:r>
       <w:r>
         <w:rPr>
@@ -786,7 +823,7 @@
     <w:p>
       <w:pPr>
         <w:pBdr/>
-        <w:spacing w:after="0" w:line="240" w:lineRule="auto"/>
+        <w:spacing w:after="0" w:line="360" w:lineRule="auto"/>
         <w:ind/>
         <w:rPr>
           <w:rFonts w:ascii="Agency FB" w:hAnsi="Agency FB"/>
@@ -817,7 +854,7 @@
                 <wp:extent cx="970280" cy="247650"/>
                 <wp:effectExtent l="0" t="0" r="20320" b="19050"/>
                 <wp:wrapNone/>
-                <wp:docPr id="5" name="Organigramme : Procédé 2"/>
+                <wp:docPr id="4" name="Organigramme : Procédé 2"/>
                 <wp:cNvGraphicFramePr/>
                 <a:graphic xmlns:a="http://schemas.openxmlformats.org/drawingml/2006/main">
                   <a:graphicData uri="http://schemas.microsoft.com/office/word/2010/wordprocessingShape">
@@ -867,6 +904,7 @@
                               <w:rPr/>
                             </w:pPr>
                             <w:r/>
+                            <w:r/>
                           </w:p>
                         </w:txbxContent>
                       </wps:txbx>
@@ -888,7 +926,7 @@
           </mc:Choice>
           <mc:Fallback>
             <w:pict>
-              <v:shape id="shape 4" o:spid="_x0000_s4" o:spt="109" type="#_x0000_t109" style="position:absolute;z-index:-251662336;o:allowoverlap:true;o:allowincell:true;mso-position-horizontal-relative:text;margin-left:61.50pt;mso-position-horizontal:absolute;mso-position-vertical-relative:text;margin-top:30.90pt;mso-position-vertical:absolute;width:76.40pt;height:19.50pt;mso-wrap-distance-left:9.00pt;mso-wrap-distance-top:0.00pt;mso-wrap-distance-right:9.00pt;mso-wrap-distance-bottom:0.00pt;v-text-anchor:middle;visibility:visible;" fillcolor="#00B0F0" strokecolor="#00B0F0" strokeweight="1.00pt">
+              <v:shape id="shape 3" o:spid="_x0000_s3" o:spt="109" type="#_x0000_t109" style="position:absolute;z-index:-251662336;o:allowoverlap:true;o:allowincell:true;mso-position-horizontal-relative:text;margin-left:61.50pt;mso-position-horizontal:absolute;mso-position-vertical-relative:text;margin-top:30.90pt;mso-position-vertical:absolute;width:76.40pt;height:19.50pt;mso-wrap-distance-left:9.00pt;mso-wrap-distance-top:0.00pt;mso-wrap-distance-right:9.00pt;mso-wrap-distance-bottom:0.00pt;v-text-anchor:middle;visibility:visible;" fillcolor="#00B0F0" strokecolor="#00B0F0" strokeweight="1.00pt">
                 <v:stroke dashstyle="solid"/>
                 <v:textbox inset="0,0,0,0">
                   <w:txbxContent>
@@ -899,6 +937,7 @@
                         <w:ind/>
                         <w:rPr/>
                       </w:pPr>
+                      <w:r/>
                       <w:r/>
                     </w:p>
                   </w:txbxContent>
@@ -918,11 +957,21 @@
         </w:rPr>
         <w:t xml:space="preserve">Expérience utilisateur</w:t>
       </w:r>
+      <w:r>
+        <w:rPr>
+          <w:rFonts w:ascii="Agency FB" w:hAnsi="Agency FB"/>
+          <w:b/>
+          <w:sz w:val="24"/>
+          <w:szCs w:val="24"/>
+          <w:u w:val="single"/>
+        </w:rPr>
+      </w:r>
     </w:p>
     <w:p>
       <w:pPr>
         <w:pBdr/>
-        <w:spacing w:after="0" w:line="240" w:lineRule="auto"/>
+        <w:shd w:val="clear" w:color="ffffff" w:themeColor="background1" w:fill="ffffff" w:themeFill="background1"/>
+        <w:spacing w:after="0" w:line="360" w:lineRule="auto"/>
         <w:ind/>
         <w:rPr>
           <w:rFonts w:ascii="Agency FB" w:hAnsi="Agency FB"/>
@@ -948,13 +997,30 @@
           <w:sz w:val="24"/>
           <w:szCs w:val="24"/>
         </w:rPr>
-        <w:t xml:space="preserve"> : {{OBSERVATIONS}}</w:t>
+        <w:t xml:space="preserve"> : </w:t>
+      </w:r>
+      <w:r>
+        <w:rPr>
+          <w:rFonts w:ascii="Agency FB" w:hAnsi="Agency FB"/>
+          <w:b/>
+          <w:sz w:val="24"/>
+          <w:szCs w:val="24"/>
+          <w:shd w:val="clear" w:color="00b0f0" w:fill="00b0f0"/>
+        </w:rPr>
+      </w:r>
+      <w:r>
+        <w:rPr>
+          <w:rFonts w:ascii="Agency FB" w:hAnsi="Agency FB"/>
+          <w:b/>
+          <w:sz w:val="24"/>
+          <w:szCs w:val="24"/>
+        </w:rPr>
       </w:r>
     </w:p>
     <w:p>
       <w:pPr>
         <w:pBdr/>
-        <w:spacing/>
+        <w:spacing w:line="360" w:lineRule="auto"/>
         <w:ind/>
         <w:rPr>
           <w:rFonts w:ascii="Agency FB" w:hAnsi="Agency FB"/>
@@ -972,7 +1038,18 @@
           <w:szCs w:val="24"/>
           <w:u w:val="single"/>
         </w:rPr>
-        <w:t xml:space="preserve">Equipes d’Intervention</w:t>
+        <w:t xml:space="preserve">Equipes d’Inter</w:t>
+      </w:r>
+      <w:r>
+        <w:rPr>
+          <w:rFonts w:ascii="Agency FB" w:hAnsi="Agency FB"/>
+          <w:b/>
+          <w:sz w:val="24"/>
+          <w:szCs w:val="24"/>
+          <w:u w:val="single"/>
+          <w:shd w:val="clear" w:color="ffffff" w:themeColor="background1" w:fill="ffffff" w:themeFill="background1"/>
+        </w:rPr>
+        <w:t xml:space="preserve">vention</w:t>
       </w:r>
       <w:r>
         <w:rPr>
@@ -984,20 +1061,6 @@
         </w:rPr>
         <w:t xml:space="preserve"> {{EQUIPE_INTERVENTION}}</w:t>
       </w:r>
-    </w:p>
-    <w:p>
-      <w:pPr>
-        <w:pBdr/>
-        <w:spacing/>
-        <w:ind/>
-        <w:rPr>
-          <w:rFonts w:ascii="Agency FB" w:hAnsi="Agency FB"/>
-          <w:b/>
-          <w:sz w:val="24"/>
-          <w:szCs w:val="24"/>
-          <w:shd w:val="clear" w:color="auto" w:fill="00b0f0"/>
-        </w:rPr>
-      </w:pPr>
       <w:r>
         <w:rPr>
           <w:rFonts w:ascii="Agency FB" w:hAnsi="Agency FB"/>
@@ -1030,14 +1093,101 @@
           <w:shd w:val="clear" w:color="auto" w:fill="00b0f0"/>
         </w:rPr>
       </w:r>
+      <w:r>
+        <w:rPr>
+          <w:rFonts w:ascii="Agency FB" w:hAnsi="Agency FB"/>
+          <w:b/>
+          <w:sz w:val="24"/>
+          <w:szCs w:val="24"/>
+          <w:shd w:val="clear" w:color="auto" w:fill="00b0f0"/>
+        </w:rPr>
+      </w:r>
     </w:p>
     <w:p>
       <w:pPr>
         <w:pBdr/>
         <w:spacing/>
         <w:ind/>
+        <w:rPr>
+          <w:rFonts w:ascii="Agency FB" w:hAnsi="Agency FB"/>
+          <w:b/>
+          <w:sz w:val="24"/>
+          <w:szCs w:val="24"/>
+          <w:shd w:val="clear" w:color="auto" w:fill="00b0f0"/>
+        </w:rPr>
+      </w:pPr>
+      <w:r>
+        <w:rPr>
+          <w:rFonts w:ascii="Agency FB" w:hAnsi="Agency FB"/>
+          <w:b/>
+          <w:sz w:val="24"/>
+          <w:szCs w:val="24"/>
+          <w:shd w:val="clear" w:color="auto" w:fill="00b0f0"/>
+        </w:rPr>
+      </w:r>
+      <w:r>
+        <w:rPr>
+          <w:rFonts w:ascii="Agency FB" w:hAnsi="Agency FB"/>
+          <w:b/>
+          <w:sz w:val="24"/>
+          <w:szCs w:val="24"/>
+          <w:shd w:val="clear" w:color="auto" w:fill="00b0f0"/>
+        </w:rPr>
+      </w:r>
+    </w:p>
+    <w:p>
+      <w:pPr>
+        <w:pBdr/>
+        <w:spacing/>
+        <w:ind/>
         <w:jc w:val="right"/>
         <w:rPr/>
+      </w:pPr>
+      <w:r>
+        <w:rPr>
+          <w:rFonts w:ascii="Agency FB" w:hAnsi="Agency FB"/>
+          <w:b/>
+          <w:sz w:val="24"/>
+          <w:szCs w:val="24"/>
+          <w:highlight w:val="none"/>
+          <w:shd w:val="clear" w:color="auto" w:fill="00b0f0"/>
+        </w:rPr>
+      </w:r>
+      <w:r>
+        <w:rPr>
+          <w:rFonts w:ascii="Agency FB" w:hAnsi="Agency FB"/>
+          <w:b/>
+          <w:sz w:val="24"/>
+          <w:szCs w:val="24"/>
+          <w:highlight w:val="none"/>
+          <w:shd w:val="clear" w:color="auto" w:fill="00b0f0"/>
+        </w:rPr>
+      </w:r>
+      <w:r>
+        <w:rPr>
+          <w:rFonts w:ascii="Agency FB" w:hAnsi="Agency FB"/>
+          <w:b/>
+          <w:sz w:val="24"/>
+          <w:szCs w:val="24"/>
+          <w:highlight w:val="none"/>
+          <w:shd w:val="clear" w:color="auto" w:fill="00b0f0"/>
+        </w:rPr>
+      </w:r>
+    </w:p>
+    <w:p>
+      <w:pPr>
+        <w:pBdr/>
+        <w:spacing/>
+        <w:ind/>
+        <w:jc w:val="right"/>
+        <w:rPr>
+          <w:rFonts w:ascii="Agency FB" w:hAnsi="Agency FB"/>
+          <w:b/>
+          <w:bCs/>
+          <w:sz w:val="24"/>
+          <w:szCs w:val="24"/>
+          <w:highlight w:val="none"/>
+        </w:rPr>
       </w:pPr>
       <w:r>
         <w:rPr>
@@ -1059,6 +1209,7 @@
         <w:jc w:val="right"/>
         <w:rPr/>
       </w:pPr>
+      <w:r/>
       <w:r/>
     </w:p>
     <w:sectPr>
@@ -1112,7 +1263,7 @@
 <w:ftr xmlns:wpc="http://schemas.microsoft.com/office/word/2010/wordprocessingCanvas" xmlns:mc="http://schemas.openxmlformats.org/markup-compatibility/2006" xmlns:o="urn:schemas-microsoft-com:office:office" xmlns:r="http://schemas.openxmlformats.org/officeDocument/2006/relationships" xmlns:m="http://schemas.openxmlformats.org/officeDocument/2006/math" xmlns:v="urn:schemas-microsoft-com:vml" xmlns:wp14="http://schemas.microsoft.com/office/word/2010/wordprocessingDrawing" xmlns:wp="http://schemas.openxmlformats.org/drawingml/2006/wordprocessingDrawing" xmlns:w10="urn:schemas-microsoft-com:office:word" xmlns:w="http://schemas.openxmlformats.org/wordprocessingml/2006/main" xmlns:w14="http://schemas.microsoft.com/office/word/2010/wordml" xmlns:w15="http://schemas.microsoft.com/office/word/2012/wordml" xmlns:wpg="http://schemas.microsoft.com/office/word/2010/wordprocessingGroup" xmlns:wpi="http://schemas.microsoft.com/office/word/2010/wordprocessingInk" xmlns:wne="http://schemas.microsoft.com/office/word/2006/wordml" xmlns:a="http://schemas.openxmlformats.org/drawingml/2006/main" xmlns:wps="http://schemas.microsoft.com/office/word/2010/wordprocessingShape" mc:Ignorable="w14 w15 wp14">
   <w:p>
     <w:pPr>
-      <w:pStyle w:val="833"/>
+      <w:pStyle w:val="1026"/>
       <w:pBdr/>
       <w:spacing/>
       <w:ind/>
@@ -1211,10 +1362,15 @@
         <w:lang w:val="en-US"/>
       </w:rPr>
     </w:r>
+    <w:r>
+      <w:rPr>
+        <w:lang w:val="en-US"/>
+      </w:rPr>
+    </w:r>
   </w:p>
   <w:p>
     <w:pPr>
-      <w:pStyle w:val="833"/>
+      <w:pStyle w:val="1026"/>
       <w:pBdr/>
       <w:spacing/>
       <w:ind/>
@@ -1240,10 +1396,17 @@
         <w:lang w:val="en-US"/>
       </w:rPr>
     </w:r>
+    <w:r>
+      <w:rPr>
+        <w:b/>
+        <w:sz w:val="18"/>
+        <w:lang w:val="en-US"/>
+      </w:rPr>
+    </w:r>
   </w:p>
   <w:p>
     <w:pPr>
-      <w:pStyle w:val="833"/>
+      <w:pStyle w:val="1026"/>
       <w:pBdr/>
       <w:spacing/>
       <w:ind/>
@@ -1266,10 +1429,16 @@
         <w:lang w:val="en-US"/>
       </w:rPr>
     </w:r>
+    <w:r>
+      <w:rPr>
+        <w:sz w:val="18"/>
+        <w:lang w:val="en-US"/>
+      </w:rPr>
+    </w:r>
   </w:p>
   <w:p>
     <w:pPr>
-      <w:pStyle w:val="833"/>
+      <w:pStyle w:val="1026"/>
       <w:pBdr/>
       <w:spacing/>
       <w:ind/>
@@ -1289,7 +1458,7 @@
     <w:hyperlink r:id="rId1" w:tooltip="http://www.camtel.cm" w:history="1">
       <w:r>
         <w:rPr>
-          <w:rStyle w:val="832"/>
+          <w:rStyle w:val="1025"/>
           <w:sz w:val="18"/>
           <w:lang w:val="en-US"/>
         </w:rPr>
@@ -1306,14 +1475,19 @@
     <w:hyperlink r:id="rId2" w:tooltip="mailto:camtel@camnet.cm" w:history="1">
       <w:r>
         <w:rPr>
-          <w:rStyle w:val="832"/>
+          <w:rStyle w:val="1025"/>
           <w:sz w:val="18"/>
           <w:lang w:val="en-US"/>
         </w:rPr>
         <w:t xml:space="preserve">camtel@camnet.cm</w:t>
       </w:r>
     </w:hyperlink>
-    <w:r/>
+    <w:r>
+      <w:rPr>
+        <w:sz w:val="18"/>
+        <w:lang w:val="en-US"/>
+      </w:rPr>
+    </w:r>
     <w:r>
       <w:rPr>
         <w:sz w:val="18"/>
@@ -1323,7 +1497,7 @@
   </w:p>
   <w:p>
     <w:pPr>
-      <w:pStyle w:val="833"/>
+      <w:pStyle w:val="1026"/>
       <w:pBdr/>
       <w:spacing/>
       <w:ind/>
@@ -1339,6 +1513,12 @@
         <w:lang w:val="en-US"/>
       </w:rPr>
       <w:t xml:space="preserve">N° Contributable M 0998 0000 9853 S</w:t>
+    </w:r>
+    <w:r>
+      <w:rPr>
+        <w:sz w:val="18"/>
+        <w:lang w:val="en-US"/>
+      </w:rPr>
     </w:r>
     <w:r>
       <w:rPr>
@@ -1523,6 +1703,13 @@
               <w:szCs w:val="16"/>
             </w:rPr>
           </w:r>
+          <w:r>
+            <w:rPr>
+              <w:rFonts w:ascii="Arial" w:hAnsi="Arial" w:cs="Arial"/>
+              <w:sz w:val="16"/>
+              <w:szCs w:val="16"/>
+            </w:rPr>
+          </w:r>
         </w:p>
       </w:tc>
       <w:tc>
@@ -1556,6 +1743,14 @@
               <w:b/>
             </w:rPr>
             <w:t xml:space="preserve">FICHE DE RELEVE DES INCIDENTS SUR LE MOBILE</w:t>
+          </w:r>
+          <w:r>
+            <w:rPr>
+              <w:rFonts w:ascii="Arial" w:hAnsi="Arial" w:cs="Arial"/>
+              <w:b/>
+              <w:sz w:val="20"/>
+              <w:szCs w:val="20"/>
+            </w:rPr>
           </w:r>
           <w:r>
             <w:rPr>
@@ -1616,6 +1811,14 @@
               <w:szCs w:val="20"/>
             </w:rPr>
           </w:r>
+          <w:r>
+            <w:rPr>
+              <w:rFonts w:ascii="Arial" w:hAnsi="Arial" w:cs="Arial"/>
+              <w:b/>
+              <w:sz w:val="20"/>
+              <w:szCs w:val="20"/>
+            </w:rPr>
+          </w:r>
         </w:p>
         <w:p>
           <w:pPr>
@@ -1656,6 +1859,13 @@
               <w:szCs w:val="20"/>
             </w:rPr>
           </w:r>
+          <w:r>
+            <w:rPr>
+              <w:rFonts w:ascii="Arial" w:hAnsi="Arial" w:cs="Arial"/>
+              <w:sz w:val="20"/>
+              <w:szCs w:val="20"/>
+            </w:rPr>
+          </w:r>
         </w:p>
         <w:p>
           <w:pPr>
@@ -1688,6 +1898,13 @@
               <w:szCs w:val="20"/>
             </w:rPr>
             <w:t xml:space="preserve"> 10/11/2023</w:t>
+          </w:r>
+          <w:r>
+            <w:rPr>
+              <w:rFonts w:ascii="Arial" w:hAnsi="Arial" w:cs="Arial"/>
+              <w:sz w:val="20"/>
+              <w:szCs w:val="20"/>
+            </w:rPr>
           </w:r>
           <w:r>
             <w:rPr>
@@ -1824,13 +2041,20 @@
               <w:szCs w:val="20"/>
             </w:rPr>
           </w:r>
+          <w:r>
+            <w:rPr>
+              <w:rFonts w:ascii="Arial" w:hAnsi="Arial" w:cs="Arial"/>
+              <w:sz w:val="20"/>
+              <w:szCs w:val="20"/>
+            </w:rPr>
+          </w:r>
         </w:p>
       </w:tc>
     </w:tr>
   </w:tbl>
   <w:p>
     <w:pPr>
-      <w:pStyle w:val="834"/>
+      <w:pStyle w:val="1027"/>
       <w:pBdr/>
       <w:spacing/>
       <w:ind/>
@@ -1998,9 +2222,9 @@
     <w:lsdException w:name="Bibliography" w:uiPriority="37"/>
     <w:lsdException w:name="TOC Heading" w:uiPriority="39" w:qFormat="1"/>
   </w:latentStyles>
-  <w:style w:type="table" w:styleId="12">
+  <w:style w:type="table" w:styleId="839">
     <w:name w:val="Table Grid"/>
-    <w:basedOn w:val="830"/>
+    <w:basedOn w:val="1023"/>
     <w:uiPriority w:val="59"/>
     <w:pPr>
       <w:pBdr/>
@@ -2197,9 +2421,9 @@
       </w:tcPr>
     </w:tblStylePr>
   </w:style>
-  <w:style w:type="table" w:styleId="13">
+  <w:style w:type="table" w:styleId="840">
     <w:name w:val="Table Grid Light"/>
-    <w:basedOn w:val="830"/>
+    <w:basedOn w:val="1023"/>
     <w:uiPriority w:val="59"/>
     <w:pPr>
       <w:pBdr/>
@@ -2396,9 +2620,9 @@
       </w:tcPr>
     </w:tblStylePr>
   </w:style>
-  <w:style w:type="table" w:styleId="14">
+  <w:style w:type="table" w:styleId="841">
     <w:name w:val="Plain Table 1"/>
-    <w:basedOn w:val="830"/>
+    <w:basedOn w:val="1023"/>
     <w:uiPriority w:val="59"/>
     <w:pPr>
       <w:pBdr/>
@@ -2621,9 +2845,9 @@
       </w:tcPr>
     </w:tblStylePr>
   </w:style>
-  <w:style w:type="table" w:styleId="15">
+  <w:style w:type="table" w:styleId="842">
     <w:name w:val="Plain Table 2"/>
-    <w:basedOn w:val="830"/>
+    <w:basedOn w:val="1023"/>
     <w:uiPriority w:val="59"/>
     <w:pPr>
       <w:pBdr/>
@@ -2854,9 +3078,9 @@
       </w:tcPr>
     </w:tblStylePr>
   </w:style>
-  <w:style w:type="table" w:styleId="16">
+  <w:style w:type="table" w:styleId="843">
     <w:name w:val="Plain Table 3"/>
-    <w:basedOn w:val="830"/>
+    <w:basedOn w:val="1023"/>
     <w:uiPriority w:val="99"/>
     <w:pPr>
       <w:pBdr/>
@@ -3084,9 +3308,9 @@
       </w:tcPr>
     </w:tblStylePr>
   </w:style>
-  <w:style w:type="table" w:styleId="17">
+  <w:style w:type="table" w:styleId="844">
     <w:name w:val="Plain Table 4"/>
-    <w:basedOn w:val="830"/>
+    <w:basedOn w:val="1023"/>
     <w:uiPriority w:val="99"/>
     <w:pPr>
       <w:pBdr/>
@@ -3300,9 +3524,9 @@
       </w:tcPr>
     </w:tblStylePr>
   </w:style>
-  <w:style w:type="table" w:styleId="18">
+  <w:style w:type="table" w:styleId="845">
     <w:name w:val="Plain Table 5"/>
-    <w:basedOn w:val="830"/>
+    <w:basedOn w:val="1023"/>
     <w:uiPriority w:val="99"/>
     <w:pPr>
       <w:pBdr/>
@@ -3533,9 +3757,9 @@
       </w:tcPr>
     </w:tblStylePr>
   </w:style>
-  <w:style w:type="table" w:styleId="19">
+  <w:style w:type="table" w:styleId="846">
     <w:name w:val="Grid Table 1 Light"/>
-    <w:basedOn w:val="830"/>
+    <w:basedOn w:val="1023"/>
     <w:uiPriority w:val="99"/>
     <w:pPr>
       <w:pBdr/>
@@ -3756,9 +3980,9 @@
       </w:tcPr>
     </w:tblStylePr>
   </w:style>
-  <w:style w:type="table" w:styleId="20">
+  <w:style w:type="table" w:styleId="847">
     <w:name w:val="Grid Table 1 Light - Accent 1"/>
-    <w:basedOn w:val="830"/>
+    <w:basedOn w:val="1023"/>
     <w:uiPriority w:val="99"/>
     <w:pPr>
       <w:pBdr/>
@@ -3979,9 +4203,9 @@
       </w:tcPr>
     </w:tblStylePr>
   </w:style>
-  <w:style w:type="table" w:styleId="21">
+  <w:style w:type="table" w:styleId="848">
     <w:name w:val="Grid Table 1 Light - Accent 2"/>
-    <w:basedOn w:val="830"/>
+    <w:basedOn w:val="1023"/>
     <w:uiPriority w:val="99"/>
     <w:pPr>
       <w:pBdr/>
@@ -4202,9 +4426,9 @@
       </w:tcPr>
     </w:tblStylePr>
   </w:style>
-  <w:style w:type="table" w:styleId="22">
+  <w:style w:type="table" w:styleId="849">
     <w:name w:val="Grid Table 1 Light - Accent 3"/>
-    <w:basedOn w:val="830"/>
+    <w:basedOn w:val="1023"/>
     <w:uiPriority w:val="99"/>
     <w:pPr>
       <w:pBdr/>
@@ -4425,9 +4649,9 @@
       </w:tcPr>
     </w:tblStylePr>
   </w:style>
-  <w:style w:type="table" w:styleId="23">
+  <w:style w:type="table" w:styleId="850">
     <w:name w:val="Grid Table 1 Light - Accent 4"/>
-    <w:basedOn w:val="830"/>
+    <w:basedOn w:val="1023"/>
     <w:uiPriority w:val="99"/>
     <w:pPr>
       <w:pBdr/>
@@ -4648,9 +4872,9 @@
       </w:tcPr>
     </w:tblStylePr>
   </w:style>
-  <w:style w:type="table" w:styleId="24">
+  <w:style w:type="table" w:styleId="851">
     <w:name w:val="Grid Table 1 Light - Accent 5"/>
-    <w:basedOn w:val="830"/>
+    <w:basedOn w:val="1023"/>
     <w:uiPriority w:val="99"/>
     <w:pPr>
       <w:pBdr/>
@@ -4871,9 +5095,9 @@
       </w:tcPr>
     </w:tblStylePr>
   </w:style>
-  <w:style w:type="table" w:styleId="25">
+  <w:style w:type="table" w:styleId="852">
     <w:name w:val="Grid Table 1 Light - Accent 6"/>
-    <w:basedOn w:val="830"/>
+    <w:basedOn w:val="1023"/>
     <w:uiPriority w:val="99"/>
     <w:pPr>
       <w:pBdr/>
@@ -5094,9 +5318,9 @@
       </w:tcPr>
     </w:tblStylePr>
   </w:style>
-  <w:style w:type="table" w:styleId="26">
+  <w:style w:type="table" w:styleId="853">
     <w:name w:val="Grid Table 2"/>
-    <w:basedOn w:val="830"/>
+    <w:basedOn w:val="1023"/>
     <w:uiPriority w:val="99"/>
     <w:pPr>
       <w:pBdr/>
@@ -5326,9 +5550,9 @@
       </w:tcPr>
     </w:tblStylePr>
   </w:style>
-  <w:style w:type="table" w:styleId="27">
+  <w:style w:type="table" w:styleId="854">
     <w:name w:val="Grid Table 2 - Accent 1"/>
-    <w:basedOn w:val="830"/>
+    <w:basedOn w:val="1023"/>
     <w:uiPriority w:val="99"/>
     <w:pPr>
       <w:pBdr/>
@@ -5558,9 +5782,9 @@
       </w:tcPr>
     </w:tblStylePr>
   </w:style>
-  <w:style w:type="table" w:styleId="28">
+  <w:style w:type="table" w:styleId="855">
     <w:name w:val="Grid Table 2 - Accent 2"/>
-    <w:basedOn w:val="830"/>
+    <w:basedOn w:val="1023"/>
     <w:uiPriority w:val="99"/>
     <w:pPr>
       <w:pBdr/>
@@ -5790,9 +6014,9 @@
       </w:tcPr>
     </w:tblStylePr>
   </w:style>
-  <w:style w:type="table" w:styleId="29">
+  <w:style w:type="table" w:styleId="856">
     <w:name w:val="Grid Table 2 - Accent 3"/>
-    <w:basedOn w:val="830"/>
+    <w:basedOn w:val="1023"/>
     <w:uiPriority w:val="99"/>
     <w:pPr>
       <w:pBdr/>
@@ -6022,9 +6246,9 @@
       </w:tcPr>
     </w:tblStylePr>
   </w:style>
-  <w:style w:type="table" w:styleId="30">
+  <w:style w:type="table" w:styleId="857">
     <w:name w:val="Grid Table 2 - Accent 4"/>
-    <w:basedOn w:val="830"/>
+    <w:basedOn w:val="1023"/>
     <w:uiPriority w:val="99"/>
     <w:pPr>
       <w:pBdr/>
@@ -6254,9 +6478,9 @@
       </w:tcPr>
     </w:tblStylePr>
   </w:style>
-  <w:style w:type="table" w:styleId="31">
+  <w:style w:type="table" w:styleId="858">
     <w:name w:val="Grid Table 2 - Accent 5"/>
-    <w:basedOn w:val="830"/>
+    <w:basedOn w:val="1023"/>
     <w:uiPriority w:val="99"/>
     <w:pPr>
       <w:pBdr/>
@@ -6486,9 +6710,9 @@
       </w:tcPr>
     </w:tblStylePr>
   </w:style>
-  <w:style w:type="table" w:styleId="32">
+  <w:style w:type="table" w:styleId="859">
     <w:name w:val="Grid Table 2 - Accent 6"/>
-    <w:basedOn w:val="830"/>
+    <w:basedOn w:val="1023"/>
     <w:uiPriority w:val="99"/>
     <w:pPr>
       <w:pBdr/>
@@ -6718,9 +6942,9 @@
       </w:tcPr>
     </w:tblStylePr>
   </w:style>
-  <w:style w:type="table" w:styleId="33">
+  <w:style w:type="table" w:styleId="860">
     <w:name w:val="Grid Table 3"/>
-    <w:basedOn w:val="830"/>
+    <w:basedOn w:val="1023"/>
     <w:uiPriority w:val="99"/>
     <w:pPr>
       <w:pBdr/>
@@ -6819,29 +7043,6 @@
         <w:tblBorders/>
       </w:tblPr>
       <w:tcPr>
-        <w:shd w:color="ffffff"/>
-        <w:tcBorders>
-          <w:top w:val="none" w:color="000000" w:sz="4" w:space="0"/>
-          <w:left w:val="none" w:color="000000" w:sz="4" w:space="0"/>
-          <w:bottom w:val="none" w:color="000000" w:sz="4" w:space="0"/>
-          <w:right w:val="none" w:color="000000" w:sz="4" w:space="0"/>
-        </w:tcBorders>
-      </w:tcPr>
-    </w:tblStylePr>
-    <w:tblStylePr w:type="firstRow">
-      <w:rPr>
-        <w:b/>
-        <w:color w:val="404040"/>
-      </w:rPr>
-      <w:pPr>
-        <w:pBdr/>
-        <w:spacing/>
-        <w:ind/>
-      </w:pPr>
-      <w:tblPr>
-        <w:tblBorders/>
-      </w:tblPr>
-      <w:tcPr>
         <w:shd w:val="clear" w:color="ffffff"/>
         <w:tcBorders>
           <w:top w:val="none" w:color="000000" w:sz="4" w:space="0"/>
@@ -6851,30 +7052,7 @@
         </w:tcBorders>
       </w:tcPr>
     </w:tblStylePr>
-    <w:tblStylePr w:type="lastCol">
-      <w:rPr>
-        <w:i/>
-        <w:color w:val="404040"/>
-      </w:rPr>
-      <w:pPr>
-        <w:pBdr/>
-        <w:spacing/>
-        <w:ind/>
-      </w:pPr>
-      <w:tblPr>
-        <w:tblBorders/>
-      </w:tblPr>
-      <w:tcPr>
-        <w:shd w:color="ffffff"/>
-        <w:tcBorders>
-          <w:top w:val="none" w:color="000000" w:sz="4" w:space="0"/>
-          <w:left w:val="none" w:color="000000" w:sz="4" w:space="0"/>
-          <w:bottom w:val="none" w:color="000000" w:sz="4" w:space="0"/>
-          <w:right w:val="none" w:color="000000" w:sz="4" w:space="0"/>
-        </w:tcBorders>
-      </w:tcPr>
-    </w:tblStylePr>
-    <w:tblStylePr w:type="lastRow">
+    <w:tblStylePr w:type="firstRow">
       <w:rPr>
         <w:b/>
         <w:color w:val="404040"/>
@@ -6897,6 +7075,52 @@
         </w:tcBorders>
       </w:tcPr>
     </w:tblStylePr>
+    <w:tblStylePr w:type="lastCol">
+      <w:rPr>
+        <w:i/>
+        <w:color w:val="404040"/>
+      </w:rPr>
+      <w:pPr>
+        <w:pBdr/>
+        <w:spacing/>
+        <w:ind/>
+      </w:pPr>
+      <w:tblPr>
+        <w:tblBorders/>
+      </w:tblPr>
+      <w:tcPr>
+        <w:shd w:val="clear" w:color="ffffff"/>
+        <w:tcBorders>
+          <w:top w:val="none" w:color="000000" w:sz="4" w:space="0"/>
+          <w:left w:val="none" w:color="000000" w:sz="4" w:space="0"/>
+          <w:bottom w:val="none" w:color="000000" w:sz="4" w:space="0"/>
+          <w:right w:val="none" w:color="000000" w:sz="4" w:space="0"/>
+        </w:tcBorders>
+      </w:tcPr>
+    </w:tblStylePr>
+    <w:tblStylePr w:type="lastRow">
+      <w:rPr>
+        <w:b/>
+        <w:color w:val="404040"/>
+      </w:rPr>
+      <w:pPr>
+        <w:pBdr/>
+        <w:spacing/>
+        <w:ind/>
+      </w:pPr>
+      <w:tblPr>
+        <w:tblBorders/>
+      </w:tblPr>
+      <w:tcPr>
+        <w:shd w:val="clear" w:color="ffffff"/>
+        <w:tcBorders>
+          <w:top w:val="none" w:color="000000" w:sz="4" w:space="0"/>
+          <w:left w:val="none" w:color="000000" w:sz="4" w:space="0"/>
+          <w:bottom w:val="none" w:color="000000" w:sz="4" w:space="0"/>
+          <w:right w:val="none" w:color="000000" w:sz="4" w:space="0"/>
+        </w:tcBorders>
+      </w:tcPr>
+    </w:tblStylePr>
     <w:tblStylePr w:type="nwCell">
       <w:pPr>
         <w:pBdr/>
@@ -6963,9 +7187,9 @@
       </w:tcPr>
     </w:tblStylePr>
   </w:style>
-  <w:style w:type="table" w:styleId="34">
+  <w:style w:type="table" w:styleId="861">
     <w:name w:val="Grid Table 3 - Accent 1"/>
-    <w:basedOn w:val="830"/>
+    <w:basedOn w:val="1023"/>
     <w:uiPriority w:val="99"/>
     <w:pPr>
       <w:pBdr/>
@@ -7064,29 +7288,6 @@
         <w:tblBorders/>
       </w:tblPr>
       <w:tcPr>
-        <w:shd w:color="ffffff"/>
-        <w:tcBorders>
-          <w:top w:val="none" w:color="000000" w:sz="4" w:space="0"/>
-          <w:left w:val="none" w:color="000000" w:sz="4" w:space="0"/>
-          <w:bottom w:val="none" w:color="000000" w:sz="4" w:space="0"/>
-          <w:right w:val="none" w:color="000000" w:sz="4" w:space="0"/>
-        </w:tcBorders>
-      </w:tcPr>
-    </w:tblStylePr>
-    <w:tblStylePr w:type="firstRow">
-      <w:rPr>
-        <w:b/>
-        <w:color w:val="404040"/>
-      </w:rPr>
-      <w:pPr>
-        <w:pBdr/>
-        <w:spacing/>
-        <w:ind/>
-      </w:pPr>
-      <w:tblPr>
-        <w:tblBorders/>
-      </w:tblPr>
-      <w:tcPr>
         <w:shd w:val="clear" w:color="ffffff"/>
         <w:tcBorders>
           <w:top w:val="none" w:color="000000" w:sz="4" w:space="0"/>
@@ -7096,30 +7297,7 @@
         </w:tcBorders>
       </w:tcPr>
     </w:tblStylePr>
-    <w:tblStylePr w:type="lastCol">
-      <w:rPr>
-        <w:i/>
-        <w:color w:val="404040"/>
-      </w:rPr>
-      <w:pPr>
-        <w:pBdr/>
-        <w:spacing/>
-        <w:ind/>
-      </w:pPr>
-      <w:tblPr>
-        <w:tblBorders/>
-      </w:tblPr>
-      <w:tcPr>
-        <w:shd w:color="ffffff"/>
-        <w:tcBorders>
-          <w:top w:val="none" w:color="000000" w:sz="4" w:space="0"/>
-          <w:left w:val="none" w:color="000000" w:sz="4" w:space="0"/>
-          <w:bottom w:val="none" w:color="000000" w:sz="4" w:space="0"/>
-          <w:right w:val="none" w:color="000000" w:sz="4" w:space="0"/>
-        </w:tcBorders>
-      </w:tcPr>
-    </w:tblStylePr>
-    <w:tblStylePr w:type="lastRow">
+    <w:tblStylePr w:type="firstRow">
       <w:rPr>
         <w:b/>
         <w:color w:val="404040"/>
@@ -7142,6 +7320,52 @@
         </w:tcBorders>
       </w:tcPr>
     </w:tblStylePr>
+    <w:tblStylePr w:type="lastCol">
+      <w:rPr>
+        <w:i/>
+        <w:color w:val="404040"/>
+      </w:rPr>
+      <w:pPr>
+        <w:pBdr/>
+        <w:spacing/>
+        <w:ind/>
+      </w:pPr>
+      <w:tblPr>
+        <w:tblBorders/>
+      </w:tblPr>
+      <w:tcPr>
+        <w:shd w:val="clear" w:color="ffffff"/>
+        <w:tcBorders>
+          <w:top w:val="none" w:color="000000" w:sz="4" w:space="0"/>
+          <w:left w:val="none" w:color="000000" w:sz="4" w:space="0"/>
+          <w:bottom w:val="none" w:color="000000" w:sz="4" w:space="0"/>
+          <w:right w:val="none" w:color="000000" w:sz="4" w:space="0"/>
+        </w:tcBorders>
+      </w:tcPr>
+    </w:tblStylePr>
+    <w:tblStylePr w:type="lastRow">
+      <w:rPr>
+        <w:b/>
+        <w:color w:val="404040"/>
+      </w:rPr>
+      <w:pPr>
+        <w:pBdr/>
+        <w:spacing/>
+        <w:ind/>
+      </w:pPr>
+      <w:tblPr>
+        <w:tblBorders/>
+      </w:tblPr>
+      <w:tcPr>
+        <w:shd w:val="clear" w:color="ffffff"/>
+        <w:tcBorders>
+          <w:top w:val="none" w:color="000000" w:sz="4" w:space="0"/>
+          <w:left w:val="none" w:color="000000" w:sz="4" w:space="0"/>
+          <w:bottom w:val="none" w:color="000000" w:sz="4" w:space="0"/>
+          <w:right w:val="none" w:color="000000" w:sz="4" w:space="0"/>
+        </w:tcBorders>
+      </w:tcPr>
+    </w:tblStylePr>
     <w:tblStylePr w:type="nwCell">
       <w:pPr>
         <w:pBdr/>
@@ -7208,9 +7432,9 @@
       </w:tcPr>
     </w:tblStylePr>
   </w:style>
-  <w:style w:type="table" w:styleId="35">
+  <w:style w:type="table" w:styleId="862">
     <w:name w:val="Grid Table 3 - Accent 2"/>
-    <w:basedOn w:val="830"/>
+    <w:basedOn w:val="1023"/>
     <w:uiPriority w:val="99"/>
     <w:pPr>
       <w:pBdr/>
@@ -7309,29 +7533,6 @@
         <w:tblBorders/>
       </w:tblPr>
       <w:tcPr>
-        <w:shd w:color="ffffff"/>
-        <w:tcBorders>
-          <w:top w:val="none" w:color="000000" w:sz="4" w:space="0"/>
-          <w:left w:val="none" w:color="000000" w:sz="4" w:space="0"/>
-          <w:bottom w:val="none" w:color="000000" w:sz="4" w:space="0"/>
-          <w:right w:val="none" w:color="000000" w:sz="4" w:space="0"/>
-        </w:tcBorders>
-      </w:tcPr>
-    </w:tblStylePr>
-    <w:tblStylePr w:type="firstRow">
-      <w:rPr>
-        <w:b/>
-        <w:color w:val="404040"/>
-      </w:rPr>
-      <w:pPr>
-        <w:pBdr/>
-        <w:spacing/>
-        <w:ind/>
-      </w:pPr>
-      <w:tblPr>
-        <w:tblBorders/>
-      </w:tblPr>
-      <w:tcPr>
         <w:shd w:val="clear" w:color="ffffff"/>
         <w:tcBorders>
           <w:top w:val="none" w:color="000000" w:sz="4" w:space="0"/>
@@ -7341,30 +7542,7 @@
         </w:tcBorders>
       </w:tcPr>
     </w:tblStylePr>
-    <w:tblStylePr w:type="lastCol">
-      <w:rPr>
-        <w:i/>
-        <w:color w:val="404040"/>
-      </w:rPr>
-      <w:pPr>
-        <w:pBdr/>
-        <w:spacing/>
-        <w:ind/>
-      </w:pPr>
-      <w:tblPr>
-        <w:tblBorders/>
-      </w:tblPr>
-      <w:tcPr>
-        <w:shd w:color="ffffff"/>
-        <w:tcBorders>
-          <w:top w:val="none" w:color="000000" w:sz="4" w:space="0"/>
-          <w:left w:val="none" w:color="000000" w:sz="4" w:space="0"/>
-          <w:bottom w:val="none" w:color="000000" w:sz="4" w:space="0"/>
-          <w:right w:val="none" w:color="000000" w:sz="4" w:space="0"/>
-        </w:tcBorders>
-      </w:tcPr>
-    </w:tblStylePr>
-    <w:tblStylePr w:type="lastRow">
+    <w:tblStylePr w:type="firstRow">
       <w:rPr>
         <w:b/>
         <w:color w:val="404040"/>
@@ -7387,6 +7565,52 @@
         </w:tcBorders>
       </w:tcPr>
     </w:tblStylePr>
+    <w:tblStylePr w:type="lastCol">
+      <w:rPr>
+        <w:i/>
+        <w:color w:val="404040"/>
+      </w:rPr>
+      <w:pPr>
+        <w:pBdr/>
+        <w:spacing/>
+        <w:ind/>
+      </w:pPr>
+      <w:tblPr>
+        <w:tblBorders/>
+      </w:tblPr>
+      <w:tcPr>
+        <w:shd w:val="clear" w:color="ffffff"/>
+        <w:tcBorders>
+          <w:top w:val="none" w:color="000000" w:sz="4" w:space="0"/>
+          <w:left w:val="none" w:color="000000" w:sz="4" w:space="0"/>
+          <w:bottom w:val="none" w:color="000000" w:sz="4" w:space="0"/>
+          <w:right w:val="none" w:color="000000" w:sz="4" w:space="0"/>
+        </w:tcBorders>
+      </w:tcPr>
+    </w:tblStylePr>
+    <w:tblStylePr w:type="lastRow">
+      <w:rPr>
+        <w:b/>
+        <w:color w:val="404040"/>
+      </w:rPr>
+      <w:pPr>
+        <w:pBdr/>
+        <w:spacing/>
+        <w:ind/>
+      </w:pPr>
+      <w:tblPr>
+        <w:tblBorders/>
+      </w:tblPr>
+      <w:tcPr>
+        <w:shd w:val="clear" w:color="ffffff"/>
+        <w:tcBorders>
+          <w:top w:val="none" w:color="000000" w:sz="4" w:space="0"/>
+          <w:left w:val="none" w:color="000000" w:sz="4" w:space="0"/>
+          <w:bottom w:val="none" w:color="000000" w:sz="4" w:space="0"/>
+          <w:right w:val="none" w:color="000000" w:sz="4" w:space="0"/>
+        </w:tcBorders>
+      </w:tcPr>
+    </w:tblStylePr>
     <w:tblStylePr w:type="nwCell">
       <w:pPr>
         <w:pBdr/>
@@ -7453,9 +7677,9 @@
       </w:tcPr>
     </w:tblStylePr>
   </w:style>
-  <w:style w:type="table" w:styleId="36">
+  <w:style w:type="table" w:styleId="863">
     <w:name w:val="Grid Table 3 - Accent 3"/>
-    <w:basedOn w:val="830"/>
+    <w:basedOn w:val="1023"/>
     <w:uiPriority w:val="99"/>
     <w:pPr>
       <w:pBdr/>
@@ -7554,29 +7778,6 @@
         <w:tblBorders/>
       </w:tblPr>
       <w:tcPr>
-        <w:shd w:color="ffffff"/>
-        <w:tcBorders>
-          <w:top w:val="none" w:color="000000" w:sz="4" w:space="0"/>
-          <w:left w:val="none" w:color="000000" w:sz="4" w:space="0"/>
-          <w:bottom w:val="none" w:color="000000" w:sz="4" w:space="0"/>
-          <w:right w:val="none" w:color="000000" w:sz="4" w:space="0"/>
-        </w:tcBorders>
-      </w:tcPr>
-    </w:tblStylePr>
-    <w:tblStylePr w:type="firstRow">
-      <w:rPr>
-        <w:b/>
-        <w:color w:val="404040"/>
-      </w:rPr>
-      <w:pPr>
-        <w:pBdr/>
-        <w:spacing/>
-        <w:ind/>
-      </w:pPr>
-      <w:tblPr>
-        <w:tblBorders/>
-      </w:tblPr>
-      <w:tcPr>
         <w:shd w:val="clear" w:color="ffffff"/>
         <w:tcBorders>
           <w:top w:val="none" w:color="000000" w:sz="4" w:space="0"/>
@@ -7586,30 +7787,7 @@
         </w:tcBorders>
       </w:tcPr>
     </w:tblStylePr>
-    <w:tblStylePr w:type="lastCol">
-      <w:rPr>
-        <w:i/>
-        <w:color w:val="404040"/>
-      </w:rPr>
-      <w:pPr>
-        <w:pBdr/>
-        <w:spacing/>
-        <w:ind/>
-      </w:pPr>
-      <w:tblPr>
-        <w:tblBorders/>
-      </w:tblPr>
-      <w:tcPr>
-        <w:shd w:color="ffffff"/>
-        <w:tcBorders>
-          <w:top w:val="none" w:color="000000" w:sz="4" w:space="0"/>
-          <w:left w:val="none" w:color="000000" w:sz="4" w:space="0"/>
-          <w:bottom w:val="none" w:color="000000" w:sz="4" w:space="0"/>
-          <w:right w:val="none" w:color="000000" w:sz="4" w:space="0"/>
-        </w:tcBorders>
-      </w:tcPr>
-    </w:tblStylePr>
-    <w:tblStylePr w:type="lastRow">
+    <w:tblStylePr w:type="firstRow">
       <w:rPr>
         <w:b/>
         <w:color w:val="404040"/>
@@ -7632,6 +7810,52 @@
         </w:tcBorders>
       </w:tcPr>
     </w:tblStylePr>
+    <w:tblStylePr w:type="lastCol">
+      <w:rPr>
+        <w:i/>
+        <w:color w:val="404040"/>
+      </w:rPr>
+      <w:pPr>
+        <w:pBdr/>
+        <w:spacing/>
+        <w:ind/>
+      </w:pPr>
+      <w:tblPr>
+        <w:tblBorders/>
+      </w:tblPr>
+      <w:tcPr>
+        <w:shd w:val="clear" w:color="ffffff"/>
+        <w:tcBorders>
+          <w:top w:val="none" w:color="000000" w:sz="4" w:space="0"/>
+          <w:left w:val="none" w:color="000000" w:sz="4" w:space="0"/>
+          <w:bottom w:val="none" w:color="000000" w:sz="4" w:space="0"/>
+          <w:right w:val="none" w:color="000000" w:sz="4" w:space="0"/>
+        </w:tcBorders>
+      </w:tcPr>
+    </w:tblStylePr>
+    <w:tblStylePr w:type="lastRow">
+      <w:rPr>
+        <w:b/>
+        <w:color w:val="404040"/>
+      </w:rPr>
+      <w:pPr>
+        <w:pBdr/>
+        <w:spacing/>
+        <w:ind/>
+      </w:pPr>
+      <w:tblPr>
+        <w:tblBorders/>
+      </w:tblPr>
+      <w:tcPr>
+        <w:shd w:val="clear" w:color="ffffff"/>
+        <w:tcBorders>
+          <w:top w:val="none" w:color="000000" w:sz="4" w:space="0"/>
+          <w:left w:val="none" w:color="000000" w:sz="4" w:space="0"/>
+          <w:bottom w:val="none" w:color="000000" w:sz="4" w:space="0"/>
+          <w:right w:val="none" w:color="000000" w:sz="4" w:space="0"/>
+        </w:tcBorders>
+      </w:tcPr>
+    </w:tblStylePr>
     <w:tblStylePr w:type="nwCell">
       <w:pPr>
         <w:pBdr/>
@@ -7698,9 +7922,9 @@
       </w:tcPr>
     </w:tblStylePr>
   </w:style>
-  <w:style w:type="table" w:styleId="37">
+  <w:style w:type="table" w:styleId="864">
     <w:name w:val="Grid Table 3 - Accent 4"/>
-    <w:basedOn w:val="830"/>
+    <w:basedOn w:val="1023"/>
     <w:uiPriority w:val="99"/>
     <w:pPr>
       <w:pBdr/>
@@ -7799,29 +8023,6 @@
         <w:tblBorders/>
       </w:tblPr>
       <w:tcPr>
-        <w:shd w:color="ffffff"/>
-        <w:tcBorders>
-          <w:top w:val="none" w:color="000000" w:sz="4" w:space="0"/>
-          <w:left w:val="none" w:color="000000" w:sz="4" w:space="0"/>
-          <w:bottom w:val="none" w:color="000000" w:sz="4" w:space="0"/>
-          <w:right w:val="none" w:color="000000" w:sz="4" w:space="0"/>
-        </w:tcBorders>
-      </w:tcPr>
-    </w:tblStylePr>
-    <w:tblStylePr w:type="firstRow">
-      <w:rPr>
-        <w:b/>
-        <w:color w:val="404040"/>
-      </w:rPr>
-      <w:pPr>
-        <w:pBdr/>
-        <w:spacing/>
-        <w:ind/>
-      </w:pPr>
-      <w:tblPr>
-        <w:tblBorders/>
-      </w:tblPr>
-      <w:tcPr>
         <w:shd w:val="clear" w:color="ffffff"/>
         <w:tcBorders>
           <w:top w:val="none" w:color="000000" w:sz="4" w:space="0"/>
@@ -7831,30 +8032,7 @@
         </w:tcBorders>
       </w:tcPr>
     </w:tblStylePr>
-    <w:tblStylePr w:type="lastCol">
-      <w:rPr>
-        <w:i/>
-        <w:color w:val="404040"/>
-      </w:rPr>
-      <w:pPr>
-        <w:pBdr/>
-        <w:spacing/>
-        <w:ind/>
-      </w:pPr>
-      <w:tblPr>
-        <w:tblBorders/>
-      </w:tblPr>
-      <w:tcPr>
-        <w:shd w:color="ffffff"/>
-        <w:tcBorders>
-          <w:top w:val="none" w:color="000000" w:sz="4" w:space="0"/>
-          <w:left w:val="none" w:color="000000" w:sz="4" w:space="0"/>
-          <w:bottom w:val="none" w:color="000000" w:sz="4" w:space="0"/>
-          <w:right w:val="none" w:color="000000" w:sz="4" w:space="0"/>
-        </w:tcBorders>
-      </w:tcPr>
-    </w:tblStylePr>
-    <w:tblStylePr w:type="lastRow">
+    <w:tblStylePr w:type="firstRow">
       <w:rPr>
         <w:b/>
         <w:color w:val="404040"/>
@@ -7877,6 +8055,52 @@
         </w:tcBorders>
       </w:tcPr>
     </w:tblStylePr>
+    <w:tblStylePr w:type="lastCol">
+      <w:rPr>
+        <w:i/>
+        <w:color w:val="404040"/>
+      </w:rPr>
+      <w:pPr>
+        <w:pBdr/>
+        <w:spacing/>
+        <w:ind/>
+      </w:pPr>
+      <w:tblPr>
+        <w:tblBorders/>
+      </w:tblPr>
+      <w:tcPr>
+        <w:shd w:val="clear" w:color="ffffff"/>
+        <w:tcBorders>
+          <w:top w:val="none" w:color="000000" w:sz="4" w:space="0"/>
+          <w:left w:val="none" w:color="000000" w:sz="4" w:space="0"/>
+          <w:bottom w:val="none" w:color="000000" w:sz="4" w:space="0"/>
+          <w:right w:val="none" w:color="000000" w:sz="4" w:space="0"/>
+        </w:tcBorders>
+      </w:tcPr>
+    </w:tblStylePr>
+    <w:tblStylePr w:type="lastRow">
+      <w:rPr>
+        <w:b/>
+        <w:color w:val="404040"/>
+      </w:rPr>
+      <w:pPr>
+        <w:pBdr/>
+        <w:spacing/>
+        <w:ind/>
+      </w:pPr>
+      <w:tblPr>
+        <w:tblBorders/>
+      </w:tblPr>
+      <w:tcPr>
+        <w:shd w:val="clear" w:color="ffffff"/>
+        <w:tcBorders>
+          <w:top w:val="none" w:color="000000" w:sz="4" w:space="0"/>
+          <w:left w:val="none" w:color="000000" w:sz="4" w:space="0"/>
+          <w:bottom w:val="none" w:color="000000" w:sz="4" w:space="0"/>
+          <w:right w:val="none" w:color="000000" w:sz="4" w:space="0"/>
+        </w:tcBorders>
+      </w:tcPr>
+    </w:tblStylePr>
     <w:tblStylePr w:type="nwCell">
       <w:pPr>
         <w:pBdr/>
@@ -7943,9 +8167,9 @@
       </w:tcPr>
     </w:tblStylePr>
   </w:style>
-  <w:style w:type="table" w:styleId="38">
+  <w:style w:type="table" w:styleId="865">
     <w:name w:val="Grid Table 3 - Accent 5"/>
-    <w:basedOn w:val="830"/>
+    <w:basedOn w:val="1023"/>
     <w:uiPriority w:val="99"/>
     <w:pPr>
       <w:pBdr/>
@@ -8044,29 +8268,6 @@
         <w:tblBorders/>
       </w:tblPr>
       <w:tcPr>
-        <w:shd w:color="ffffff"/>
-        <w:tcBorders>
-          <w:top w:val="none" w:color="000000" w:sz="4" w:space="0"/>
-          <w:left w:val="none" w:color="000000" w:sz="4" w:space="0"/>
-          <w:bottom w:val="none" w:color="000000" w:sz="4" w:space="0"/>
-          <w:right w:val="none" w:color="000000" w:sz="4" w:space="0"/>
-        </w:tcBorders>
-      </w:tcPr>
-    </w:tblStylePr>
-    <w:tblStylePr w:type="firstRow">
-      <w:rPr>
-        <w:b/>
-        <w:color w:val="404040"/>
-      </w:rPr>
-      <w:pPr>
-        <w:pBdr/>
-        <w:spacing/>
-        <w:ind/>
-      </w:pPr>
-      <w:tblPr>
-        <w:tblBorders/>
-      </w:tblPr>
-      <w:tcPr>
         <w:shd w:val="clear" w:color="ffffff"/>
         <w:tcBorders>
           <w:top w:val="none" w:color="000000" w:sz="4" w:space="0"/>
@@ -8076,30 +8277,7 @@
         </w:tcBorders>
       </w:tcPr>
     </w:tblStylePr>
-    <w:tblStylePr w:type="lastCol">
-      <w:rPr>
-        <w:i/>
-        <w:color w:val="404040"/>
-      </w:rPr>
-      <w:pPr>
-        <w:pBdr/>
-        <w:spacing/>
-        <w:ind/>
-      </w:pPr>
-      <w:tblPr>
-        <w:tblBorders/>
-      </w:tblPr>
-      <w:tcPr>
-        <w:shd w:color="ffffff"/>
-        <w:tcBorders>
-          <w:top w:val="none" w:color="000000" w:sz="4" w:space="0"/>
-          <w:left w:val="none" w:color="000000" w:sz="4" w:space="0"/>
-          <w:bottom w:val="none" w:color="000000" w:sz="4" w:space="0"/>
-          <w:right w:val="none" w:color="000000" w:sz="4" w:space="0"/>
-        </w:tcBorders>
-      </w:tcPr>
-    </w:tblStylePr>
-    <w:tblStylePr w:type="lastRow">
+    <w:tblStylePr w:type="firstRow">
       <w:rPr>
         <w:b/>
         <w:color w:val="404040"/>
@@ -8122,6 +8300,52 @@
         </w:tcBorders>
       </w:tcPr>
     </w:tblStylePr>
+    <w:tblStylePr w:type="lastCol">
+      <w:rPr>
+        <w:i/>
+        <w:color w:val="404040"/>
+      </w:rPr>
+      <w:pPr>
+        <w:pBdr/>
+        <w:spacing/>
+        <w:ind/>
+      </w:pPr>
+      <w:tblPr>
+        <w:tblBorders/>
+      </w:tblPr>
+      <w:tcPr>
+        <w:shd w:val="clear" w:color="ffffff"/>
+        <w:tcBorders>
+          <w:top w:val="none" w:color="000000" w:sz="4" w:space="0"/>
+          <w:left w:val="none" w:color="000000" w:sz="4" w:space="0"/>
+          <w:bottom w:val="none" w:color="000000" w:sz="4" w:space="0"/>
+          <w:right w:val="none" w:color="000000" w:sz="4" w:space="0"/>
+        </w:tcBorders>
+      </w:tcPr>
+    </w:tblStylePr>
+    <w:tblStylePr w:type="lastRow">
+      <w:rPr>
+        <w:b/>
+        <w:color w:val="404040"/>
+      </w:rPr>
+      <w:pPr>
+        <w:pBdr/>
+        <w:spacing/>
+        <w:ind/>
+      </w:pPr>
+      <w:tblPr>
+        <w:tblBorders/>
+      </w:tblPr>
+      <w:tcPr>
+        <w:shd w:val="clear" w:color="ffffff"/>
+        <w:tcBorders>
+          <w:top w:val="none" w:color="000000" w:sz="4" w:space="0"/>
+          <w:left w:val="none" w:color="000000" w:sz="4" w:space="0"/>
+          <w:bottom w:val="none" w:color="000000" w:sz="4" w:space="0"/>
+          <w:right w:val="none" w:color="000000" w:sz="4" w:space="0"/>
+        </w:tcBorders>
+      </w:tcPr>
+    </w:tblStylePr>
     <w:tblStylePr w:type="nwCell">
       <w:pPr>
         <w:pBdr/>
@@ -8188,9 +8412,9 @@
       </w:tcPr>
     </w:tblStylePr>
   </w:style>
-  <w:style w:type="table" w:styleId="39">
+  <w:style w:type="table" w:styleId="866">
     <w:name w:val="Grid Table 3 - Accent 6"/>
-    <w:basedOn w:val="830"/>
+    <w:basedOn w:val="1023"/>
     <w:uiPriority w:val="99"/>
     <w:pPr>
       <w:pBdr/>
@@ -8289,29 +8513,6 @@
         <w:tblBorders/>
       </w:tblPr>
       <w:tcPr>
-        <w:shd w:color="ffffff"/>
-        <w:tcBorders>
-          <w:top w:val="none" w:color="000000" w:sz="4" w:space="0"/>
-          <w:left w:val="none" w:color="000000" w:sz="4" w:space="0"/>
-          <w:bottom w:val="none" w:color="000000" w:sz="4" w:space="0"/>
-          <w:right w:val="none" w:color="000000" w:sz="4" w:space="0"/>
-        </w:tcBorders>
-      </w:tcPr>
-    </w:tblStylePr>
-    <w:tblStylePr w:type="firstRow">
-      <w:rPr>
-        <w:b/>
-        <w:color w:val="404040"/>
-      </w:rPr>
-      <w:pPr>
-        <w:pBdr/>
-        <w:spacing/>
-        <w:ind/>
-      </w:pPr>
-      <w:tblPr>
-        <w:tblBorders/>
-      </w:tblPr>
-      <w:tcPr>
         <w:shd w:val="clear" w:color="ffffff"/>
         <w:tcBorders>
           <w:top w:val="none" w:color="000000" w:sz="4" w:space="0"/>
@@ -8321,30 +8522,7 @@
         </w:tcBorders>
       </w:tcPr>
     </w:tblStylePr>
-    <w:tblStylePr w:type="lastCol">
-      <w:rPr>
-        <w:i/>
-        <w:color w:val="404040"/>
-      </w:rPr>
-      <w:pPr>
-        <w:pBdr/>
-        <w:spacing/>
-        <w:ind/>
-      </w:pPr>
-      <w:tblPr>
-        <w:tblBorders/>
-      </w:tblPr>
-      <w:tcPr>
-        <w:shd w:color="ffffff"/>
-        <w:tcBorders>
-          <w:top w:val="none" w:color="000000" w:sz="4" w:space="0"/>
-          <w:left w:val="none" w:color="000000" w:sz="4" w:space="0"/>
-          <w:bottom w:val="none" w:color="000000" w:sz="4" w:space="0"/>
-          <w:right w:val="none" w:color="000000" w:sz="4" w:space="0"/>
-        </w:tcBorders>
-      </w:tcPr>
-    </w:tblStylePr>
-    <w:tblStylePr w:type="lastRow">
+    <w:tblStylePr w:type="firstRow">
       <w:rPr>
         <w:b/>
         <w:color w:val="404040"/>
@@ -8367,6 +8545,52 @@
         </w:tcBorders>
       </w:tcPr>
     </w:tblStylePr>
+    <w:tblStylePr w:type="lastCol">
+      <w:rPr>
+        <w:i/>
+        <w:color w:val="404040"/>
+      </w:rPr>
+      <w:pPr>
+        <w:pBdr/>
+        <w:spacing/>
+        <w:ind/>
+      </w:pPr>
+      <w:tblPr>
+        <w:tblBorders/>
+      </w:tblPr>
+      <w:tcPr>
+        <w:shd w:val="clear" w:color="ffffff"/>
+        <w:tcBorders>
+          <w:top w:val="none" w:color="000000" w:sz="4" w:space="0"/>
+          <w:left w:val="none" w:color="000000" w:sz="4" w:space="0"/>
+          <w:bottom w:val="none" w:color="000000" w:sz="4" w:space="0"/>
+          <w:right w:val="none" w:color="000000" w:sz="4" w:space="0"/>
+        </w:tcBorders>
+      </w:tcPr>
+    </w:tblStylePr>
+    <w:tblStylePr w:type="lastRow">
+      <w:rPr>
+        <w:b/>
+        <w:color w:val="404040"/>
+      </w:rPr>
+      <w:pPr>
+        <w:pBdr/>
+        <w:spacing/>
+        <w:ind/>
+      </w:pPr>
+      <w:tblPr>
+        <w:tblBorders/>
+      </w:tblPr>
+      <w:tcPr>
+        <w:shd w:val="clear" w:color="ffffff"/>
+        <w:tcBorders>
+          <w:top w:val="none" w:color="000000" w:sz="4" w:space="0"/>
+          <w:left w:val="none" w:color="000000" w:sz="4" w:space="0"/>
+          <w:bottom w:val="none" w:color="000000" w:sz="4" w:space="0"/>
+          <w:right w:val="none" w:color="000000" w:sz="4" w:space="0"/>
+        </w:tcBorders>
+      </w:tcPr>
+    </w:tblStylePr>
     <w:tblStylePr w:type="nwCell">
       <w:pPr>
         <w:pBdr/>
@@ -8433,9 +8657,9 @@
       </w:tcPr>
     </w:tblStylePr>
   </w:style>
-  <w:style w:type="table" w:styleId="40">
+  <w:style w:type="table" w:styleId="867">
     <w:name w:val="Grid Table 4"/>
-    <w:basedOn w:val="830"/>
+    <w:basedOn w:val="1023"/>
     <w:uiPriority w:val="59"/>
     <w:pPr>
       <w:pBdr/>
@@ -8666,9 +8890,9 @@
       </w:tcPr>
     </w:tblStylePr>
   </w:style>
-  <w:style w:type="table" w:styleId="41">
+  <w:style w:type="table" w:styleId="868">
     <w:name w:val="Grid Table 4 - Accent 1"/>
-    <w:basedOn w:val="830"/>
+    <w:basedOn w:val="1023"/>
     <w:uiPriority w:val="59"/>
     <w:pPr>
       <w:pBdr/>
@@ -8899,9 +9123,9 @@
       </w:tcPr>
     </w:tblStylePr>
   </w:style>
-  <w:style w:type="table" w:styleId="42">
+  <w:style w:type="table" w:styleId="869">
     <w:name w:val="Grid Table 4 - Accent 2"/>
-    <w:basedOn w:val="830"/>
+    <w:basedOn w:val="1023"/>
     <w:uiPriority w:val="59"/>
     <w:pPr>
       <w:pBdr/>
@@ -9132,9 +9356,9 @@
       </w:tcPr>
     </w:tblStylePr>
   </w:style>
-  <w:style w:type="table" w:styleId="43">
+  <w:style w:type="table" w:styleId="870">
     <w:name w:val="Grid Table 4 - Accent 3"/>
-    <w:basedOn w:val="830"/>
+    <w:basedOn w:val="1023"/>
     <w:uiPriority w:val="59"/>
     <w:pPr>
       <w:pBdr/>
@@ -9365,9 +9589,9 @@
       </w:tcPr>
     </w:tblStylePr>
   </w:style>
-  <w:style w:type="table" w:styleId="44">
+  <w:style w:type="table" w:styleId="871">
     <w:name w:val="Grid Table 4 - Accent 4"/>
-    <w:basedOn w:val="830"/>
+    <w:basedOn w:val="1023"/>
     <w:uiPriority w:val="59"/>
     <w:pPr>
       <w:pBdr/>
@@ -9598,9 +9822,9 @@
       </w:tcPr>
     </w:tblStylePr>
   </w:style>
-  <w:style w:type="table" w:styleId="45">
+  <w:style w:type="table" w:styleId="872">
     <w:name w:val="Grid Table 4 - Accent 5"/>
-    <w:basedOn w:val="830"/>
+    <w:basedOn w:val="1023"/>
     <w:uiPriority w:val="59"/>
     <w:pPr>
       <w:pBdr/>
@@ -9831,9 +10055,9 @@
       </w:tcPr>
     </w:tblStylePr>
   </w:style>
-  <w:style w:type="table" w:styleId="46">
+  <w:style w:type="table" w:styleId="873">
     <w:name w:val="Grid Table 4 - Accent 6"/>
-    <w:basedOn w:val="830"/>
+    <w:basedOn w:val="1023"/>
     <w:uiPriority w:val="59"/>
     <w:pPr>
       <w:pBdr/>
@@ -10064,9 +10288,9 @@
       </w:tcPr>
     </w:tblStylePr>
   </w:style>
-  <w:style w:type="table" w:styleId="47">
+  <w:style w:type="table" w:styleId="874">
     <w:name w:val="Grid Table 5 Dark"/>
-    <w:basedOn w:val="830"/>
+    <w:basedOn w:val="1023"/>
     <w:uiPriority w:val="99"/>
     <w:pPr>
       <w:pBdr/>
@@ -10292,9 +10516,9 @@
       </w:tcPr>
     </w:tblStylePr>
   </w:style>
-  <w:style w:type="table" w:styleId="48">
+  <w:style w:type="table" w:styleId="875">
     <w:name w:val="Grid Table 5 Dark- Accent 1"/>
-    <w:basedOn w:val="830"/>
+    <w:basedOn w:val="1023"/>
     <w:uiPriority w:val="99"/>
     <w:pPr>
       <w:pBdr/>
@@ -10520,9 +10744,9 @@
       </w:tcPr>
     </w:tblStylePr>
   </w:style>
-  <w:style w:type="table" w:styleId="49">
+  <w:style w:type="table" w:styleId="876">
     <w:name w:val="Grid Table 5 Dark - Accent 2"/>
-    <w:basedOn w:val="830"/>
+    <w:basedOn w:val="1023"/>
     <w:uiPriority w:val="99"/>
     <w:pPr>
       <w:pBdr/>
@@ -10748,9 +10972,9 @@
       </w:tcPr>
     </w:tblStylePr>
   </w:style>
-  <w:style w:type="table" w:styleId="50">
+  <w:style w:type="table" w:styleId="877">
     <w:name w:val="Grid Table 5 Dark - Accent 3"/>
-    <w:basedOn w:val="830"/>
+    <w:basedOn w:val="1023"/>
     <w:uiPriority w:val="99"/>
     <w:pPr>
       <w:pBdr/>
@@ -10976,9 +11200,9 @@
       </w:tcPr>
     </w:tblStylePr>
   </w:style>
-  <w:style w:type="table" w:styleId="51">
+  <w:style w:type="table" w:styleId="878">
     <w:name w:val="Grid Table 5 Dark- Accent 4"/>
-    <w:basedOn w:val="830"/>
+    <w:basedOn w:val="1023"/>
     <w:uiPriority w:val="99"/>
     <w:pPr>
       <w:pBdr/>
@@ -11204,9 +11428,9 @@
       </w:tcPr>
     </w:tblStylePr>
   </w:style>
-  <w:style w:type="table" w:styleId="52">
+  <w:style w:type="table" w:styleId="879">
     <w:name w:val="Grid Table 5 Dark - Accent 5"/>
-    <w:basedOn w:val="830"/>
+    <w:basedOn w:val="1023"/>
     <w:uiPriority w:val="99"/>
     <w:pPr>
       <w:pBdr/>
@@ -11432,9 +11656,9 @@
       </w:tcPr>
     </w:tblStylePr>
   </w:style>
-  <w:style w:type="table" w:styleId="53">
+  <w:style w:type="table" w:styleId="880">
     <w:name w:val="Grid Table 5 Dark - Accent 6"/>
-    <w:basedOn w:val="830"/>
+    <w:basedOn w:val="1023"/>
     <w:uiPriority w:val="99"/>
     <w:pPr>
       <w:pBdr/>
@@ -11660,9 +11884,9 @@
       </w:tcPr>
     </w:tblStylePr>
   </w:style>
-  <w:style w:type="table" w:styleId="54">
+  <w:style w:type="table" w:styleId="881">
     <w:name w:val="Grid Table 6 Colorful"/>
-    <w:basedOn w:val="830"/>
+    <w:basedOn w:val="1023"/>
     <w:uiPriority w:val="99"/>
     <w:pPr>
       <w:pBdr/>
@@ -11890,9 +12114,9 @@
       </w:tcPr>
     </w:tblStylePr>
   </w:style>
-  <w:style w:type="table" w:styleId="55">
+  <w:style w:type="table" w:styleId="882">
     <w:name w:val="Grid Table 6 Colorful - Accent 1"/>
-    <w:basedOn w:val="830"/>
+    <w:basedOn w:val="1023"/>
     <w:uiPriority w:val="99"/>
     <w:pPr>
       <w:pBdr/>
@@ -12120,9 +12344,9 @@
       </w:tcPr>
     </w:tblStylePr>
   </w:style>
-  <w:style w:type="table" w:styleId="56">
+  <w:style w:type="table" w:styleId="883">
     <w:name w:val="Grid Table 6 Colorful - Accent 2"/>
-    <w:basedOn w:val="830"/>
+    <w:basedOn w:val="1023"/>
     <w:uiPriority w:val="99"/>
     <w:pPr>
       <w:pBdr/>
@@ -12350,9 +12574,9 @@
       </w:tcPr>
     </w:tblStylePr>
   </w:style>
-  <w:style w:type="table" w:styleId="57">
+  <w:style w:type="table" w:styleId="884">
     <w:name w:val="Grid Table 6 Colorful - Accent 3"/>
-    <w:basedOn w:val="830"/>
+    <w:basedOn w:val="1023"/>
     <w:uiPriority w:val="99"/>
     <w:pPr>
       <w:pBdr/>
@@ -12580,9 +12804,9 @@
       </w:tcPr>
     </w:tblStylePr>
   </w:style>
-  <w:style w:type="table" w:styleId="58">
+  <w:style w:type="table" w:styleId="885">
     <w:name w:val="Grid Table 6 Colorful - Accent 4"/>
-    <w:basedOn w:val="830"/>
+    <w:basedOn w:val="1023"/>
     <w:uiPriority w:val="99"/>
     <w:pPr>
       <w:pBdr/>
@@ -12810,9 +13034,9 @@
       </w:tcPr>
     </w:tblStylePr>
   </w:style>
-  <w:style w:type="table" w:styleId="59">
+  <w:style w:type="table" w:styleId="886">
     <w:name w:val="Grid Table 6 Colorful - Accent 5"/>
-    <w:basedOn w:val="830"/>
+    <w:basedOn w:val="1023"/>
     <w:uiPriority w:val="99"/>
     <w:pPr>
       <w:pBdr/>
@@ -13040,9 +13264,9 @@
       </w:tcPr>
     </w:tblStylePr>
   </w:style>
-  <w:style w:type="table" w:styleId="60">
+  <w:style w:type="table" w:styleId="887">
     <w:name w:val="Grid Table 6 Colorful - Accent 6"/>
-    <w:basedOn w:val="830"/>
+    <w:basedOn w:val="1023"/>
     <w:uiPriority w:val="99"/>
     <w:pPr>
       <w:pBdr/>
@@ -13270,9 +13494,9 @@
       </w:tcPr>
     </w:tblStylePr>
   </w:style>
-  <w:style w:type="table" w:styleId="61">
+  <w:style w:type="table" w:styleId="888">
     <w:name w:val="Grid Table 7 Colorful"/>
-    <w:basedOn w:val="830"/>
+    <w:basedOn w:val="1023"/>
     <w:uiPriority w:val="99"/>
     <w:pPr>
       <w:pBdr/>
@@ -13374,11 +13598,11 @@
         <w:tblBorders/>
       </w:tblPr>
       <w:tcPr>
-        <w:shd w:color="ffffff"/>
+        <w:shd w:val="clear" w:color="ffffff"/>
         <w:tcBorders>
-          <w:top w:val="none"/>
-          <w:left w:val="none"/>
-          <w:bottom w:val="none"/>
+          <w:top w:val="none" w:color="000000" w:sz="4" w:space="0"/>
+          <w:left w:val="none" w:color="000000" w:sz="4" w:space="0"/>
+          <w:bottom w:val="none" w:color="000000" w:sz="4" w:space="0"/>
           <w:right w:val="single" w:color="000000" w:themeColor="text1" w:themeTint="80" w:sz="4" w:space="0"/>
         </w:tcBorders>
       </w:tcPr>
@@ -13401,10 +13625,10 @@
       <w:tcPr>
         <w:shd w:val="clear" w:color="ffffff" w:themeColor="light1" w:fill="ffffff" w:themeFill="light1"/>
         <w:tcBorders>
-          <w:top w:val="none"/>
-          <w:left w:val="none"/>
+          <w:top w:val="none" w:color="000000" w:sz="4" w:space="0"/>
+          <w:left w:val="none" w:color="000000" w:sz="4" w:space="0"/>
           <w:bottom w:val="single" w:color="000000" w:themeColor="text1" w:themeTint="80" w:sz="4" w:space="0"/>
-          <w:right w:val="none"/>
+          <w:right w:val="none" w:color="000000" w:sz="4" w:space="0"/>
         </w:tcBorders>
       </w:tcPr>
     </w:tblStylePr>
@@ -13424,12 +13648,12 @@
         <w:tblBorders/>
       </w:tblPr>
       <w:tcPr>
-        <w:shd w:color="ffffff"/>
+        <w:shd w:val="clear" w:color="ffffff"/>
         <w:tcBorders>
-          <w:top w:val="none"/>
+          <w:top w:val="none" w:color="000000" w:sz="4" w:space="0"/>
           <w:left w:val="single" w:color="000000" w:themeColor="text1" w:themeTint="80" w:sz="4" w:space="0"/>
-          <w:bottom w:val="none"/>
-          <w:right w:val="none"/>
+          <w:bottom w:val="none" w:color="000000" w:sz="4" w:space="0"/>
+          <w:right w:val="none" w:color="000000" w:sz="4" w:space="0"/>
         </w:tcBorders>
       </w:tcPr>
     </w:tblStylePr>
@@ -13452,9 +13676,9 @@
         <w:shd w:val="clear" w:color="ffffff" w:themeColor="light1" w:fill="ffffff" w:themeFill="light1"/>
         <w:tcBorders>
           <w:top w:val="single" w:color="000000" w:themeColor="text1" w:themeTint="80" w:sz="4" w:space="0"/>
-          <w:left w:val="none"/>
-          <w:bottom w:val="none"/>
-          <w:right w:val="none"/>
+          <w:left w:val="none" w:color="000000" w:sz="4" w:space="0"/>
+          <w:bottom w:val="none" w:color="000000" w:sz="4" w:space="0"/>
+          <w:right w:val="none" w:color="000000" w:sz="4" w:space="0"/>
         </w:tcBorders>
       </w:tcPr>
     </w:tblStylePr>
@@ -13524,9 +13748,9 @@
       </w:tcPr>
     </w:tblStylePr>
   </w:style>
-  <w:style w:type="table" w:styleId="62">
+  <w:style w:type="table" w:styleId="889">
     <w:name w:val="Grid Table 7 Colorful - Accent 1"/>
-    <w:basedOn w:val="830"/>
+    <w:basedOn w:val="1023"/>
     <w:uiPriority w:val="99"/>
     <w:pPr>
       <w:pBdr/>
@@ -13628,11 +13852,11 @@
         <w:tblBorders/>
       </w:tblPr>
       <w:tcPr>
-        <w:shd w:color="ffffff"/>
+        <w:shd w:val="clear" w:color="ffffff"/>
         <w:tcBorders>
-          <w:top w:val="none"/>
-          <w:left w:val="none"/>
-          <w:bottom w:val="none"/>
+          <w:top w:val="none" w:color="000000" w:sz="4" w:space="0"/>
+          <w:left w:val="none" w:color="000000" w:sz="4" w:space="0"/>
+          <w:bottom w:val="none" w:color="000000" w:sz="4" w:space="0"/>
           <w:right w:val="single" w:color="000000" w:themeColor="accent1" w:themeTint="80" w:sz="4" w:space="0"/>
         </w:tcBorders>
       </w:tcPr>
@@ -13655,10 +13879,10 @@
       <w:tcPr>
         <w:shd w:val="clear" w:color="ffffff" w:themeColor="light1" w:fill="ffffff" w:themeFill="light1"/>
         <w:tcBorders>
-          <w:top w:val="none"/>
-          <w:left w:val="none"/>
+          <w:top w:val="none" w:color="000000" w:sz="4" w:space="0"/>
+          <w:left w:val="none" w:color="000000" w:sz="4" w:space="0"/>
           <w:bottom w:val="single" w:color="000000" w:themeColor="accent1" w:themeTint="80" w:sz="4" w:space="0"/>
-          <w:right w:val="none"/>
+          <w:right w:val="none" w:color="000000" w:sz="4" w:space="0"/>
         </w:tcBorders>
       </w:tcPr>
     </w:tblStylePr>
@@ -13678,12 +13902,12 @@
         <w:tblBorders/>
       </w:tblPr>
       <w:tcPr>
-        <w:shd w:color="ffffff"/>
+        <w:shd w:val="clear" w:color="ffffff"/>
         <w:tcBorders>
-          <w:top w:val="none"/>
+          <w:top w:val="none" w:color="000000" w:sz="4" w:space="0"/>
           <w:left w:val="single" w:color="000000" w:themeColor="accent1" w:themeTint="80" w:sz="4" w:space="0"/>
-          <w:bottom w:val="none"/>
-          <w:right w:val="none"/>
+          <w:bottom w:val="none" w:color="000000" w:sz="4" w:space="0"/>
+          <w:right w:val="none" w:color="000000" w:sz="4" w:space="0"/>
         </w:tcBorders>
       </w:tcPr>
     </w:tblStylePr>
@@ -13706,9 +13930,9 @@
         <w:shd w:val="clear" w:color="ffffff" w:themeColor="light1" w:fill="ffffff" w:themeFill="light1"/>
         <w:tcBorders>
           <w:top w:val="single" w:color="000000" w:themeColor="accent1" w:themeTint="80" w:sz="4" w:space="0"/>
-          <w:left w:val="none"/>
-          <w:bottom w:val="none"/>
-          <w:right w:val="none"/>
+          <w:left w:val="none" w:color="000000" w:sz="4" w:space="0"/>
+          <w:bottom w:val="none" w:color="000000" w:sz="4" w:space="0"/>
+          <w:right w:val="none" w:color="000000" w:sz="4" w:space="0"/>
         </w:tcBorders>
       </w:tcPr>
     </w:tblStylePr>
@@ -13778,9 +14002,9 @@
       </w:tcPr>
     </w:tblStylePr>
   </w:style>
-  <w:style w:type="table" w:styleId="63">
+  <w:style w:type="table" w:styleId="890">
     <w:name w:val="Grid Table 7 Colorful - Accent 2"/>
-    <w:basedOn w:val="830"/>
+    <w:basedOn w:val="1023"/>
     <w:uiPriority w:val="99"/>
     <w:pPr>
       <w:pBdr/>
@@ -13882,11 +14106,11 @@
         <w:tblBorders/>
       </w:tblPr>
       <w:tcPr>
-        <w:shd w:color="ffffff"/>
+        <w:shd w:val="clear" w:color="ffffff"/>
         <w:tcBorders>
-          <w:top w:val="none"/>
-          <w:left w:val="none"/>
-          <w:bottom w:val="none"/>
+          <w:top w:val="none" w:color="000000" w:sz="4" w:space="0"/>
+          <w:left w:val="none" w:color="000000" w:sz="4" w:space="0"/>
+          <w:bottom w:val="none" w:color="000000" w:sz="4" w:space="0"/>
           <w:right w:val="single" w:color="000000" w:themeColor="accent2" w:themeTint="97" w:sz="4" w:space="0"/>
         </w:tcBorders>
       </w:tcPr>
@@ -13909,10 +14133,10 @@
       <w:tcPr>
         <w:shd w:val="clear" w:color="ffffff" w:themeColor="light1" w:fill="ffffff" w:themeFill="light1"/>
         <w:tcBorders>
-          <w:top w:val="none"/>
-          <w:left w:val="none"/>
+          <w:top w:val="none" w:color="000000" w:sz="4" w:space="0"/>
+          <w:left w:val="none" w:color="000000" w:sz="4" w:space="0"/>
           <w:bottom w:val="single" w:color="000000" w:themeColor="accent2" w:themeTint="97" w:sz="4" w:space="0"/>
-          <w:right w:val="none"/>
+          <w:right w:val="none" w:color="000000" w:sz="4" w:space="0"/>
         </w:tcBorders>
       </w:tcPr>
     </w:tblStylePr>
@@ -13932,12 +14156,12 @@
         <w:tblBorders/>
       </w:tblPr>
       <w:tcPr>
-        <w:shd w:color="ffffff"/>
+        <w:shd w:val="clear" w:color="ffffff"/>
         <w:tcBorders>
-          <w:top w:val="none"/>
+          <w:top w:val="none" w:color="000000" w:sz="4" w:space="0"/>
           <w:left w:val="single" w:color="000000" w:themeColor="accent2" w:themeTint="97" w:sz="4" w:space="0"/>
-          <w:bottom w:val="none"/>
-          <w:right w:val="none"/>
+          <w:bottom w:val="none" w:color="000000" w:sz="4" w:space="0"/>
+          <w:right w:val="none" w:color="000000" w:sz="4" w:space="0"/>
         </w:tcBorders>
       </w:tcPr>
     </w:tblStylePr>
@@ -13960,9 +14184,9 @@
         <w:shd w:val="clear" w:color="ffffff" w:themeColor="light1" w:fill="ffffff" w:themeFill="light1"/>
         <w:tcBorders>
           <w:top w:val="single" w:color="000000" w:themeColor="accent2" w:themeTint="97" w:sz="4" w:space="0"/>
-          <w:left w:val="none"/>
-          <w:bottom w:val="none"/>
-          <w:right w:val="none"/>
+          <w:left w:val="none" w:color="000000" w:sz="4" w:space="0"/>
+          <w:bottom w:val="none" w:color="000000" w:sz="4" w:space="0"/>
+          <w:right w:val="none" w:color="000000" w:sz="4" w:space="0"/>
         </w:tcBorders>
       </w:tcPr>
     </w:tblStylePr>
@@ -14032,9 +14256,9 @@
       </w:tcPr>
     </w:tblStylePr>
   </w:style>
-  <w:style w:type="table" w:styleId="64">
+  <w:style w:type="table" w:styleId="891">
     <w:name w:val="Grid Table 7 Colorful - Accent 3"/>
-    <w:basedOn w:val="830"/>
+    <w:basedOn w:val="1023"/>
     <w:uiPriority w:val="99"/>
     <w:pPr>
       <w:pBdr/>
@@ -14136,11 +14360,11 @@
         <w:tblBorders/>
       </w:tblPr>
       <w:tcPr>
-        <w:shd w:color="ffffff"/>
+        <w:shd w:val="clear" w:color="ffffff"/>
         <w:tcBorders>
-          <w:top w:val="none"/>
-          <w:left w:val="none"/>
-          <w:bottom w:val="none"/>
+          <w:top w:val="none" w:color="000000" w:sz="4" w:space="0"/>
+          <w:left w:val="none" w:color="000000" w:sz="4" w:space="0"/>
+          <w:bottom w:val="none" w:color="000000" w:sz="4" w:space="0"/>
           <w:right w:val="single" w:color="000000" w:themeColor="accent3" w:themeTint="FE" w:sz="4" w:space="0"/>
         </w:tcBorders>
       </w:tcPr>
@@ -14163,10 +14387,10 @@
       <w:tcPr>
         <w:shd w:val="clear" w:color="ffffff" w:themeColor="light1" w:fill="ffffff" w:themeFill="light1"/>
         <w:tcBorders>
-          <w:top w:val="none"/>
-          <w:left w:val="none"/>
+          <w:top w:val="none" w:color="000000" w:sz="4" w:space="0"/>
+          <w:left w:val="none" w:color="000000" w:sz="4" w:space="0"/>
           <w:bottom w:val="single" w:color="000000" w:themeColor="accent3" w:themeTint="FE" w:sz="4" w:space="0"/>
-          <w:right w:val="none"/>
+          <w:right w:val="none" w:color="000000" w:sz="4" w:space="0"/>
         </w:tcBorders>
       </w:tcPr>
     </w:tblStylePr>
@@ -14186,12 +14410,12 @@
         <w:tblBorders/>
       </w:tblPr>
       <w:tcPr>
-        <w:shd w:color="ffffff"/>
+        <w:shd w:val="clear" w:color="ffffff"/>
         <w:tcBorders>
-          <w:top w:val="none"/>
+          <w:top w:val="none" w:color="000000" w:sz="4" w:space="0"/>
           <w:left w:val="single" w:color="000000" w:themeColor="accent3" w:themeTint="FE" w:sz="4" w:space="0"/>
-          <w:bottom w:val="none"/>
-          <w:right w:val="none"/>
+          <w:bottom w:val="none" w:color="000000" w:sz="4" w:space="0"/>
+          <w:right w:val="none" w:color="000000" w:sz="4" w:space="0"/>
         </w:tcBorders>
       </w:tcPr>
     </w:tblStylePr>
@@ -14214,9 +14438,9 @@
         <w:shd w:val="clear" w:color="ffffff" w:themeColor="light1" w:fill="ffffff" w:themeFill="light1"/>
         <w:tcBorders>
           <w:top w:val="single" w:color="000000" w:themeColor="accent3" w:themeTint="FE" w:sz="4" w:space="0"/>
-          <w:left w:val="none"/>
-          <w:bottom w:val="none"/>
-          <w:right w:val="none"/>
+          <w:left w:val="none" w:color="000000" w:sz="4" w:space="0"/>
+          <w:bottom w:val="none" w:color="000000" w:sz="4" w:space="0"/>
+          <w:right w:val="none" w:color="000000" w:sz="4" w:space="0"/>
         </w:tcBorders>
       </w:tcPr>
     </w:tblStylePr>
@@ -14286,9 +14510,9 @@
       </w:tcPr>
     </w:tblStylePr>
   </w:style>
-  <w:style w:type="table" w:styleId="65">
+  <w:style w:type="table" w:styleId="892">
     <w:name w:val="Grid Table 7 Colorful - Accent 4"/>
-    <w:basedOn w:val="830"/>
+    <w:basedOn w:val="1023"/>
     <w:uiPriority w:val="99"/>
     <w:pPr>
       <w:pBdr/>
@@ -14390,11 +14614,11 @@
         <w:tblBorders/>
       </w:tblPr>
       <w:tcPr>
-        <w:shd w:color="ffffff"/>
+        <w:shd w:val="clear" w:color="ffffff"/>
         <w:tcBorders>
-          <w:top w:val="none"/>
-          <w:left w:val="none"/>
-          <w:bottom w:val="none"/>
+          <w:top w:val="none" w:color="000000" w:sz="4" w:space="0"/>
+          <w:left w:val="none" w:color="000000" w:sz="4" w:space="0"/>
+          <w:bottom w:val="none" w:color="000000" w:sz="4" w:space="0"/>
           <w:right w:val="single" w:color="000000" w:themeColor="accent4" w:themeTint="9A" w:sz="4" w:space="0"/>
         </w:tcBorders>
       </w:tcPr>
@@ -14417,10 +14641,10 @@
       <w:tcPr>
         <w:shd w:val="clear" w:color="ffffff" w:themeColor="light1" w:fill="ffffff" w:themeFill="light1"/>
         <w:tcBorders>
-          <w:top w:val="none"/>
-          <w:left w:val="none"/>
+          <w:top w:val="none" w:color="000000" w:sz="4" w:space="0"/>
+          <w:left w:val="none" w:color="000000" w:sz="4" w:space="0"/>
           <w:bottom w:val="single" w:color="000000" w:themeColor="accent4" w:themeTint="9A" w:sz="4" w:space="0"/>
-          <w:right w:val="none"/>
+          <w:right w:val="none" w:color="000000" w:sz="4" w:space="0"/>
         </w:tcBorders>
       </w:tcPr>
     </w:tblStylePr>
@@ -14440,12 +14664,12 @@
         <w:tblBorders/>
       </w:tblPr>
       <w:tcPr>
-        <w:shd w:color="ffffff"/>
+        <w:shd w:val="clear" w:color="ffffff"/>
         <w:tcBorders>
-          <w:top w:val="none"/>
+          <w:top w:val="none" w:color="000000" w:sz="4" w:space="0"/>
           <w:left w:val="single" w:color="000000" w:themeColor="accent4" w:themeTint="9A" w:sz="4" w:space="0"/>
-          <w:bottom w:val="none"/>
-          <w:right w:val="none"/>
+          <w:bottom w:val="none" w:color="000000" w:sz="4" w:space="0"/>
+          <w:right w:val="none" w:color="000000" w:sz="4" w:space="0"/>
         </w:tcBorders>
       </w:tcPr>
     </w:tblStylePr>
@@ -14468,9 +14692,9 @@
         <w:shd w:val="clear" w:color="ffffff" w:themeColor="light1" w:fill="ffffff" w:themeFill="light1"/>
         <w:tcBorders>
           <w:top w:val="single" w:color="000000" w:themeColor="accent4" w:themeTint="9A" w:sz="4" w:space="0"/>
-          <w:left w:val="none"/>
-          <w:bottom w:val="none"/>
-          <w:right w:val="none"/>
+          <w:left w:val="none" w:color="000000" w:sz="4" w:space="0"/>
+          <w:bottom w:val="none" w:color="000000" w:sz="4" w:space="0"/>
+          <w:right w:val="none" w:color="000000" w:sz="4" w:space="0"/>
         </w:tcBorders>
       </w:tcPr>
     </w:tblStylePr>
@@ -14540,9 +14764,9 @@
       </w:tcPr>
     </w:tblStylePr>
   </w:style>
-  <w:style w:type="table" w:styleId="66">
+  <w:style w:type="table" w:styleId="893">
     <w:name w:val="Grid Table 7 Colorful - Accent 5"/>
-    <w:basedOn w:val="830"/>
+    <w:basedOn w:val="1023"/>
     <w:uiPriority w:val="99"/>
     <w:pPr>
       <w:pBdr/>
@@ -14644,11 +14868,11 @@
         <w:tblBorders/>
       </w:tblPr>
       <w:tcPr>
-        <w:shd w:color="ffffff"/>
+        <w:shd w:val="clear" w:color="ffffff"/>
         <w:tcBorders>
-          <w:top w:val="none"/>
-          <w:left w:val="none"/>
-          <w:bottom w:val="none"/>
+          <w:top w:val="none" w:color="000000" w:sz="4" w:space="0"/>
+          <w:left w:val="none" w:color="000000" w:sz="4" w:space="0"/>
+          <w:bottom w:val="none" w:color="000000" w:sz="4" w:space="0"/>
           <w:right w:val="single" w:color="000000" w:themeColor="accent5" w:themeTint="90" w:sz="4" w:space="0"/>
         </w:tcBorders>
       </w:tcPr>
@@ -14671,10 +14895,10 @@
       <w:tcPr>
         <w:shd w:val="clear" w:color="ffffff" w:themeColor="light1" w:fill="ffffff" w:themeFill="light1"/>
         <w:tcBorders>
-          <w:top w:val="none"/>
-          <w:left w:val="none"/>
+          <w:top w:val="none" w:color="000000" w:sz="4" w:space="0"/>
+          <w:left w:val="none" w:color="000000" w:sz="4" w:space="0"/>
           <w:bottom w:val="single" w:color="000000" w:themeColor="accent5" w:themeTint="90" w:sz="4" w:space="0"/>
-          <w:right w:val="none"/>
+          <w:right w:val="none" w:color="000000" w:sz="4" w:space="0"/>
         </w:tcBorders>
       </w:tcPr>
     </w:tblStylePr>
@@ -14694,12 +14918,12 @@
         <w:tblBorders/>
       </w:tblPr>
       <w:tcPr>
-        <w:shd w:color="ffffff"/>
+        <w:shd w:val="clear" w:color="ffffff"/>
         <w:tcBorders>
-          <w:top w:val="none"/>
+          <w:top w:val="none" w:color="000000" w:sz="4" w:space="0"/>
           <w:left w:val="single" w:color="000000" w:themeColor="accent5" w:themeTint="90" w:sz="4" w:space="0"/>
-          <w:bottom w:val="none"/>
-          <w:right w:val="none"/>
+          <w:bottom w:val="none" w:color="000000" w:sz="4" w:space="0"/>
+          <w:right w:val="none" w:color="000000" w:sz="4" w:space="0"/>
         </w:tcBorders>
       </w:tcPr>
     </w:tblStylePr>
@@ -14722,9 +14946,9 @@
         <w:shd w:val="clear" w:color="ffffff" w:themeColor="light1" w:fill="ffffff" w:themeFill="light1"/>
         <w:tcBorders>
           <w:top w:val="single" w:color="000000" w:themeColor="accent5" w:themeTint="90" w:sz="4" w:space="0"/>
-          <w:left w:val="none"/>
-          <w:bottom w:val="none"/>
-          <w:right w:val="none"/>
+          <w:left w:val="none" w:color="000000" w:sz="4" w:space="0"/>
+          <w:bottom w:val="none" w:color="000000" w:sz="4" w:space="0"/>
+          <w:right w:val="none" w:color="000000" w:sz="4" w:space="0"/>
         </w:tcBorders>
       </w:tcPr>
     </w:tblStylePr>
@@ -14794,9 +15018,9 @@
       </w:tcPr>
     </w:tblStylePr>
   </w:style>
-  <w:style w:type="table" w:styleId="67">
+  <w:style w:type="table" w:styleId="894">
     <w:name w:val="Grid Table 7 Colorful - Accent 6"/>
-    <w:basedOn w:val="830"/>
+    <w:basedOn w:val="1023"/>
     <w:uiPriority w:val="99"/>
     <w:pPr>
       <w:pBdr/>
@@ -14898,11 +15122,11 @@
         <w:tblBorders/>
       </w:tblPr>
       <w:tcPr>
-        <w:shd w:color="ffffff"/>
+        <w:shd w:val="clear" w:color="ffffff"/>
         <w:tcBorders>
-          <w:top w:val="none"/>
-          <w:left w:val="none"/>
-          <w:bottom w:val="none"/>
+          <w:top w:val="none" w:color="000000" w:sz="4" w:space="0"/>
+          <w:left w:val="none" w:color="000000" w:sz="4" w:space="0"/>
+          <w:bottom w:val="none" w:color="000000" w:sz="4" w:space="0"/>
           <w:right w:val="single" w:color="000000" w:themeColor="accent6" w:themeTint="90" w:sz="4" w:space="0"/>
         </w:tcBorders>
       </w:tcPr>
@@ -14925,10 +15149,10 @@
       <w:tcPr>
         <w:shd w:val="clear" w:color="ffffff" w:themeColor="light1" w:fill="ffffff" w:themeFill="light1"/>
         <w:tcBorders>
-          <w:top w:val="none"/>
-          <w:left w:val="none"/>
+          <w:top w:val="none" w:color="000000" w:sz="4" w:space="0"/>
+          <w:left w:val="none" w:color="000000" w:sz="4" w:space="0"/>
           <w:bottom w:val="single" w:color="000000" w:themeColor="accent6" w:themeTint="90" w:sz="4" w:space="0"/>
-          <w:right w:val="none"/>
+          <w:right w:val="none" w:color="000000" w:sz="4" w:space="0"/>
         </w:tcBorders>
       </w:tcPr>
     </w:tblStylePr>
@@ -14948,12 +15172,12 @@
         <w:tblBorders/>
       </w:tblPr>
       <w:tcPr>
-        <w:shd w:color="ffffff"/>
+        <w:shd w:val="clear" w:color="ffffff"/>
         <w:tcBorders>
-          <w:top w:val="none"/>
+          <w:top w:val="none" w:color="000000" w:sz="4" w:space="0"/>
           <w:left w:val="single" w:color="000000" w:themeColor="accent6" w:themeTint="90" w:sz="4" w:space="0"/>
-          <w:bottom w:val="none"/>
-          <w:right w:val="none"/>
+          <w:bottom w:val="none" w:color="000000" w:sz="4" w:space="0"/>
+          <w:right w:val="none" w:color="000000" w:sz="4" w:space="0"/>
         </w:tcBorders>
       </w:tcPr>
     </w:tblStylePr>
@@ -14976,9 +15200,9 @@
         <w:shd w:val="clear" w:color="ffffff" w:themeColor="light1" w:fill="ffffff" w:themeFill="light1"/>
         <w:tcBorders>
           <w:top w:val="single" w:color="000000" w:themeColor="accent6" w:themeTint="90" w:sz="4" w:space="0"/>
-          <w:left w:val="none"/>
-          <w:bottom w:val="none"/>
-          <w:right w:val="none"/>
+          <w:left w:val="none" w:color="000000" w:sz="4" w:space="0"/>
+          <w:bottom w:val="none" w:color="000000" w:sz="4" w:space="0"/>
+          <w:right w:val="none" w:color="000000" w:sz="4" w:space="0"/>
         </w:tcBorders>
       </w:tcPr>
     </w:tblStylePr>
@@ -15048,9 +15272,9 @@
       </w:tcPr>
     </w:tblStylePr>
   </w:style>
-  <w:style w:type="table" w:styleId="68">
+  <w:style w:type="table" w:styleId="895">
     <w:name w:val="List Table 1 Light"/>
-    <w:basedOn w:val="830"/>
+    <w:basedOn w:val="1023"/>
     <w:uiPriority w:val="99"/>
     <w:pPr>
       <w:pBdr/>
@@ -15264,9 +15488,9 @@
       </w:tcPr>
     </w:tblStylePr>
   </w:style>
-  <w:style w:type="table" w:styleId="69">
+  <w:style w:type="table" w:styleId="896">
     <w:name w:val="List Table 1 Light - Accent 1"/>
-    <w:basedOn w:val="830"/>
+    <w:basedOn w:val="1023"/>
     <w:uiPriority w:val="99"/>
     <w:pPr>
       <w:pBdr/>
@@ -15480,9 +15704,9 @@
       </w:tcPr>
     </w:tblStylePr>
   </w:style>
-  <w:style w:type="table" w:styleId="70">
+  <w:style w:type="table" w:styleId="897">
     <w:name w:val="List Table 1 Light - Accent 2"/>
-    <w:basedOn w:val="830"/>
+    <w:basedOn w:val="1023"/>
     <w:uiPriority w:val="99"/>
     <w:pPr>
       <w:pBdr/>
@@ -15696,9 +15920,9 @@
       </w:tcPr>
     </w:tblStylePr>
   </w:style>
-  <w:style w:type="table" w:styleId="71">
+  <w:style w:type="table" w:styleId="898">
     <w:name w:val="List Table 1 Light - Accent 3"/>
-    <w:basedOn w:val="830"/>
+    <w:basedOn w:val="1023"/>
     <w:uiPriority w:val="99"/>
     <w:pPr>
       <w:pBdr/>
@@ -15912,9 +16136,9 @@
       </w:tcPr>
     </w:tblStylePr>
   </w:style>
-  <w:style w:type="table" w:styleId="72">
+  <w:style w:type="table" w:styleId="899">
     <w:name w:val="List Table 1 Light - Accent 4"/>
-    <w:basedOn w:val="830"/>
+    <w:basedOn w:val="1023"/>
     <w:uiPriority w:val="99"/>
     <w:pPr>
       <w:pBdr/>
@@ -16128,9 +16352,9 @@
       </w:tcPr>
     </w:tblStylePr>
   </w:style>
-  <w:style w:type="table" w:styleId="73">
+  <w:style w:type="table" w:styleId="900">
     <w:name w:val="List Table 1 Light - Accent 5"/>
-    <w:basedOn w:val="830"/>
+    <w:basedOn w:val="1023"/>
     <w:uiPriority w:val="99"/>
     <w:pPr>
       <w:pBdr/>
@@ -16344,9 +16568,9 @@
       </w:tcPr>
     </w:tblStylePr>
   </w:style>
-  <w:style w:type="table" w:styleId="74">
+  <w:style w:type="table" w:styleId="901">
     <w:name w:val="List Table 1 Light - Accent 6"/>
-    <w:basedOn w:val="830"/>
+    <w:basedOn w:val="1023"/>
     <w:uiPriority w:val="99"/>
     <w:pPr>
       <w:pBdr/>
@@ -16560,9 +16784,9 @@
       </w:tcPr>
     </w:tblStylePr>
   </w:style>
-  <w:style w:type="table" w:styleId="75">
+  <w:style w:type="table" w:styleId="902">
     <w:name w:val="List Table 2"/>
-    <w:basedOn w:val="830"/>
+    <w:basedOn w:val="1023"/>
     <w:uiPriority w:val="99"/>
     <w:pPr>
       <w:pBdr/>
@@ -16798,9 +17022,9 @@
       </w:tcPr>
     </w:tblStylePr>
   </w:style>
-  <w:style w:type="table" w:styleId="76">
+  <w:style w:type="table" w:styleId="903">
     <w:name w:val="List Table 2 - Accent 1"/>
-    <w:basedOn w:val="830"/>
+    <w:basedOn w:val="1023"/>
     <w:uiPriority w:val="99"/>
     <w:pPr>
       <w:pBdr/>
@@ -17036,9 +17260,9 @@
       </w:tcPr>
     </w:tblStylePr>
   </w:style>
-  <w:style w:type="table" w:styleId="77">
+  <w:style w:type="table" w:styleId="904">
     <w:name w:val="List Table 2 - Accent 2"/>
-    <w:basedOn w:val="830"/>
+    <w:basedOn w:val="1023"/>
     <w:uiPriority w:val="99"/>
     <w:pPr>
       <w:pBdr/>
@@ -17274,9 +17498,9 @@
       </w:tcPr>
     </w:tblStylePr>
   </w:style>
-  <w:style w:type="table" w:styleId="78">
+  <w:style w:type="table" w:styleId="905">
     <w:name w:val="List Table 2 - Accent 3"/>
-    <w:basedOn w:val="830"/>
+    <w:basedOn w:val="1023"/>
     <w:uiPriority w:val="99"/>
     <w:pPr>
       <w:pBdr/>
@@ -17512,9 +17736,9 @@
       </w:tcPr>
     </w:tblStylePr>
   </w:style>
-  <w:style w:type="table" w:styleId="79">
+  <w:style w:type="table" w:styleId="906">
     <w:name w:val="List Table 2 - Accent 4"/>
-    <w:basedOn w:val="830"/>
+    <w:basedOn w:val="1023"/>
     <w:uiPriority w:val="99"/>
     <w:pPr>
       <w:pBdr/>
@@ -17750,9 +17974,9 @@
       </w:tcPr>
     </w:tblStylePr>
   </w:style>
-  <w:style w:type="table" w:styleId="80">
+  <w:style w:type="table" w:styleId="907">
     <w:name w:val="List Table 2 - Accent 5"/>
-    <w:basedOn w:val="830"/>
+    <w:basedOn w:val="1023"/>
     <w:uiPriority w:val="99"/>
     <w:pPr>
       <w:pBdr/>
@@ -17988,9 +18212,9 @@
       </w:tcPr>
     </w:tblStylePr>
   </w:style>
-  <w:style w:type="table" w:styleId="81">
+  <w:style w:type="table" w:styleId="908">
     <w:name w:val="List Table 2 - Accent 6"/>
-    <w:basedOn w:val="830"/>
+    <w:basedOn w:val="1023"/>
     <w:uiPriority w:val="99"/>
     <w:pPr>
       <w:pBdr/>
@@ -18226,9 +18450,9 @@
       </w:tcPr>
     </w:tblStylePr>
   </w:style>
-  <w:style w:type="table" w:styleId="82">
+  <w:style w:type="table" w:styleId="909">
     <w:name w:val="List Table 3"/>
-    <w:basedOn w:val="830"/>
+    <w:basedOn w:val="1023"/>
     <w:uiPriority w:val="99"/>
     <w:pPr>
       <w:pBdr/>
@@ -18454,9 +18678,9 @@
       </w:tcPr>
     </w:tblStylePr>
   </w:style>
-  <w:style w:type="table" w:styleId="83">
+  <w:style w:type="table" w:styleId="910">
     <w:name w:val="List Table 3 - Accent 1"/>
-    <w:basedOn w:val="830"/>
+    <w:basedOn w:val="1023"/>
     <w:uiPriority w:val="99"/>
     <w:pPr>
       <w:pBdr/>
@@ -18682,9 +18906,9 @@
       </w:tcPr>
     </w:tblStylePr>
   </w:style>
-  <w:style w:type="table" w:styleId="84">
+  <w:style w:type="table" w:styleId="911">
     <w:name w:val="List Table 3 - Accent 2"/>
-    <w:basedOn w:val="830"/>
+    <w:basedOn w:val="1023"/>
     <w:uiPriority w:val="99"/>
     <w:pPr>
       <w:pBdr/>
@@ -18910,9 +19134,9 @@
       </w:tcPr>
     </w:tblStylePr>
   </w:style>
-  <w:style w:type="table" w:styleId="85">
+  <w:style w:type="table" w:styleId="912">
     <w:name w:val="List Table 3 - Accent 3"/>
-    <w:basedOn w:val="830"/>
+    <w:basedOn w:val="1023"/>
     <w:uiPriority w:val="99"/>
     <w:pPr>
       <w:pBdr/>
@@ -19138,9 +19362,9 @@
       </w:tcPr>
     </w:tblStylePr>
   </w:style>
-  <w:style w:type="table" w:styleId="86">
+  <w:style w:type="table" w:styleId="913">
     <w:name w:val="List Table 3 - Accent 4"/>
-    <w:basedOn w:val="830"/>
+    <w:basedOn w:val="1023"/>
     <w:uiPriority w:val="99"/>
     <w:pPr>
       <w:pBdr/>
@@ -19366,9 +19590,9 @@
       </w:tcPr>
     </w:tblStylePr>
   </w:style>
-  <w:style w:type="table" w:styleId="87">
+  <w:style w:type="table" w:styleId="914">
     <w:name w:val="List Table 3 - Accent 5"/>
-    <w:basedOn w:val="830"/>
+    <w:basedOn w:val="1023"/>
     <w:uiPriority w:val="99"/>
     <w:pPr>
       <w:pBdr/>
@@ -19594,9 +19818,9 @@
       </w:tcPr>
     </w:tblStylePr>
   </w:style>
-  <w:style w:type="table" w:styleId="88">
+  <w:style w:type="table" w:styleId="915">
     <w:name w:val="List Table 3 - Accent 6"/>
-    <w:basedOn w:val="830"/>
+    <w:basedOn w:val="1023"/>
     <w:uiPriority w:val="99"/>
     <w:pPr>
       <w:pBdr/>
@@ -19822,9 +20046,9 @@
       </w:tcPr>
     </w:tblStylePr>
   </w:style>
-  <w:style w:type="table" w:styleId="89">
+  <w:style w:type="table" w:styleId="916">
     <w:name w:val="List Table 4"/>
-    <w:basedOn w:val="830"/>
+    <w:basedOn w:val="1023"/>
     <w:uiPriority w:val="99"/>
     <w:pPr>
       <w:pBdr/>
@@ -20047,9 +20271,9 @@
       </w:tcPr>
     </w:tblStylePr>
   </w:style>
-  <w:style w:type="table" w:styleId="90">
+  <w:style w:type="table" w:styleId="917">
     <w:name w:val="List Table 4 - Accent 1"/>
-    <w:basedOn w:val="830"/>
+    <w:basedOn w:val="1023"/>
     <w:uiPriority w:val="99"/>
     <w:pPr>
       <w:pBdr/>
@@ -20272,9 +20496,9 @@
       </w:tcPr>
     </w:tblStylePr>
   </w:style>
-  <w:style w:type="table" w:styleId="91">
+  <w:style w:type="table" w:styleId="918">
     <w:name w:val="List Table 4 - Accent 2"/>
-    <w:basedOn w:val="830"/>
+    <w:basedOn w:val="1023"/>
     <w:uiPriority w:val="99"/>
     <w:pPr>
       <w:pBdr/>
@@ -20497,9 +20721,9 @@
       </w:tcPr>
     </w:tblStylePr>
   </w:style>
-  <w:style w:type="table" w:styleId="92">
+  <w:style w:type="table" w:styleId="919">
     <w:name w:val="List Table 4 - Accent 3"/>
-    <w:basedOn w:val="830"/>
+    <w:basedOn w:val="1023"/>
     <w:uiPriority w:val="99"/>
     <w:pPr>
       <w:pBdr/>
@@ -20722,9 +20946,9 @@
       </w:tcPr>
     </w:tblStylePr>
   </w:style>
-  <w:style w:type="table" w:styleId="93">
+  <w:style w:type="table" w:styleId="920">
     <w:name w:val="List Table 4 - Accent 4"/>
-    <w:basedOn w:val="830"/>
+    <w:basedOn w:val="1023"/>
     <w:uiPriority w:val="99"/>
     <w:pPr>
       <w:pBdr/>
@@ -20947,9 +21171,9 @@
       </w:tcPr>
     </w:tblStylePr>
   </w:style>
-  <w:style w:type="table" w:styleId="94">
+  <w:style w:type="table" w:styleId="921">
     <w:name w:val="List Table 4 - Accent 5"/>
-    <w:basedOn w:val="830"/>
+    <w:basedOn w:val="1023"/>
     <w:uiPriority w:val="99"/>
     <w:pPr>
       <w:pBdr/>
@@ -21172,9 +21396,9 @@
       </w:tcPr>
     </w:tblStylePr>
   </w:style>
-  <w:style w:type="table" w:styleId="95">
+  <w:style w:type="table" w:styleId="922">
     <w:name w:val="List Table 4 - Accent 6"/>
-    <w:basedOn w:val="830"/>
+    <w:basedOn w:val="1023"/>
     <w:uiPriority w:val="99"/>
     <w:pPr>
       <w:pBdr/>
@@ -21397,9 +21621,9 @@
       </w:tcPr>
     </w:tblStylePr>
   </w:style>
-  <w:style w:type="table" w:styleId="96">
+  <w:style w:type="table" w:styleId="923">
     <w:name w:val="List Table 5 Dark"/>
-    <w:basedOn w:val="830"/>
+    <w:basedOn w:val="1023"/>
     <w:uiPriority w:val="99"/>
     <w:pPr>
       <w:pBdr/>
@@ -21639,9 +21863,9 @@
       </w:tcPr>
     </w:tblStylePr>
   </w:style>
-  <w:style w:type="table" w:styleId="97">
+  <w:style w:type="table" w:styleId="924">
     <w:name w:val="List Table 5 Dark - Accent 1"/>
-    <w:basedOn w:val="830"/>
+    <w:basedOn w:val="1023"/>
     <w:uiPriority w:val="99"/>
     <w:pPr>
       <w:pBdr/>
@@ -21881,9 +22105,9 @@
       </w:tcPr>
     </w:tblStylePr>
   </w:style>
-  <w:style w:type="table" w:styleId="98">
+  <w:style w:type="table" w:styleId="925">
     <w:name w:val="List Table 5 Dark - Accent 2"/>
-    <w:basedOn w:val="830"/>
+    <w:basedOn w:val="1023"/>
     <w:uiPriority w:val="99"/>
     <w:pPr>
       <w:pBdr/>
@@ -22123,9 +22347,9 @@
       </w:tcPr>
     </w:tblStylePr>
   </w:style>
-  <w:style w:type="table" w:styleId="99">
+  <w:style w:type="table" w:styleId="926">
     <w:name w:val="List Table 5 Dark - Accent 3"/>
-    <w:basedOn w:val="830"/>
+    <w:basedOn w:val="1023"/>
     <w:uiPriority w:val="99"/>
     <w:pPr>
       <w:pBdr/>
@@ -22365,9 +22589,9 @@
       </w:tcPr>
     </w:tblStylePr>
   </w:style>
-  <w:style w:type="table" w:styleId="100">
+  <w:style w:type="table" w:styleId="927">
     <w:name w:val="List Table 5 Dark - Accent 4"/>
-    <w:basedOn w:val="830"/>
+    <w:basedOn w:val="1023"/>
     <w:uiPriority w:val="99"/>
     <w:pPr>
       <w:pBdr/>
@@ -22607,9 +22831,9 @@
       </w:tcPr>
     </w:tblStylePr>
   </w:style>
-  <w:style w:type="table" w:styleId="101">
+  <w:style w:type="table" w:styleId="928">
     <w:name w:val="List Table 5 Dark - Accent 5"/>
-    <w:basedOn w:val="830"/>
+    <w:basedOn w:val="1023"/>
     <w:uiPriority w:val="99"/>
     <w:pPr>
       <w:pBdr/>
@@ -22849,9 +23073,9 @@
       </w:tcPr>
     </w:tblStylePr>
   </w:style>
-  <w:style w:type="table" w:styleId="102">
+  <w:style w:type="table" w:styleId="929">
     <w:name w:val="List Table 5 Dark - Accent 6"/>
-    <w:basedOn w:val="830"/>
+    <w:basedOn w:val="1023"/>
     <w:uiPriority w:val="99"/>
     <w:pPr>
       <w:pBdr/>
@@ -23091,9 +23315,9 @@
       </w:tcPr>
     </w:tblStylePr>
   </w:style>
-  <w:style w:type="table" w:styleId="103">
+  <w:style w:type="table" w:styleId="930">
     <w:name w:val="List Table 6 Colorful"/>
-    <w:basedOn w:val="830"/>
+    <w:basedOn w:val="1023"/>
     <w:uiPriority w:val="99"/>
     <w:pPr>
       <w:pBdr/>
@@ -23314,9 +23538,9 @@
       </w:tcPr>
     </w:tblStylePr>
   </w:style>
-  <w:style w:type="table" w:styleId="104">
+  <w:style w:type="table" w:styleId="931">
     <w:name w:val="List Table 6 Colorful - Accent 1"/>
-    <w:basedOn w:val="830"/>
+    <w:basedOn w:val="1023"/>
     <w:uiPriority w:val="99"/>
     <w:pPr>
       <w:pBdr/>
@@ -23537,9 +23761,9 @@
       </w:tcPr>
     </w:tblStylePr>
   </w:style>
-  <w:style w:type="table" w:styleId="105">
+  <w:style w:type="table" w:styleId="932">
     <w:name w:val="List Table 6 Colorful - Accent 2"/>
-    <w:basedOn w:val="830"/>
+    <w:basedOn w:val="1023"/>
     <w:uiPriority w:val="99"/>
     <w:pPr>
       <w:pBdr/>
@@ -23760,9 +23984,9 @@
       </w:tcPr>
     </w:tblStylePr>
   </w:style>
-  <w:style w:type="table" w:styleId="106">
+  <w:style w:type="table" w:styleId="933">
     <w:name w:val="List Table 6 Colorful - Accent 3"/>
-    <w:basedOn w:val="830"/>
+    <w:basedOn w:val="1023"/>
     <w:uiPriority w:val="99"/>
     <w:pPr>
       <w:pBdr/>
@@ -23983,9 +24207,9 @@
       </w:tcPr>
     </w:tblStylePr>
   </w:style>
-  <w:style w:type="table" w:styleId="107">
+  <w:style w:type="table" w:styleId="934">
     <w:name w:val="List Table 6 Colorful - Accent 4"/>
-    <w:basedOn w:val="830"/>
+    <w:basedOn w:val="1023"/>
     <w:uiPriority w:val="99"/>
     <w:pPr>
       <w:pBdr/>
@@ -24206,9 +24430,9 @@
       </w:tcPr>
     </w:tblStylePr>
   </w:style>
-  <w:style w:type="table" w:styleId="108">
+  <w:style w:type="table" w:styleId="935">
     <w:name w:val="List Table 6 Colorful - Accent 5"/>
-    <w:basedOn w:val="830"/>
+    <w:basedOn w:val="1023"/>
     <w:uiPriority w:val="99"/>
     <w:pPr>
       <w:pBdr/>
@@ -24429,9 +24653,9 @@
       </w:tcPr>
     </w:tblStylePr>
   </w:style>
-  <w:style w:type="table" w:styleId="109">
+  <w:style w:type="table" w:styleId="936">
     <w:name w:val="List Table 6 Colorful - Accent 6"/>
-    <w:basedOn w:val="830"/>
+    <w:basedOn w:val="1023"/>
     <w:uiPriority w:val="99"/>
     <w:pPr>
       <w:pBdr/>
@@ -24652,9 +24876,9 @@
       </w:tcPr>
     </w:tblStylePr>
   </w:style>
-  <w:style w:type="table" w:styleId="110">
+  <w:style w:type="table" w:styleId="937">
     <w:name w:val="List Table 7 Colorful"/>
-    <w:basedOn w:val="830"/>
+    <w:basedOn w:val="1023"/>
     <w:uiPriority w:val="99"/>
     <w:pPr>
       <w:pBdr/>
@@ -24753,11 +24977,11 @@
         <w:tblBorders/>
       </w:tblPr>
       <w:tcPr>
-        <w:shd w:color="ffffff"/>
+        <w:shd w:val="clear" w:color="ffffff"/>
         <w:tcBorders>
-          <w:top w:val="none"/>
-          <w:left w:val="none"/>
-          <w:bottom w:val="none"/>
+          <w:top w:val="none" w:color="000000" w:sz="4" w:space="0"/>
+          <w:left w:val="none" w:color="000000" w:sz="4" w:space="0"/>
+          <w:bottom w:val="none" w:color="000000" w:sz="4" w:space="0"/>
           <w:right w:val="single" w:color="000000" w:themeColor="text1" w:themeTint="80" w:sz="4" w:space="0"/>
         </w:tcBorders>
       </w:tcPr>
@@ -24780,10 +25004,10 @@
       <w:tcPr>
         <w:shd w:val="clear" w:color="ffffff" w:themeColor="light1" w:fill="ffffff" w:themeFill="light1"/>
         <w:tcBorders>
-          <w:top w:val="none"/>
-          <w:left w:val="none"/>
+          <w:top w:val="none" w:color="000000" w:sz="4" w:space="0"/>
+          <w:left w:val="none" w:color="000000" w:sz="4" w:space="0"/>
           <w:bottom w:val="single" w:color="000000" w:themeColor="text1" w:themeTint="80" w:sz="4" w:space="0"/>
-          <w:right w:val="none"/>
+          <w:right w:val="none" w:color="000000" w:sz="4" w:space="0"/>
         </w:tcBorders>
       </w:tcPr>
     </w:tblStylePr>
@@ -24803,12 +25027,12 @@
         <w:tblBorders/>
       </w:tblPr>
       <w:tcPr>
-        <w:shd w:color="ffffff"/>
+        <w:shd w:val="clear" w:color="ffffff"/>
         <w:tcBorders>
-          <w:top w:val="none"/>
+          <w:top w:val="none" w:color="000000" w:sz="4" w:space="0"/>
           <w:left w:val="single" w:color="000000" w:themeColor="text1" w:themeTint="80" w:sz="4" w:space="0"/>
-          <w:bottom w:val="none"/>
-          <w:right w:val="none"/>
+          <w:bottom w:val="none" w:color="000000" w:sz="4" w:space="0"/>
+          <w:right w:val="none" w:color="000000" w:sz="4" w:space="0"/>
         </w:tcBorders>
       </w:tcPr>
     </w:tblStylePr>
@@ -24831,9 +25055,9 @@
         <w:shd w:val="clear" w:color="ffffff" w:themeColor="light1" w:fill="ffffff" w:themeFill="light1"/>
         <w:tcBorders>
           <w:top w:val="single" w:color="000000" w:themeColor="text1" w:themeTint="80" w:sz="4" w:space="0"/>
-          <w:left w:val="none"/>
-          <w:bottom w:val="none"/>
-          <w:right w:val="none"/>
+          <w:left w:val="none" w:color="000000" w:sz="4" w:space="0"/>
+          <w:bottom w:val="none" w:color="000000" w:sz="4" w:space="0"/>
+          <w:right w:val="none" w:color="000000" w:sz="4" w:space="0"/>
         </w:tcBorders>
       </w:tcPr>
     </w:tblStylePr>
@@ -24908,9 +25132,9 @@
       </w:tcPr>
     </w:tblStylePr>
   </w:style>
-  <w:style w:type="table" w:styleId="111">
+  <w:style w:type="table" w:styleId="938">
     <w:name w:val="List Table 7 Colorful - Accent 1"/>
-    <w:basedOn w:val="830"/>
+    <w:basedOn w:val="1023"/>
     <w:uiPriority w:val="99"/>
     <w:pPr>
       <w:pBdr/>
@@ -25009,11 +25233,11 @@
         <w:tblBorders/>
       </w:tblPr>
       <w:tcPr>
-        <w:shd w:color="ffffff"/>
+        <w:shd w:val="clear" w:color="ffffff"/>
         <w:tcBorders>
-          <w:top w:val="none"/>
-          <w:left w:val="none"/>
-          <w:bottom w:val="none"/>
+          <w:top w:val="none" w:color="000000" w:sz="4" w:space="0"/>
+          <w:left w:val="none" w:color="000000" w:sz="4" w:space="0"/>
+          <w:bottom w:val="none" w:color="000000" w:sz="4" w:space="0"/>
           <w:right w:val="single" w:color="000000" w:themeColor="accent1" w:sz="4" w:space="0"/>
         </w:tcBorders>
       </w:tcPr>
@@ -25036,10 +25260,10 @@
       <w:tcPr>
         <w:shd w:val="clear" w:color="ffffff" w:themeColor="light1" w:fill="ffffff" w:themeFill="light1"/>
         <w:tcBorders>
-          <w:top w:val="none"/>
-          <w:left w:val="none"/>
+          <w:top w:val="none" w:color="000000" w:sz="4" w:space="0"/>
+          <w:left w:val="none" w:color="000000" w:sz="4" w:space="0"/>
           <w:bottom w:val="single" w:color="000000" w:themeColor="accent1" w:sz="4" w:space="0"/>
-          <w:right w:val="none"/>
+          <w:right w:val="none" w:color="000000" w:sz="4" w:space="0"/>
         </w:tcBorders>
       </w:tcPr>
     </w:tblStylePr>
@@ -25059,12 +25283,12 @@
         <w:tblBorders/>
       </w:tblPr>
       <w:tcPr>
-        <w:shd w:color="ffffff"/>
+        <w:shd w:val="clear" w:color="ffffff"/>
         <w:tcBorders>
-          <w:top w:val="none"/>
+          <w:top w:val="none" w:color="000000" w:sz="4" w:space="0"/>
           <w:left w:val="single" w:color="000000" w:themeColor="accent1" w:sz="4" w:space="0"/>
-          <w:bottom w:val="none"/>
-          <w:right w:val="none"/>
+          <w:bottom w:val="none" w:color="000000" w:sz="4" w:space="0"/>
+          <w:right w:val="none" w:color="000000" w:sz="4" w:space="0"/>
         </w:tcBorders>
       </w:tcPr>
     </w:tblStylePr>
@@ -25087,9 +25311,9 @@
         <w:shd w:val="clear" w:color="ffffff" w:themeColor="light1" w:fill="ffffff" w:themeFill="light1"/>
         <w:tcBorders>
           <w:top w:val="single" w:color="000000" w:themeColor="accent1" w:sz="4" w:space="0"/>
-          <w:left w:val="none"/>
-          <w:bottom w:val="none"/>
-          <w:right w:val="none"/>
+          <w:left w:val="none" w:color="000000" w:sz="4" w:space="0"/>
+          <w:bottom w:val="none" w:color="000000" w:sz="4" w:space="0"/>
+          <w:right w:val="none" w:color="000000" w:sz="4" w:space="0"/>
         </w:tcBorders>
       </w:tcPr>
     </w:tblStylePr>
@@ -25164,9 +25388,9 @@
       </w:tcPr>
     </w:tblStylePr>
   </w:style>
-  <w:style w:type="table" w:styleId="112">
+  <w:style w:type="table" w:styleId="939">
     <w:name w:val="List Table 7 Colorful - Accent 2"/>
-    <w:basedOn w:val="830"/>
+    <w:basedOn w:val="1023"/>
     <w:uiPriority w:val="99"/>
     <w:pPr>
       <w:pBdr/>
@@ -25265,11 +25489,11 @@
         <w:tblBorders/>
       </w:tblPr>
       <w:tcPr>
-        <w:shd w:color="ffffff"/>
+        <w:shd w:val="clear" w:color="ffffff"/>
         <w:tcBorders>
-          <w:top w:val="none"/>
-          <w:left w:val="none"/>
-          <w:bottom w:val="none"/>
+          <w:top w:val="none" w:color="000000" w:sz="4" w:space="0"/>
+          <w:left w:val="none" w:color="000000" w:sz="4" w:space="0"/>
+          <w:bottom w:val="none" w:color="000000" w:sz="4" w:space="0"/>
           <w:right w:val="single" w:color="000000" w:themeColor="accent2" w:themeTint="97" w:sz="4" w:space="0"/>
         </w:tcBorders>
       </w:tcPr>
@@ -25292,10 +25516,10 @@
       <w:tcPr>
         <w:shd w:val="clear" w:color="ffffff" w:themeColor="light1" w:fill="ffffff" w:themeFill="light1"/>
         <w:tcBorders>
-          <w:top w:val="none"/>
-          <w:left w:val="none"/>
+          <w:top w:val="none" w:color="000000" w:sz="4" w:space="0"/>
+          <w:left w:val="none" w:color="000000" w:sz="4" w:space="0"/>
           <w:bottom w:val="single" w:color="000000" w:themeColor="accent2" w:themeTint="97" w:sz="4" w:space="0"/>
-          <w:right w:val="none"/>
+          <w:right w:val="none" w:color="000000" w:sz="4" w:space="0"/>
         </w:tcBorders>
       </w:tcPr>
     </w:tblStylePr>
@@ -25315,12 +25539,12 @@
         <w:tblBorders/>
       </w:tblPr>
       <w:tcPr>
-        <w:shd w:color="ffffff"/>
+        <w:shd w:val="clear" w:color="ffffff"/>
         <w:tcBorders>
-          <w:top w:val="none"/>
+          <w:top w:val="none" w:color="000000" w:sz="4" w:space="0"/>
           <w:left w:val="single" w:color="000000" w:themeColor="accent2" w:themeTint="97" w:sz="4" w:space="0"/>
-          <w:bottom w:val="none"/>
-          <w:right w:val="none"/>
+          <w:bottom w:val="none" w:color="000000" w:sz="4" w:space="0"/>
+          <w:right w:val="none" w:color="000000" w:sz="4" w:space="0"/>
         </w:tcBorders>
       </w:tcPr>
     </w:tblStylePr>
@@ -25343,9 +25567,9 @@
         <w:shd w:val="clear" w:color="ffffff" w:themeColor="light1" w:fill="ffffff" w:themeFill="light1"/>
         <w:tcBorders>
           <w:top w:val="single" w:color="000000" w:themeColor="accent2" w:themeTint="97" w:sz="4" w:space="0"/>
-          <w:left w:val="none"/>
-          <w:bottom w:val="none"/>
-          <w:right w:val="none"/>
+          <w:left w:val="none" w:color="000000" w:sz="4" w:space="0"/>
+          <w:bottom w:val="none" w:color="000000" w:sz="4" w:space="0"/>
+          <w:right w:val="none" w:color="000000" w:sz="4" w:space="0"/>
         </w:tcBorders>
       </w:tcPr>
     </w:tblStylePr>
@@ -25420,9 +25644,9 @@
       </w:tcPr>
     </w:tblStylePr>
   </w:style>
-  <w:style w:type="table" w:styleId="113">
+  <w:style w:type="table" w:styleId="940">
     <w:name w:val="List Table 7 Colorful - Accent 3"/>
-    <w:basedOn w:val="830"/>
+    <w:basedOn w:val="1023"/>
     <w:uiPriority w:val="99"/>
     <w:pPr>
       <w:pBdr/>
@@ -25521,11 +25745,11 @@
         <w:tblBorders/>
       </w:tblPr>
       <w:tcPr>
-        <w:shd w:color="ffffff"/>
+        <w:shd w:val="clear" w:color="ffffff"/>
         <w:tcBorders>
-          <w:top w:val="none"/>
-          <w:left w:val="none"/>
-          <w:bottom w:val="none"/>
+          <w:top w:val="none" w:color="000000" w:sz="4" w:space="0"/>
+          <w:left w:val="none" w:color="000000" w:sz="4" w:space="0"/>
+          <w:bottom w:val="none" w:color="000000" w:sz="4" w:space="0"/>
           <w:right w:val="single" w:color="000000" w:themeColor="accent3" w:themeTint="98" w:sz="4" w:space="0"/>
         </w:tcBorders>
       </w:tcPr>
@@ -25548,10 +25772,10 @@
       <w:tcPr>
         <w:shd w:val="clear" w:color="ffffff" w:themeColor="light1" w:fill="ffffff" w:themeFill="light1"/>
         <w:tcBorders>
-          <w:top w:val="none"/>
-          <w:left w:val="none"/>
+          <w:top w:val="none" w:color="000000" w:sz="4" w:space="0"/>
+          <w:left w:val="none" w:color="000000" w:sz="4" w:space="0"/>
           <w:bottom w:val="single" w:color="000000" w:themeColor="accent3" w:themeTint="98" w:sz="4" w:space="0"/>
-          <w:right w:val="none"/>
+          <w:right w:val="none" w:color="000000" w:sz="4" w:space="0"/>
         </w:tcBorders>
       </w:tcPr>
     </w:tblStylePr>
@@ -25571,12 +25795,12 @@
         <w:tblBorders/>
       </w:tblPr>
       <w:tcPr>
-        <w:shd w:color="ffffff"/>
+        <w:shd w:val="clear" w:color="ffffff"/>
         <w:tcBorders>
-          <w:top w:val="none"/>
+          <w:top w:val="none" w:color="000000" w:sz="4" w:space="0"/>
           <w:left w:val="single" w:color="000000" w:themeColor="accent3" w:themeTint="98" w:sz="4" w:space="0"/>
-          <w:bottom w:val="none"/>
-          <w:right w:val="none"/>
+          <w:bottom w:val="none" w:color="000000" w:sz="4" w:space="0"/>
+          <w:right w:val="none" w:color="000000" w:sz="4" w:space="0"/>
         </w:tcBorders>
       </w:tcPr>
     </w:tblStylePr>
@@ -25599,9 +25823,9 @@
         <w:shd w:val="clear" w:color="ffffff" w:themeColor="light1" w:fill="ffffff" w:themeFill="light1"/>
         <w:tcBorders>
           <w:top w:val="single" w:color="000000" w:themeColor="accent3" w:themeTint="98" w:sz="4" w:space="0"/>
-          <w:left w:val="none"/>
-          <w:bottom w:val="none"/>
-          <w:right w:val="none"/>
+          <w:left w:val="none" w:color="000000" w:sz="4" w:space="0"/>
+          <w:bottom w:val="none" w:color="000000" w:sz="4" w:space="0"/>
+          <w:right w:val="none" w:color="000000" w:sz="4" w:space="0"/>
         </w:tcBorders>
       </w:tcPr>
     </w:tblStylePr>
@@ -25676,9 +25900,9 @@
       </w:tcPr>
     </w:tblStylePr>
   </w:style>
-  <w:style w:type="table" w:styleId="114">
+  <w:style w:type="table" w:styleId="941">
     <w:name w:val="List Table 7 Colorful - Accent 4"/>
-    <w:basedOn w:val="830"/>
+    <w:basedOn w:val="1023"/>
     <w:uiPriority w:val="99"/>
     <w:pPr>
       <w:pBdr/>
@@ -25777,11 +26001,11 @@
         <w:tblBorders/>
       </w:tblPr>
       <w:tcPr>
-        <w:shd w:color="ffffff"/>
+        <w:shd w:val="clear" w:color="ffffff"/>
         <w:tcBorders>
-          <w:top w:val="none"/>
-          <w:left w:val="none"/>
-          <w:bottom w:val="none"/>
+          <w:top w:val="none" w:color="000000" w:sz="4" w:space="0"/>
+          <w:left w:val="none" w:color="000000" w:sz="4" w:space="0"/>
+          <w:bottom w:val="none" w:color="000000" w:sz="4" w:space="0"/>
           <w:right w:val="single" w:color="000000" w:themeColor="accent4" w:themeTint="9A" w:sz="4" w:space="0"/>
         </w:tcBorders>
       </w:tcPr>
@@ -25804,10 +26028,10 @@
       <w:tcPr>
         <w:shd w:val="clear" w:color="ffffff" w:themeColor="light1" w:fill="ffffff" w:themeFill="light1"/>
         <w:tcBorders>
-          <w:top w:val="none"/>
-          <w:left w:val="none"/>
+          <w:top w:val="none" w:color="000000" w:sz="4" w:space="0"/>
+          <w:left w:val="none" w:color="000000" w:sz="4" w:space="0"/>
           <w:bottom w:val="single" w:color="000000" w:themeColor="accent4" w:themeTint="9A" w:sz="4" w:space="0"/>
-          <w:right w:val="none"/>
+          <w:right w:val="none" w:color="000000" w:sz="4" w:space="0"/>
         </w:tcBorders>
       </w:tcPr>
     </w:tblStylePr>
@@ -25827,12 +26051,12 @@
         <w:tblBorders/>
       </w:tblPr>
       <w:tcPr>
-        <w:shd w:color="ffffff"/>
+        <w:shd w:val="clear" w:color="ffffff"/>
         <w:tcBorders>
-          <w:top w:val="none"/>
+          <w:top w:val="none" w:color="000000" w:sz="4" w:space="0"/>
           <w:left w:val="single" w:color="000000" w:themeColor="accent4" w:themeTint="9A" w:sz="4" w:space="0"/>
-          <w:bottom w:val="none"/>
-          <w:right w:val="none"/>
+          <w:bottom w:val="none" w:color="000000" w:sz="4" w:space="0"/>
+          <w:right w:val="none" w:color="000000" w:sz="4" w:space="0"/>
         </w:tcBorders>
       </w:tcPr>
     </w:tblStylePr>
@@ -25855,9 +26079,9 @@
         <w:shd w:val="clear" w:color="ffffff" w:themeColor="light1" w:fill="ffffff" w:themeFill="light1"/>
         <w:tcBorders>
           <w:top w:val="single" w:color="000000" w:themeColor="accent4" w:themeTint="9A" w:sz="4" w:space="0"/>
-          <w:left w:val="none"/>
-          <w:bottom w:val="none"/>
-          <w:right w:val="none"/>
+          <w:left w:val="none" w:color="000000" w:sz="4" w:space="0"/>
+          <w:bottom w:val="none" w:color="000000" w:sz="4" w:space="0"/>
+          <w:right w:val="none" w:color="000000" w:sz="4" w:space="0"/>
         </w:tcBorders>
       </w:tcPr>
     </w:tblStylePr>
@@ -25932,9 +26156,9 @@
       </w:tcPr>
     </w:tblStylePr>
   </w:style>
-  <w:style w:type="table" w:styleId="115">
+  <w:style w:type="table" w:styleId="942">
     <w:name w:val="List Table 7 Colorful - Accent 5"/>
-    <w:basedOn w:val="830"/>
+    <w:basedOn w:val="1023"/>
     <w:uiPriority w:val="99"/>
     <w:pPr>
       <w:pBdr/>
@@ -26033,11 +26257,11 @@
         <w:tblBorders/>
       </w:tblPr>
       <w:tcPr>
-        <w:shd w:color="ffffff"/>
+        <w:shd w:val="clear" w:color="ffffff"/>
         <w:tcBorders>
-          <w:top w:val="none"/>
-          <w:left w:val="none"/>
-          <w:bottom w:val="none"/>
+          <w:top w:val="none" w:color="000000" w:sz="4" w:space="0"/>
+          <w:left w:val="none" w:color="000000" w:sz="4" w:space="0"/>
+          <w:bottom w:val="none" w:color="000000" w:sz="4" w:space="0"/>
           <w:right w:val="single" w:color="000000" w:themeColor="accent5" w:themeTint="9A" w:sz="4" w:space="0"/>
         </w:tcBorders>
       </w:tcPr>
@@ -26060,10 +26284,10 @@
       <w:tcPr>
         <w:shd w:val="clear" w:color="ffffff" w:themeColor="light1" w:fill="ffffff" w:themeFill="light1"/>
         <w:tcBorders>
-          <w:top w:val="none"/>
-          <w:left w:val="none"/>
+          <w:top w:val="none" w:color="000000" w:sz="4" w:space="0"/>
+          <w:left w:val="none" w:color="000000" w:sz="4" w:space="0"/>
           <w:bottom w:val="single" w:color="000000" w:themeColor="accent5" w:themeTint="9A" w:sz="4" w:space="0"/>
-          <w:right w:val="none"/>
+          <w:right w:val="none" w:color="000000" w:sz="4" w:space="0"/>
         </w:tcBorders>
       </w:tcPr>
     </w:tblStylePr>
@@ -26083,12 +26307,12 @@
         <w:tblBorders/>
       </w:tblPr>
       <w:tcPr>
-        <w:shd w:color="ffffff"/>
+        <w:shd w:val="clear" w:color="ffffff"/>
         <w:tcBorders>
-          <w:top w:val="none"/>
+          <w:top w:val="none" w:color="000000" w:sz="4" w:space="0"/>
           <w:left w:val="single" w:color="000000" w:themeColor="accent5" w:themeTint="9A" w:sz="4" w:space="0"/>
-          <w:bottom w:val="none"/>
-          <w:right w:val="none"/>
+          <w:bottom w:val="none" w:color="000000" w:sz="4" w:space="0"/>
+          <w:right w:val="none" w:color="000000" w:sz="4" w:space="0"/>
         </w:tcBorders>
       </w:tcPr>
     </w:tblStylePr>
@@ -26111,9 +26335,9 @@
         <w:shd w:val="clear" w:color="ffffff" w:themeColor="light1" w:fill="ffffff" w:themeFill="light1"/>
         <w:tcBorders>
           <w:top w:val="single" w:color="000000" w:themeColor="accent5" w:themeTint="9A" w:sz="4" w:space="0"/>
-          <w:left w:val="none"/>
-          <w:bottom w:val="none"/>
-          <w:right w:val="none"/>
+          <w:left w:val="none" w:color="000000" w:sz="4" w:space="0"/>
+          <w:bottom w:val="none" w:color="000000" w:sz="4" w:space="0"/>
+          <w:right w:val="none" w:color="000000" w:sz="4" w:space="0"/>
         </w:tcBorders>
       </w:tcPr>
     </w:tblStylePr>
@@ -26188,9 +26412,9 @@
       </w:tcPr>
     </w:tblStylePr>
   </w:style>
-  <w:style w:type="table" w:styleId="116">
+  <w:style w:type="table" w:styleId="943">
     <w:name w:val="List Table 7 Colorful - Accent 6"/>
-    <w:basedOn w:val="830"/>
+    <w:basedOn w:val="1023"/>
     <w:uiPriority w:val="99"/>
     <w:pPr>
       <w:pBdr/>
@@ -26289,11 +26513,11 @@
         <w:tblBorders/>
       </w:tblPr>
       <w:tcPr>
-        <w:shd w:color="ffffff"/>
+        <w:shd w:val="clear" w:color="ffffff"/>
         <w:tcBorders>
-          <w:top w:val="none"/>
-          <w:left w:val="none"/>
-          <w:bottom w:val="none"/>
+          <w:top w:val="none" w:color="000000" w:sz="4" w:space="0"/>
+          <w:left w:val="none" w:color="000000" w:sz="4" w:space="0"/>
+          <w:bottom w:val="none" w:color="000000" w:sz="4" w:space="0"/>
           <w:right w:val="single" w:color="000000" w:themeColor="accent6" w:themeTint="98" w:sz="4" w:space="0"/>
         </w:tcBorders>
       </w:tcPr>
@@ -26316,10 +26540,10 @@
       <w:tcPr>
         <w:shd w:val="clear" w:color="ffffff" w:themeColor="light1" w:fill="ffffff" w:themeFill="light1"/>
         <w:tcBorders>
-          <w:top w:val="none"/>
-          <w:left w:val="none"/>
+          <w:top w:val="none" w:color="000000" w:sz="4" w:space="0"/>
+          <w:left w:val="none" w:color="000000" w:sz="4" w:space="0"/>
           <w:bottom w:val="single" w:color="000000" w:themeColor="accent6" w:themeTint="98" w:sz="4" w:space="0"/>
-          <w:right w:val="none"/>
+          <w:right w:val="none" w:color="000000" w:sz="4" w:space="0"/>
         </w:tcBorders>
       </w:tcPr>
     </w:tblStylePr>
@@ -26339,12 +26563,12 @@
         <w:tblBorders/>
       </w:tblPr>
       <w:tcPr>
-        <w:shd w:color="ffffff"/>
+        <w:shd w:val="clear" w:color="ffffff"/>
         <w:tcBorders>
-          <w:top w:val="none"/>
+          <w:top w:val="none" w:color="000000" w:sz="4" w:space="0"/>
           <w:left w:val="single" w:color="000000" w:themeColor="accent6" w:themeTint="98" w:sz="4" w:space="0"/>
-          <w:bottom w:val="none"/>
-          <w:right w:val="none"/>
+          <w:bottom w:val="none" w:color="000000" w:sz="4" w:space="0"/>
+          <w:right w:val="none" w:color="000000" w:sz="4" w:space="0"/>
         </w:tcBorders>
       </w:tcPr>
     </w:tblStylePr>
@@ -26367,9 +26591,9 @@
         <w:shd w:val="clear" w:color="ffffff" w:themeColor="light1" w:fill="ffffff" w:themeFill="light1"/>
         <w:tcBorders>
           <w:top w:val="single" w:color="000000" w:themeColor="accent6" w:themeTint="98" w:sz="4" w:space="0"/>
-          <w:left w:val="none"/>
-          <w:bottom w:val="none"/>
-          <w:right w:val="none"/>
+          <w:left w:val="none" w:color="000000" w:sz="4" w:space="0"/>
+          <w:bottom w:val="none" w:color="000000" w:sz="4" w:space="0"/>
+          <w:right w:val="none" w:color="000000" w:sz="4" w:space="0"/>
         </w:tcBorders>
       </w:tcPr>
     </w:tblStylePr>
@@ -26444,9 +26668,9 @@
       </w:tcPr>
     </w:tblStylePr>
   </w:style>
-  <w:style w:type="table" w:styleId="117">
+  <w:style w:type="table" w:styleId="944">
     <w:name w:val="Lined - Accent"/>
-    <w:basedOn w:val="830"/>
+    <w:basedOn w:val="1023"/>
     <w:uiPriority w:val="99"/>
     <w:pPr>
       <w:pBdr/>
@@ -26681,9 +26905,9 @@
       </w:tcPr>
     </w:tblStylePr>
   </w:style>
-  <w:style w:type="table" w:styleId="118">
+  <w:style w:type="table" w:styleId="945">
     <w:name w:val="Lined - Accent 1"/>
-    <w:basedOn w:val="830"/>
+    <w:basedOn w:val="1023"/>
     <w:uiPriority w:val="99"/>
     <w:pPr>
       <w:pBdr/>
@@ -26918,9 +27142,9 @@
       </w:tcPr>
     </w:tblStylePr>
   </w:style>
-  <w:style w:type="table" w:styleId="119">
+  <w:style w:type="table" w:styleId="946">
     <w:name w:val="Lined - Accent 2"/>
-    <w:basedOn w:val="830"/>
+    <w:basedOn w:val="1023"/>
     <w:uiPriority w:val="99"/>
     <w:pPr>
       <w:pBdr/>
@@ -27155,9 +27379,9 @@
       </w:tcPr>
     </w:tblStylePr>
   </w:style>
-  <w:style w:type="table" w:styleId="120">
+  <w:style w:type="table" w:styleId="947">
     <w:name w:val="Lined - Accent 3"/>
-    <w:basedOn w:val="830"/>
+    <w:basedOn w:val="1023"/>
     <w:uiPriority w:val="99"/>
     <w:pPr>
       <w:pBdr/>
@@ -27392,9 +27616,9 @@
       </w:tcPr>
     </w:tblStylePr>
   </w:style>
-  <w:style w:type="table" w:styleId="121">
+  <w:style w:type="table" w:styleId="948">
     <w:name w:val="Lined - Accent 4"/>
-    <w:basedOn w:val="830"/>
+    <w:basedOn w:val="1023"/>
     <w:uiPriority w:val="99"/>
     <w:pPr>
       <w:pBdr/>
@@ -27629,9 +27853,9 @@
       </w:tcPr>
     </w:tblStylePr>
   </w:style>
-  <w:style w:type="table" w:styleId="122">
+  <w:style w:type="table" w:styleId="949">
     <w:name w:val="Lined - Accent 5"/>
-    <w:basedOn w:val="830"/>
+    <w:basedOn w:val="1023"/>
     <w:uiPriority w:val="99"/>
     <w:pPr>
       <w:pBdr/>
@@ -27866,9 +28090,9 @@
       </w:tcPr>
     </w:tblStylePr>
   </w:style>
-  <w:style w:type="table" w:styleId="123">
+  <w:style w:type="table" w:styleId="950">
     <w:name w:val="Lined - Accent 6"/>
-    <w:basedOn w:val="830"/>
+    <w:basedOn w:val="1023"/>
     <w:uiPriority w:val="99"/>
     <w:pPr>
       <w:pBdr/>
@@ -28103,9 +28327,9 @@
       </w:tcPr>
     </w:tblStylePr>
   </w:style>
-  <w:style w:type="table" w:styleId="124">
+  <w:style w:type="table" w:styleId="951">
     <w:name w:val="Bordered &amp; Lined - Accent"/>
-    <w:basedOn w:val="830"/>
+    <w:basedOn w:val="1023"/>
     <w:uiPriority w:val="99"/>
     <w:pPr>
       <w:pBdr/>
@@ -28347,9 +28571,9 @@
       </w:tcPr>
     </w:tblStylePr>
   </w:style>
-  <w:style w:type="table" w:styleId="125">
+  <w:style w:type="table" w:styleId="952">
     <w:name w:val="Bordered &amp; Lined - Accent 1"/>
-    <w:basedOn w:val="830"/>
+    <w:basedOn w:val="1023"/>
     <w:uiPriority w:val="99"/>
     <w:pPr>
       <w:pBdr/>
@@ -28591,9 +28815,9 @@
       </w:tcPr>
     </w:tblStylePr>
   </w:style>
-  <w:style w:type="table" w:styleId="126">
+  <w:style w:type="table" w:styleId="953">
     <w:name w:val="Bordered &amp; Lined - Accent 2"/>
-    <w:basedOn w:val="830"/>
+    <w:basedOn w:val="1023"/>
     <w:uiPriority w:val="99"/>
     <w:pPr>
       <w:pBdr/>
@@ -28835,9 +29059,9 @@
       </w:tcPr>
     </w:tblStylePr>
   </w:style>
-  <w:style w:type="table" w:styleId="127">
+  <w:style w:type="table" w:styleId="954">
     <w:name w:val="Bordered &amp; Lined - Accent 3"/>
-    <w:basedOn w:val="830"/>
+    <w:basedOn w:val="1023"/>
     <w:uiPriority w:val="99"/>
     <w:pPr>
       <w:pBdr/>
@@ -29079,9 +29303,9 @@
       </w:tcPr>
     </w:tblStylePr>
   </w:style>
-  <w:style w:type="table" w:styleId="128">
+  <w:style w:type="table" w:styleId="955">
     <w:name w:val="Bordered &amp; Lined - Accent 4"/>
-    <w:basedOn w:val="830"/>
+    <w:basedOn w:val="1023"/>
     <w:uiPriority w:val="99"/>
     <w:pPr>
       <w:pBdr/>
@@ -29323,9 +29547,9 @@
       </w:tcPr>
     </w:tblStylePr>
   </w:style>
-  <w:style w:type="table" w:styleId="129">
+  <w:style w:type="table" w:styleId="956">
     <w:name w:val="Bordered &amp; Lined - Accent 5"/>
-    <w:basedOn w:val="830"/>
+    <w:basedOn w:val="1023"/>
     <w:uiPriority w:val="99"/>
     <w:pPr>
       <w:pBdr/>
@@ -29567,9 +29791,9 @@
       </w:tcPr>
     </w:tblStylePr>
   </w:style>
-  <w:style w:type="table" w:styleId="130">
+  <w:style w:type="table" w:styleId="957">
     <w:name w:val="Bordered &amp; Lined - Accent 6"/>
-    <w:basedOn w:val="830"/>
+    <w:basedOn w:val="1023"/>
     <w:uiPriority w:val="99"/>
     <w:pPr>
       <w:pBdr/>
@@ -29811,9 +30035,9 @@
       </w:tcPr>
     </w:tblStylePr>
   </w:style>
-  <w:style w:type="table" w:styleId="131">
+  <w:style w:type="table" w:styleId="958">
     <w:name w:val="Bordered"/>
-    <w:basedOn w:val="830"/>
+    <w:basedOn w:val="1023"/>
     <w:uiPriority w:val="99"/>
     <w:pPr>
       <w:pBdr/>
@@ -30042,9 +30266,9 @@
       </w:tcPr>
     </w:tblStylePr>
   </w:style>
-  <w:style w:type="table" w:styleId="132">
+  <w:style w:type="table" w:styleId="959">
     <w:name w:val="Bordered - Accent 1"/>
-    <w:basedOn w:val="830"/>
+    <w:basedOn w:val="1023"/>
     <w:uiPriority w:val="99"/>
     <w:pPr>
       <w:pBdr/>
@@ -30273,9 +30497,9 @@
       </w:tcPr>
     </w:tblStylePr>
   </w:style>
-  <w:style w:type="table" w:styleId="133">
+  <w:style w:type="table" w:styleId="960">
     <w:name w:val="Bordered - Accent 2"/>
-    <w:basedOn w:val="830"/>
+    <w:basedOn w:val="1023"/>
     <w:uiPriority w:val="99"/>
     <w:pPr>
       <w:pBdr/>
@@ -30504,9 +30728,9 @@
       </w:tcPr>
     </w:tblStylePr>
   </w:style>
-  <w:style w:type="table" w:styleId="134">
+  <w:style w:type="table" w:styleId="961">
     <w:name w:val="Bordered - Accent 3"/>
-    <w:basedOn w:val="830"/>
+    <w:basedOn w:val="1023"/>
     <w:uiPriority w:val="99"/>
     <w:pPr>
       <w:pBdr/>
@@ -30735,9 +30959,9 @@
       </w:tcPr>
     </w:tblStylePr>
   </w:style>
-  <w:style w:type="table" w:styleId="135">
+  <w:style w:type="table" w:styleId="962">
     <w:name w:val="Bordered - Accent 4"/>
-    <w:basedOn w:val="830"/>
+    <w:basedOn w:val="1023"/>
     <w:uiPriority w:val="99"/>
     <w:pPr>
       <w:pBdr/>
@@ -30966,9 +31190,9 @@
       </w:tcPr>
     </w:tblStylePr>
   </w:style>
-  <w:style w:type="table" w:styleId="136">
+  <w:style w:type="table" w:styleId="963">
     <w:name w:val="Bordered - Accent 5"/>
-    <w:basedOn w:val="830"/>
+    <w:basedOn w:val="1023"/>
     <w:uiPriority w:val="99"/>
     <w:pPr>
       <w:pBdr/>
@@ -31197,9 +31421,9 @@
       </w:tcPr>
     </w:tblStylePr>
   </w:style>
-  <w:style w:type="table" w:styleId="137">
+  <w:style w:type="table" w:styleId="964">
     <w:name w:val="Bordered - Accent 6"/>
-    <w:basedOn w:val="830"/>
+    <w:basedOn w:val="1023"/>
     <w:uiPriority w:val="99"/>
     <w:pPr>
       <w:pBdr/>
@@ -31428,11 +31652,11 @@
       </w:tcPr>
     </w:tblStylePr>
   </w:style>
-  <w:style w:type="paragraph" w:styleId="139">
+  <w:style w:type="paragraph" w:styleId="965">
     <w:name w:val="Heading 1"/>
-    <w:basedOn w:val="828"/>
-    <w:next w:val="828"/>
-    <w:link w:val="150"/>
+    <w:basedOn w:val="1021"/>
+    <w:next w:val="1021"/>
+    <w:link w:val="974"/>
     <w:uiPriority w:val="9"/>
     <w:qFormat/>
     <w:pPr>
@@ -31450,11 +31674,11 @@
       <w:szCs w:val="40"/>
     </w:rPr>
   </w:style>
-  <w:style w:type="paragraph" w:styleId="140">
+  <w:style w:type="paragraph" w:styleId="966">
     <w:name w:val="Heading 2"/>
-    <w:basedOn w:val="828"/>
-    <w:next w:val="828"/>
-    <w:link w:val="151"/>
+    <w:basedOn w:val="1021"/>
+    <w:next w:val="1021"/>
+    <w:link w:val="975"/>
     <w:uiPriority w:val="9"/>
     <w:unhideWhenUsed/>
     <w:qFormat/>
@@ -31473,11 +31697,11 @@
       <w:szCs w:val="32"/>
     </w:rPr>
   </w:style>
-  <w:style w:type="paragraph" w:styleId="141">
+  <w:style w:type="paragraph" w:styleId="967">
     <w:name w:val="Heading 3"/>
-    <w:basedOn w:val="828"/>
-    <w:next w:val="828"/>
-    <w:link w:val="152"/>
+    <w:basedOn w:val="1021"/>
+    <w:next w:val="1021"/>
+    <w:link w:val="976"/>
     <w:uiPriority w:val="9"/>
     <w:unhideWhenUsed/>
     <w:qFormat/>
@@ -31496,11 +31720,11 @@
       <w:szCs w:val="28"/>
     </w:rPr>
   </w:style>
-  <w:style w:type="paragraph" w:styleId="142">
+  <w:style w:type="paragraph" w:styleId="968">
     <w:name w:val="Heading 4"/>
-    <w:basedOn w:val="828"/>
-    <w:next w:val="828"/>
-    <w:link w:val="153"/>
+    <w:basedOn w:val="1021"/>
+    <w:next w:val="1021"/>
+    <w:link w:val="977"/>
     <w:uiPriority w:val="9"/>
     <w:unhideWhenUsed/>
     <w:qFormat/>
@@ -31519,11 +31743,11 @@
       <w:color w:val="0f4761" w:themeColor="accent1" w:themeShade="BF"/>
     </w:rPr>
   </w:style>
-  <w:style w:type="paragraph" w:styleId="143">
+  <w:style w:type="paragraph" w:styleId="969">
     <w:name w:val="Heading 5"/>
-    <w:basedOn w:val="828"/>
-    <w:next w:val="828"/>
-    <w:link w:val="154"/>
+    <w:basedOn w:val="1021"/>
+    <w:next w:val="1021"/>
+    <w:link w:val="978"/>
     <w:uiPriority w:val="9"/>
     <w:unhideWhenUsed/>
     <w:qFormat/>
@@ -31540,11 +31764,11 @@
       <w:color w:val="0f4761" w:themeColor="accent1" w:themeShade="BF"/>
     </w:rPr>
   </w:style>
-  <w:style w:type="paragraph" w:styleId="144">
+  <w:style w:type="paragraph" w:styleId="970">
     <w:name w:val="Heading 6"/>
-    <w:basedOn w:val="828"/>
-    <w:next w:val="828"/>
-    <w:link w:val="155"/>
+    <w:basedOn w:val="1021"/>
+    <w:next w:val="1021"/>
+    <w:link w:val="979"/>
     <w:uiPriority w:val="9"/>
     <w:unhideWhenUsed/>
     <w:qFormat/>
@@ -31563,11 +31787,11 @@
       <w:color w:val="595959" w:themeColor="text1" w:themeTint="A6"/>
     </w:rPr>
   </w:style>
-  <w:style w:type="paragraph" w:styleId="145">
+  <w:style w:type="paragraph" w:styleId="971">
     <w:name w:val="Heading 7"/>
-    <w:basedOn w:val="828"/>
-    <w:next w:val="828"/>
-    <w:link w:val="156"/>
+    <w:basedOn w:val="1021"/>
+    <w:next w:val="1021"/>
+    <w:link w:val="980"/>
     <w:uiPriority w:val="9"/>
     <w:unhideWhenUsed/>
     <w:qFormat/>
@@ -31584,11 +31808,11 @@
       <w:color w:val="595959" w:themeColor="text1" w:themeTint="A6"/>
     </w:rPr>
   </w:style>
-  <w:style w:type="paragraph" w:styleId="146">
+  <w:style w:type="paragraph" w:styleId="972">
     <w:name w:val="Heading 8"/>
-    <w:basedOn w:val="828"/>
-    <w:next w:val="828"/>
-    <w:link w:val="157"/>
+    <w:basedOn w:val="1021"/>
+    <w:next w:val="1021"/>
+    <w:link w:val="981"/>
     <w:uiPriority w:val="9"/>
     <w:unhideWhenUsed/>
     <w:qFormat/>
@@ -31607,11 +31831,11 @@
       <w:color w:val="272727" w:themeColor="text1" w:themeTint="D8"/>
     </w:rPr>
   </w:style>
-  <w:style w:type="paragraph" w:styleId="147">
+  <w:style w:type="paragraph" w:styleId="973">
     <w:name w:val="Heading 9"/>
-    <w:basedOn w:val="828"/>
-    <w:next w:val="828"/>
-    <w:link w:val="158"/>
+    <w:basedOn w:val="1021"/>
+    <w:next w:val="1021"/>
+    <w:link w:val="982"/>
     <w:uiPriority w:val="9"/>
     <w:unhideWhenUsed/>
     <w:qFormat/>
@@ -31630,10 +31854,10 @@
       <w:color w:val="272727" w:themeColor="text1" w:themeTint="D8"/>
     </w:rPr>
   </w:style>
-  <w:style w:type="character" w:styleId="150">
+  <w:style w:type="character" w:styleId="974">
     <w:name w:val="Heading 1 Char"/>
-    <w:basedOn w:val="829"/>
-    <w:link w:val="139"/>
+    <w:basedOn w:val="1022"/>
+    <w:link w:val="965"/>
     <w:uiPriority w:val="9"/>
     <w:pPr>
       <w:pBdr/>
@@ -31647,10 +31871,10 @@
       <w:szCs w:val="40"/>
     </w:rPr>
   </w:style>
-  <w:style w:type="character" w:styleId="151">
+  <w:style w:type="character" w:styleId="975">
     <w:name w:val="Heading 2 Char"/>
-    <w:basedOn w:val="829"/>
-    <w:link w:val="140"/>
+    <w:basedOn w:val="1022"/>
+    <w:link w:val="966"/>
     <w:uiPriority w:val="9"/>
     <w:pPr>
       <w:pBdr/>
@@ -31664,10 +31888,10 @@
       <w:szCs w:val="32"/>
     </w:rPr>
   </w:style>
-  <w:style w:type="character" w:styleId="152">
+  <w:style w:type="character" w:styleId="976">
     <w:name w:val="Heading 3 Char"/>
-    <w:basedOn w:val="829"/>
-    <w:link w:val="141"/>
+    <w:basedOn w:val="1022"/>
+    <w:link w:val="967"/>
     <w:uiPriority w:val="9"/>
     <w:pPr>
       <w:pBdr/>
@@ -31681,10 +31905,10 @@
       <w:szCs w:val="28"/>
     </w:rPr>
   </w:style>
-  <w:style w:type="character" w:styleId="153">
+  <w:style w:type="character" w:styleId="977">
     <w:name w:val="Heading 4 Char"/>
-    <w:basedOn w:val="829"/>
-    <w:link w:val="142"/>
+    <w:basedOn w:val="1022"/>
+    <w:link w:val="968"/>
     <w:uiPriority w:val="9"/>
     <w:pPr>
       <w:pBdr/>
@@ -31698,10 +31922,10 @@
       <w:color w:val="0f4761" w:themeColor="accent1" w:themeShade="BF"/>
     </w:rPr>
   </w:style>
-  <w:style w:type="character" w:styleId="154">
+  <w:style w:type="character" w:styleId="978">
     <w:name w:val="Heading 5 Char"/>
-    <w:basedOn w:val="829"/>
-    <w:link w:val="143"/>
+    <w:basedOn w:val="1022"/>
+    <w:link w:val="969"/>
     <w:uiPriority w:val="9"/>
     <w:pPr>
       <w:pBdr/>
@@ -31713,10 +31937,10 @@
       <w:color w:val="0f4761" w:themeColor="accent1" w:themeShade="BF"/>
     </w:rPr>
   </w:style>
-  <w:style w:type="character" w:styleId="155">
+  <w:style w:type="character" w:styleId="979">
     <w:name w:val="Heading 6 Char"/>
-    <w:basedOn w:val="829"/>
-    <w:link w:val="144"/>
+    <w:basedOn w:val="1022"/>
+    <w:link w:val="970"/>
     <w:uiPriority w:val="9"/>
     <w:pPr>
       <w:pBdr/>
@@ -31730,10 +31954,10 @@
       <w:color w:val="595959" w:themeColor="text1" w:themeTint="A6"/>
     </w:rPr>
   </w:style>
-  <w:style w:type="character" w:styleId="156">
+  <w:style w:type="character" w:styleId="980">
     <w:name w:val="Heading 7 Char"/>
-    <w:basedOn w:val="829"/>
-    <w:link w:val="145"/>
+    <w:basedOn w:val="1022"/>
+    <w:link w:val="971"/>
     <w:uiPriority w:val="9"/>
     <w:pPr>
       <w:pBdr/>
@@ -31745,10 +31969,10 @@
       <w:color w:val="595959" w:themeColor="text1" w:themeTint="A6"/>
     </w:rPr>
   </w:style>
-  <w:style w:type="character" w:styleId="157">
+  <w:style w:type="character" w:styleId="981">
     <w:name w:val="Heading 8 Char"/>
-    <w:basedOn w:val="829"/>
-    <w:link w:val="146"/>
+    <w:basedOn w:val="1022"/>
+    <w:link w:val="972"/>
     <w:uiPriority w:val="9"/>
     <w:pPr>
       <w:pBdr/>
@@ -31762,10 +31986,10 @@
       <w:color w:val="272727" w:themeColor="text1" w:themeTint="D8"/>
     </w:rPr>
   </w:style>
-  <w:style w:type="character" w:styleId="158">
+  <w:style w:type="character" w:styleId="982">
     <w:name w:val="Heading 9 Char"/>
-    <w:basedOn w:val="829"/>
-    <w:link w:val="147"/>
+    <w:basedOn w:val="1022"/>
+    <w:link w:val="973"/>
     <w:uiPriority w:val="9"/>
     <w:pPr>
       <w:pBdr/>
@@ -31779,11 +32003,11 @@
       <w:color w:val="272727" w:themeColor="text1" w:themeTint="D8"/>
     </w:rPr>
   </w:style>
-  <w:style w:type="paragraph" w:styleId="159">
+  <w:style w:type="paragraph" w:styleId="983">
     <w:name w:val="Title"/>
-    <w:basedOn w:val="828"/>
-    <w:next w:val="828"/>
-    <w:link w:val="160"/>
+    <w:basedOn w:val="1021"/>
+    <w:next w:val="1021"/>
+    <w:link w:val="984"/>
     <w:uiPriority w:val="10"/>
     <w:qFormat/>
     <w:pPr>
@@ -31799,10 +32023,10 @@
       <w:szCs w:val="56"/>
     </w:rPr>
   </w:style>
-  <w:style w:type="character" w:styleId="160">
+  <w:style w:type="character" w:styleId="984">
     <w:name w:val="Title Char"/>
-    <w:basedOn w:val="829"/>
-    <w:link w:val="159"/>
+    <w:basedOn w:val="1022"/>
+    <w:link w:val="983"/>
     <w:uiPriority w:val="10"/>
     <w:pPr>
       <w:pBdr/>
@@ -31816,11 +32040,11 @@
       <w:szCs w:val="56"/>
     </w:rPr>
   </w:style>
-  <w:style w:type="paragraph" w:styleId="161">
+  <w:style w:type="paragraph" w:styleId="985">
     <w:name w:val="Subtitle"/>
-    <w:basedOn w:val="828"/>
-    <w:next w:val="828"/>
-    <w:link w:val="162"/>
+    <w:basedOn w:val="1021"/>
+    <w:next w:val="1021"/>
+    <w:link w:val="986"/>
     <w:uiPriority w:val="11"/>
     <w:qFormat/>
     <w:pPr>
@@ -31838,10 +32062,10 @@
       <w:szCs w:val="28"/>
     </w:rPr>
   </w:style>
-  <w:style w:type="character" w:styleId="162">
+  <w:style w:type="character" w:styleId="986">
     <w:name w:val="Subtitle Char"/>
-    <w:basedOn w:val="829"/>
-    <w:link w:val="161"/>
+    <w:basedOn w:val="1022"/>
+    <w:link w:val="985"/>
     <w:uiPriority w:val="11"/>
     <w:pPr>
       <w:pBdr/>
@@ -31855,11 +32079,11 @@
       <w:szCs w:val="28"/>
     </w:rPr>
   </w:style>
-  <w:style w:type="paragraph" w:styleId="163">
+  <w:style w:type="paragraph" w:styleId="987">
     <w:name w:val="Quote"/>
-    <w:basedOn w:val="828"/>
-    <w:next w:val="828"/>
-    <w:link w:val="164"/>
+    <w:basedOn w:val="1021"/>
+    <w:next w:val="1021"/>
+    <w:link w:val="988"/>
     <w:uiPriority w:val="29"/>
     <w:qFormat/>
     <w:pPr>
@@ -31874,10 +32098,10 @@
       <w:color w:val="404040" w:themeColor="text1" w:themeTint="BF"/>
     </w:rPr>
   </w:style>
-  <w:style w:type="character" w:styleId="164">
+  <w:style w:type="character" w:styleId="988">
     <w:name w:val="Quote Char"/>
-    <w:basedOn w:val="829"/>
-    <w:link w:val="163"/>
+    <w:basedOn w:val="1022"/>
+    <w:link w:val="987"/>
     <w:uiPriority w:val="29"/>
     <w:pPr>
       <w:pBdr/>
@@ -31890,9 +32114,9 @@
       <w:color w:val="404040" w:themeColor="text1" w:themeTint="BF"/>
     </w:rPr>
   </w:style>
-  <w:style w:type="character" w:styleId="166">
+  <w:style w:type="character" w:styleId="989">
     <w:name w:val="Intense Emphasis"/>
-    <w:basedOn w:val="829"/>
+    <w:basedOn w:val="1022"/>
     <w:uiPriority w:val="21"/>
     <w:qFormat/>
     <w:pPr>
@@ -31906,11 +32130,11 @@
       <w:color w:val="0f4761" w:themeColor="accent1" w:themeShade="BF"/>
     </w:rPr>
   </w:style>
-  <w:style w:type="paragraph" w:styleId="167">
+  <w:style w:type="paragraph" w:styleId="990">
     <w:name w:val="Intense Quote"/>
-    <w:basedOn w:val="828"/>
-    <w:next w:val="828"/>
-    <w:link w:val="168"/>
+    <w:basedOn w:val="1021"/>
+    <w:next w:val="1021"/>
+    <w:link w:val="991"/>
     <w:uiPriority w:val="30"/>
     <w:qFormat/>
     <w:pPr>
@@ -31928,10 +32152,10 @@
       <w:color w:val="0f4761" w:themeColor="accent1" w:themeShade="BF"/>
     </w:rPr>
   </w:style>
-  <w:style w:type="character" w:styleId="168">
+  <w:style w:type="character" w:styleId="991">
     <w:name w:val="Intense Quote Char"/>
-    <w:basedOn w:val="829"/>
-    <w:link w:val="167"/>
+    <w:basedOn w:val="1022"/>
+    <w:link w:val="990"/>
     <w:uiPriority w:val="30"/>
     <w:pPr>
       <w:pBdr/>
@@ -31944,9 +32168,9 @@
       <w:color w:val="0f4761" w:themeColor="accent1" w:themeShade="BF"/>
     </w:rPr>
   </w:style>
-  <w:style w:type="character" w:styleId="169">
+  <w:style w:type="character" w:styleId="992">
     <w:name w:val="Intense Reference"/>
-    <w:basedOn w:val="829"/>
+    <w:basedOn w:val="1022"/>
     <w:uiPriority w:val="32"/>
     <w:qFormat/>
     <w:pPr>
@@ -31962,9 +32186,9 @@
       <w:spacing w:val="5"/>
     </w:rPr>
   </w:style>
-  <w:style w:type="paragraph" w:styleId="170">
+  <w:style w:type="paragraph" w:styleId="993">
     <w:name w:val="No Spacing"/>
-    <w:basedOn w:val="828"/>
+    <w:basedOn w:val="1021"/>
     <w:uiPriority w:val="1"/>
     <w:qFormat/>
     <w:pPr>
@@ -31973,9 +32197,9 @@
       <w:ind/>
     </w:pPr>
   </w:style>
-  <w:style w:type="character" w:styleId="171">
+  <w:style w:type="character" w:styleId="994">
     <w:name w:val="Subtle Emphasis"/>
-    <w:basedOn w:val="829"/>
+    <w:basedOn w:val="1022"/>
     <w:uiPriority w:val="19"/>
     <w:qFormat/>
     <w:pPr>
@@ -31989,9 +32213,9 @@
       <w:color w:val="404040" w:themeColor="text1" w:themeTint="BF"/>
     </w:rPr>
   </w:style>
-  <w:style w:type="character" w:styleId="172">
+  <w:style w:type="character" w:styleId="995">
     <w:name w:val="Emphasis"/>
-    <w:basedOn w:val="829"/>
+    <w:basedOn w:val="1022"/>
     <w:uiPriority w:val="20"/>
     <w:qFormat/>
     <w:pPr>
@@ -32004,9 +32228,9 @@
       <w:iCs/>
     </w:rPr>
   </w:style>
-  <w:style w:type="character" w:styleId="173">
+  <w:style w:type="character" w:styleId="996">
     <w:name w:val="Strong"/>
-    <w:basedOn w:val="829"/>
+    <w:basedOn w:val="1022"/>
     <w:uiPriority w:val="22"/>
     <w:qFormat/>
     <w:pPr>
@@ -32019,9 +32243,9 @@
       <w:bCs/>
     </w:rPr>
   </w:style>
-  <w:style w:type="character" w:styleId="174">
+  <w:style w:type="character" w:styleId="997">
     <w:name w:val="Subtle Reference"/>
-    <w:basedOn w:val="829"/>
+    <w:basedOn w:val="1022"/>
     <w:uiPriority w:val="31"/>
     <w:qFormat/>
     <w:pPr>
@@ -32034,9 +32258,9 @@
       <w:color w:val="5a5a5a" w:themeColor="text1" w:themeTint="A5"/>
     </w:rPr>
   </w:style>
-  <w:style w:type="character" w:styleId="175">
+  <w:style w:type="character" w:styleId="998">
     <w:name w:val="Book Title"/>
-    <w:basedOn w:val="829"/>
+    <w:basedOn w:val="1022"/>
     <w:uiPriority w:val="33"/>
     <w:qFormat/>
     <w:pPr>
@@ -32052,10 +32276,10 @@
       <w:spacing w:val="5"/>
     </w:rPr>
   </w:style>
-  <w:style w:type="character" w:styleId="177">
+  <w:style w:type="character" w:styleId="999">
     <w:name w:val="Header Char"/>
-    <w:basedOn w:val="829"/>
-    <w:link w:val="834"/>
+    <w:basedOn w:val="1022"/>
+    <w:link w:val="1027"/>
     <w:uiPriority w:val="99"/>
     <w:pPr>
       <w:pBdr/>
@@ -32063,10 +32287,10 @@
       <w:ind/>
     </w:pPr>
   </w:style>
-  <w:style w:type="character" w:styleId="179">
+  <w:style w:type="character" w:styleId="1000">
     <w:name w:val="Footer Char"/>
-    <w:basedOn w:val="829"/>
-    <w:link w:val="833"/>
+    <w:basedOn w:val="1022"/>
+    <w:link w:val="1026"/>
     <w:uiPriority w:val="99"/>
     <w:pPr>
       <w:pBdr/>
@@ -32074,10 +32298,10 @@
       <w:ind/>
     </w:pPr>
   </w:style>
-  <w:style w:type="paragraph" w:styleId="180">
+  <w:style w:type="paragraph" w:styleId="1001">
     <w:name w:val="Caption"/>
-    <w:basedOn w:val="828"/>
-    <w:next w:val="828"/>
+    <w:basedOn w:val="1021"/>
+    <w:next w:val="1021"/>
     <w:uiPriority w:val="35"/>
     <w:unhideWhenUsed/>
     <w:qFormat/>
@@ -32094,10 +32318,10 @@
       <w:szCs w:val="18"/>
     </w:rPr>
   </w:style>
-  <w:style w:type="paragraph" w:styleId="181">
+  <w:style w:type="paragraph" w:styleId="1002">
     <w:name w:val="footnote text"/>
-    <w:basedOn w:val="828"/>
-    <w:link w:val="182"/>
+    <w:basedOn w:val="1021"/>
+    <w:link w:val="1003"/>
     <w:uiPriority w:val="99"/>
     <w:semiHidden/>
     <w:unhideWhenUsed/>
@@ -32111,10 +32335,10 @@
       <w:szCs w:val="20"/>
     </w:rPr>
   </w:style>
-  <w:style w:type="character" w:styleId="182">
+  <w:style w:type="character" w:styleId="1003">
     <w:name w:val="Footnote Text Char"/>
-    <w:basedOn w:val="829"/>
-    <w:link w:val="181"/>
+    <w:basedOn w:val="1022"/>
+    <w:link w:val="1002"/>
     <w:uiPriority w:val="99"/>
     <w:semiHidden/>
     <w:pPr>
@@ -32127,9 +32351,9 @@
       <w:szCs w:val="20"/>
     </w:rPr>
   </w:style>
-  <w:style w:type="character" w:styleId="183">
+  <w:style w:type="character" w:styleId="1004">
     <w:name w:val="footnote reference"/>
-    <w:basedOn w:val="829"/>
+    <w:basedOn w:val="1022"/>
     <w:uiPriority w:val="99"/>
     <w:semiHidden/>
     <w:unhideWhenUsed/>
@@ -32142,10 +32366,10 @@
       <w:vertAlign w:val="superscript"/>
     </w:rPr>
   </w:style>
-  <w:style w:type="paragraph" w:styleId="184">
+  <w:style w:type="paragraph" w:styleId="1005">
     <w:name w:val="endnote text"/>
-    <w:basedOn w:val="828"/>
-    <w:link w:val="185"/>
+    <w:basedOn w:val="1021"/>
+    <w:link w:val="1006"/>
     <w:uiPriority w:val="99"/>
     <w:semiHidden/>
     <w:unhideWhenUsed/>
@@ -32159,10 +32383,10 @@
       <w:szCs w:val="20"/>
     </w:rPr>
   </w:style>
-  <w:style w:type="character" w:styleId="185">
+  <w:style w:type="character" w:styleId="1006">
     <w:name w:val="Endnote Text Char"/>
-    <w:basedOn w:val="829"/>
-    <w:link w:val="184"/>
+    <w:basedOn w:val="1022"/>
+    <w:link w:val="1005"/>
     <w:uiPriority w:val="99"/>
     <w:semiHidden/>
     <w:pPr>
@@ -32175,9 +32399,9 @@
       <w:szCs w:val="20"/>
     </w:rPr>
   </w:style>
-  <w:style w:type="character" w:styleId="186">
+  <w:style w:type="character" w:styleId="1007">
     <w:name w:val="endnote reference"/>
-    <w:basedOn w:val="829"/>
+    <w:basedOn w:val="1022"/>
     <w:uiPriority w:val="99"/>
     <w:semiHidden/>
     <w:unhideWhenUsed/>
@@ -32190,9 +32414,9 @@
       <w:vertAlign w:val="superscript"/>
     </w:rPr>
   </w:style>
-  <w:style w:type="character" w:styleId="188">
+  <w:style w:type="character" w:styleId="1008">
     <w:name w:val="FollowedHyperlink"/>
-    <w:basedOn w:val="829"/>
+    <w:basedOn w:val="1022"/>
     <w:uiPriority w:val="99"/>
     <w:semiHidden/>
     <w:unhideWhenUsed/>
@@ -32206,10 +32430,10 @@
       <w:u w:val="single"/>
     </w:rPr>
   </w:style>
-  <w:style w:type="paragraph" w:styleId="189">
+  <w:style w:type="paragraph" w:styleId="1009">
     <w:name w:val="toc 1"/>
-    <w:basedOn w:val="828"/>
-    <w:next w:val="828"/>
+    <w:basedOn w:val="1021"/>
+    <w:next w:val="1021"/>
     <w:uiPriority w:val="39"/>
     <w:unhideWhenUsed/>
     <w:pPr>
@@ -32218,10 +32442,10 @@
       <w:ind/>
     </w:pPr>
   </w:style>
-  <w:style w:type="paragraph" w:styleId="190">
+  <w:style w:type="paragraph" w:styleId="1010">
     <w:name w:val="toc 2"/>
-    <w:basedOn w:val="828"/>
-    <w:next w:val="828"/>
+    <w:basedOn w:val="1021"/>
+    <w:next w:val="1021"/>
     <w:uiPriority w:val="39"/>
     <w:unhideWhenUsed/>
     <w:pPr>
@@ -32230,10 +32454,10 @@
       <w:ind w:left="220"/>
     </w:pPr>
   </w:style>
-  <w:style w:type="paragraph" w:styleId="191">
+  <w:style w:type="paragraph" w:styleId="1011">
     <w:name w:val="toc 3"/>
-    <w:basedOn w:val="828"/>
-    <w:next w:val="828"/>
+    <w:basedOn w:val="1021"/>
+    <w:next w:val="1021"/>
     <w:uiPriority w:val="39"/>
     <w:unhideWhenUsed/>
     <w:pPr>
@@ -32242,10 +32466,10 @@
       <w:ind w:left="440"/>
     </w:pPr>
   </w:style>
-  <w:style w:type="paragraph" w:styleId="192">
+  <w:style w:type="paragraph" w:styleId="1012">
     <w:name w:val="toc 4"/>
-    <w:basedOn w:val="828"/>
-    <w:next w:val="828"/>
+    <w:basedOn w:val="1021"/>
+    <w:next w:val="1021"/>
     <w:uiPriority w:val="39"/>
     <w:unhideWhenUsed/>
     <w:pPr>
@@ -32254,10 +32478,10 @@
       <w:ind w:left="660"/>
     </w:pPr>
   </w:style>
-  <w:style w:type="paragraph" w:styleId="193">
+  <w:style w:type="paragraph" w:styleId="1013">
     <w:name w:val="toc 5"/>
-    <w:basedOn w:val="828"/>
-    <w:next w:val="828"/>
+    <w:basedOn w:val="1021"/>
+    <w:next w:val="1021"/>
     <w:uiPriority w:val="39"/>
     <w:unhideWhenUsed/>
     <w:pPr>
@@ -32266,10 +32490,10 @@
       <w:ind w:left="880"/>
     </w:pPr>
   </w:style>
-  <w:style w:type="paragraph" w:styleId="194">
+  <w:style w:type="paragraph" w:styleId="1014">
     <w:name w:val="toc 6"/>
-    <w:basedOn w:val="828"/>
-    <w:next w:val="828"/>
+    <w:basedOn w:val="1021"/>
+    <w:next w:val="1021"/>
     <w:uiPriority w:val="39"/>
     <w:unhideWhenUsed/>
     <w:pPr>
@@ -32278,10 +32502,10 @@
       <w:ind w:left="1100"/>
     </w:pPr>
   </w:style>
-  <w:style w:type="paragraph" w:styleId="195">
+  <w:style w:type="paragraph" w:styleId="1015">
     <w:name w:val="toc 7"/>
-    <w:basedOn w:val="828"/>
-    <w:next w:val="828"/>
+    <w:basedOn w:val="1021"/>
+    <w:next w:val="1021"/>
     <w:uiPriority w:val="39"/>
     <w:unhideWhenUsed/>
     <w:pPr>
@@ -32290,10 +32514,10 @@
       <w:ind w:left="1320"/>
     </w:pPr>
   </w:style>
-  <w:style w:type="paragraph" w:styleId="196">
+  <w:style w:type="paragraph" w:styleId="1016">
     <w:name w:val="toc 8"/>
-    <w:basedOn w:val="828"/>
-    <w:next w:val="828"/>
+    <w:basedOn w:val="1021"/>
+    <w:next w:val="1021"/>
     <w:uiPriority w:val="39"/>
     <w:unhideWhenUsed/>
     <w:pPr>
@@ -32302,10 +32526,10 @@
       <w:ind w:left="1540"/>
     </w:pPr>
   </w:style>
-  <w:style w:type="paragraph" w:styleId="197">
+  <w:style w:type="paragraph" w:styleId="1017">
     <w:name w:val="toc 9"/>
-    <w:basedOn w:val="828"/>
-    <w:next w:val="828"/>
+    <w:basedOn w:val="1021"/>
+    <w:next w:val="1021"/>
     <w:uiPriority w:val="39"/>
     <w:unhideWhenUsed/>
     <w:pPr>
@@ -32314,9 +32538,9 @@
       <w:ind w:left="1760"/>
     </w:pPr>
   </w:style>
-  <w:style w:type="character" w:styleId="198">
+  <w:style w:type="character" w:styleId="1018">
     <w:name w:val="Placeholder Text"/>
-    <w:basedOn w:val="829"/>
+    <w:basedOn w:val="1022"/>
     <w:uiPriority w:val="99"/>
     <w:semiHidden/>
     <w:pPr>
@@ -32328,7 +32552,7 @@
       <w:color w:val="666666"/>
     </w:rPr>
   </w:style>
-  <w:style w:type="paragraph" w:styleId="208">
+  <w:style w:type="paragraph" w:styleId="1019">
     <w:name w:val="TOC Heading"/>
     <w:uiPriority w:val="39"/>
     <w:unhideWhenUsed/>
@@ -32338,10 +32562,10 @@
       <w:ind/>
     </w:pPr>
   </w:style>
-  <w:style w:type="paragraph" w:styleId="209">
+  <w:style w:type="paragraph" w:styleId="1020">
     <w:name w:val="table of figures"/>
-    <w:basedOn w:val="828"/>
-    <w:next w:val="828"/>
+    <w:basedOn w:val="1021"/>
+    <w:next w:val="1021"/>
     <w:uiPriority w:val="99"/>
     <w:unhideWhenUsed/>
     <w:pPr>
@@ -32350,7 +32574,7 @@
       <w:ind/>
     </w:pPr>
   </w:style>
-  <w:style w:type="paragraph" w:styleId="828" w:default="1">
+  <w:style w:type="paragraph" w:styleId="1021" w:default="1">
     <w:name w:val="Normal"/>
     <w:qFormat/>
     <w:pPr>
@@ -32365,7 +32589,7 @@
       <w:lang w:eastAsia="en-US"/>
     </w:rPr>
   </w:style>
-  <w:style w:type="character" w:styleId="829" w:default="1">
+  <w:style w:type="character" w:styleId="1022" w:default="1">
     <w:name w:val="Default Paragraph Font"/>
     <w:uiPriority w:val="1"/>
     <w:semiHidden/>
@@ -32376,7 +32600,7 @@
       <w:ind/>
     </w:pPr>
   </w:style>
-  <w:style w:type="table" w:styleId="830" w:default="1">
+  <w:style w:type="table" w:styleId="1023" w:default="1">
     <w:name w:val="Normal Table"/>
     <w:uiPriority w:val="99"/>
     <w:semiHidden/>
@@ -32569,7 +32793,7 @@
       </w:tcPr>
     </w:tblStylePr>
   </w:style>
-  <w:style w:type="numbering" w:styleId="831" w:default="1">
+  <w:style w:type="numbering" w:styleId="1024" w:default="1">
     <w:name w:val="No List"/>
     <w:uiPriority w:val="99"/>
     <w:semiHidden/>
@@ -32580,7 +32804,7 @@
       <w:ind/>
     </w:pPr>
   </w:style>
-  <w:style w:type="character" w:styleId="832">
+  <w:style w:type="character" w:styleId="1025">
     <w:name w:val="Hyperlink"/>
     <w:uiPriority w:val="99"/>
     <w:unhideWhenUsed/>
@@ -32594,10 +32818,10 @@
       <w:u w:val="single"/>
     </w:rPr>
   </w:style>
-  <w:style w:type="paragraph" w:styleId="833">
+  <w:style w:type="paragraph" w:styleId="1026">
     <w:name w:val="Footer"/>
-    <w:basedOn w:val="828"/>
-    <w:link w:val="836"/>
+    <w:basedOn w:val="1021"/>
+    <w:link w:val="1029"/>
     <w:uiPriority w:val="99"/>
     <w:unhideWhenUsed/>
     <w:pPr>
@@ -32610,10 +32834,10 @@
       <w:ind/>
     </w:pPr>
   </w:style>
-  <w:style w:type="paragraph" w:styleId="834">
+  <w:style w:type="paragraph" w:styleId="1027">
     <w:name w:val="Header"/>
-    <w:basedOn w:val="828"/>
-    <w:link w:val="835"/>
+    <w:basedOn w:val="1021"/>
+    <w:link w:val="1028"/>
     <w:uiPriority w:val="99"/>
     <w:unhideWhenUsed/>
     <w:pPr>
@@ -32626,10 +32850,10 @@
       <w:ind/>
     </w:pPr>
   </w:style>
-  <w:style w:type="character" w:styleId="835" w:customStyle="1">
+  <w:style w:type="character" w:styleId="1028" w:customStyle="1">
     <w:name w:val="En-tête Car"/>
-    <w:basedOn w:val="829"/>
-    <w:link w:val="834"/>
+    <w:basedOn w:val="1022"/>
+    <w:link w:val="1027"/>
     <w:uiPriority w:val="99"/>
     <w:pPr>
       <w:pBdr/>
@@ -32637,10 +32861,10 @@
       <w:ind/>
     </w:pPr>
   </w:style>
-  <w:style w:type="character" w:styleId="836" w:customStyle="1">
+  <w:style w:type="character" w:styleId="1029" w:customStyle="1">
     <w:name w:val="Pied de page Car"/>
-    <w:basedOn w:val="829"/>
-    <w:link w:val="833"/>
+    <w:basedOn w:val="1022"/>
+    <w:link w:val="1026"/>
     <w:uiPriority w:val="99"/>
     <w:pPr>
       <w:pBdr/>
@@ -32648,9 +32872,9 @@
       <w:ind/>
     </w:pPr>
   </w:style>
-  <w:style w:type="paragraph" w:styleId="837">
+  <w:style w:type="paragraph" w:styleId="1030">
     <w:name w:val="List Paragraph"/>
-    <w:basedOn w:val="828"/>
+    <w:basedOn w:val="1021"/>
     <w:uiPriority w:val="34"/>
     <w:qFormat/>
     <w:pPr>

</xml_diff>